<commit_message>
removing test subject csv
</commit_message>
<xml_diff>
--- a/report/final_report.docx
+++ b/report/final_report.docx
@@ -227,19 +227,11 @@
           <w:lang w:val="en-GB"/>
         </w:rPr>
       </w:pPr>
-      <w:proofErr w:type="spellStart"/>
-      <w:r>
-        <w:rPr>
-          <w:lang w:val="en-GB"/>
-        </w:rPr>
-        <w:t>Qianyue</w:t>
-      </w:r>
-      <w:proofErr w:type="spellEnd"/>
-      <w:r>
-        <w:rPr>
-          <w:lang w:val="en-GB"/>
-        </w:rPr>
-        <w:t xml:space="preserve"> Li </w:t>
+      <w:r>
+        <w:rPr>
+          <w:lang w:val="en-GB"/>
+        </w:rPr>
+        <w:t xml:space="preserve">Qianyue Li </w:t>
       </w:r>
     </w:p>
     <w:p>
@@ -280,16 +272,8 @@
         <w:rPr>
           <w:lang w:val="en-GB"/>
         </w:rPr>
-        <w:t xml:space="preserve">Sakshi </w:t>
-      </w:r>
-      <w:proofErr w:type="spellStart"/>
-      <w:r>
-        <w:rPr>
-          <w:lang w:val="en-GB"/>
-        </w:rPr>
-        <w:t>Takawale</w:t>
-      </w:r>
-      <w:proofErr w:type="spellEnd"/>
+        <w:t>Sakshi Takawale</w:t>
+      </w:r>
       <w:r>
         <w:rPr>
           <w:lang w:val="en-GB"/>
@@ -2812,23 +2796,7 @@
           <w:sz w:val="36"/>
         </w:rPr>
         <w:lastRenderedPageBreak/>
-        <w:t xml:space="preserve">List </w:t>
-      </w:r>
-      <w:proofErr w:type="spellStart"/>
-      <w:r>
-        <w:rPr>
-          <w:b/>
-          <w:sz w:val="36"/>
-        </w:rPr>
-        <w:t>of</w:t>
-      </w:r>
-      <w:proofErr w:type="spellEnd"/>
-      <w:r>
-        <w:rPr>
-          <w:b/>
-          <w:sz w:val="36"/>
-        </w:rPr>
-        <w:t xml:space="preserve"> Tables</w:t>
+        <w:t>List of Tables</w:t>
       </w:r>
       <w:bookmarkEnd w:id="2"/>
     </w:p>
@@ -2990,6 +2958,15 @@
         <w:t>1.1 Background</w:t>
       </w:r>
       <w:bookmarkEnd w:id="4"/>
+      <w:r>
+        <w:rPr>
+          <w:b/>
+          <w:sz w:val="32"/>
+          <w:szCs w:val="32"/>
+          <w:lang w:val="en-GB"/>
+        </w:rPr>
+        <w:t xml:space="preserve"> (Aylina)</w:t>
+      </w:r>
     </w:p>
     <w:p>
       <w:pPr>
@@ -3033,16 +3010,8 @@
         <w:rPr>
           <w:lang w:val="en-GB"/>
         </w:rPr>
-        <w:t xml:space="preserve">Masculine: </w:t>
-      </w:r>
-      <w:proofErr w:type="spellStart"/>
-      <w:r>
-        <w:rPr>
-          <w:lang w:val="en-GB"/>
-        </w:rPr>
-        <w:t>Studenten</w:t>
-      </w:r>
-      <w:proofErr w:type="spellEnd"/>
+        <w:t>Masculine: Studenten</w:t>
+      </w:r>
     </w:p>
     <w:p>
       <w:pPr>
@@ -3056,16 +3025,8 @@
         <w:rPr>
           <w:lang w:val="en-GB"/>
         </w:rPr>
-        <w:t xml:space="preserve">Feminine: </w:t>
-      </w:r>
-      <w:proofErr w:type="spellStart"/>
-      <w:r>
-        <w:rPr>
-          <w:lang w:val="en-GB"/>
-        </w:rPr>
-        <w:t>Studentinnen</w:t>
-      </w:r>
-      <w:proofErr w:type="spellEnd"/>
+        <w:t>Feminine: Studentinnen</w:t>
+      </w:r>
     </w:p>
     <w:p>
       <w:pPr>
@@ -3079,16 +3040,8 @@
         <w:rPr>
           <w:lang w:val="en-GB"/>
         </w:rPr>
-        <w:t>Gender-inclusive: Student*</w:t>
-      </w:r>
-      <w:proofErr w:type="spellStart"/>
-      <w:r>
-        <w:rPr>
-          <w:lang w:val="en-GB"/>
-        </w:rPr>
-        <w:t>innen</w:t>
-      </w:r>
-      <w:proofErr w:type="spellEnd"/>
+        <w:t>Gender-inclusive: Student*innen</w:t>
+      </w:r>
     </w:p>
     <w:p>
       <w:pPr>
@@ -3105,6 +3058,19 @@
         <w:t>1.2 Motivation</w:t>
       </w:r>
       <w:bookmarkEnd w:id="5"/>
+      <w:r>
+        <w:rPr>
+          <w:lang w:val="en-GB"/>
+        </w:rPr>
+        <w:t xml:space="preserve"> </w:t>
+      </w:r>
+      <w:r>
+        <w:rPr>
+          <w:b w:val="0"/>
+          <w:lang w:val="en-GB"/>
+        </w:rPr>
+        <w:t>(Aylina)</w:t>
+      </w:r>
     </w:p>
     <w:p>
       <w:pPr>
@@ -3182,6 +3148,19 @@
         <w:t>1.3 Research Question</w:t>
       </w:r>
       <w:bookmarkEnd w:id="6"/>
+      <w:r>
+        <w:rPr>
+          <w:lang w:val="en-GB"/>
+        </w:rPr>
+        <w:t xml:space="preserve"> </w:t>
+      </w:r>
+      <w:r>
+        <w:rPr>
+          <w:b w:val="0"/>
+          <w:lang w:val="en-GB"/>
+        </w:rPr>
+        <w:t>(Aylina)</w:t>
+      </w:r>
     </w:p>
     <w:p>
       <w:pPr>
@@ -3214,6 +3193,21 @@
         <w:t>1.3.1 Hypotheses</w:t>
       </w:r>
       <w:bookmarkEnd w:id="7"/>
+      <w:r>
+        <w:rPr>
+          <w:lang w:val="en-GB"/>
+        </w:rPr>
+        <w:t xml:space="preserve"> </w:t>
+      </w:r>
+      <w:r>
+        <w:rPr>
+          <w:b w:val="0"/>
+          <w:sz w:val="32"/>
+          <w:szCs w:val="32"/>
+          <w:lang w:val="en-GB"/>
+        </w:rPr>
+        <w:t>(Aylina)</w:t>
+      </w:r>
     </w:p>
     <w:p>
       <w:pPr>
@@ -3294,6 +3288,18 @@
         <w:t>Independent Measures</w:t>
       </w:r>
       <w:bookmarkEnd w:id="8"/>
+      <w:r>
+        <w:t xml:space="preserve"> </w:t>
+      </w:r>
+      <w:r>
+        <w:rPr>
+          <w:b w:val="0"/>
+          <w:sz w:val="32"/>
+          <w:szCs w:val="32"/>
+          <w:lang w:val="en-GB"/>
+        </w:rPr>
+        <w:t>(Aylina)</w:t>
+      </w:r>
     </w:p>
     <w:p>
       <w:pPr>
@@ -3307,21 +3313,7 @@
         <w:rPr>
           <w:lang w:val="en-GB"/>
         </w:rPr>
-        <w:t xml:space="preserve">Neutral Language (e.g. </w:t>
-      </w:r>
-      <w:proofErr w:type="spellStart"/>
-      <w:r>
-        <w:rPr>
-          <w:lang w:val="en-GB"/>
-        </w:rPr>
-        <w:t>Studierende</w:t>
-      </w:r>
-      <w:proofErr w:type="spellEnd"/>
-      <w:r>
-        <w:rPr>
-          <w:lang w:val="en-GB"/>
-        </w:rPr>
-        <w:t>)</w:t>
+        <w:t>Neutral Language (e.g. Studierende)</w:t>
       </w:r>
     </w:p>
     <w:p>
@@ -3336,21 +3328,7 @@
         <w:rPr>
           <w:lang w:val="en-GB"/>
         </w:rPr>
-        <w:t>With Star (e.g. Student*</w:t>
-      </w:r>
-      <w:proofErr w:type="spellStart"/>
-      <w:r>
-        <w:rPr>
-          <w:lang w:val="en-GB"/>
-        </w:rPr>
-        <w:t>innen</w:t>
-      </w:r>
-      <w:proofErr w:type="spellEnd"/>
-      <w:r>
-        <w:rPr>
-          <w:lang w:val="en-GB"/>
-        </w:rPr>
-        <w:t>)</w:t>
+        <w:t>With Star (e.g. Student*innen)</w:t>
       </w:r>
     </w:p>
     <w:p>
@@ -3361,35 +3339,11 @@
           <w:lang w:val="en-GB"/>
         </w:rPr>
       </w:pPr>
-      <w:proofErr w:type="gramStart"/>
-      <w:r>
-        <w:rPr>
-          <w:lang w:val="en-GB"/>
-        </w:rPr>
-        <w:t>With :</w:t>
-      </w:r>
-      <w:proofErr w:type="gramEnd"/>
-      <w:r>
-        <w:rPr>
-          <w:lang w:val="en-GB"/>
-        </w:rPr>
-        <w:t xml:space="preserve"> (e.g. </w:t>
-      </w:r>
-      <w:proofErr w:type="spellStart"/>
-      <w:proofErr w:type="gramStart"/>
-      <w:r>
-        <w:rPr>
-          <w:lang w:val="en-GB"/>
-        </w:rPr>
-        <w:t>Student:innen</w:t>
-      </w:r>
-      <w:proofErr w:type="spellEnd"/>
-      <w:proofErr w:type="gramEnd"/>
-      <w:r>
-        <w:rPr>
-          <w:lang w:val="en-GB"/>
-        </w:rPr>
-        <w:t>)</w:t>
+      <w:r>
+        <w:rPr>
+          <w:lang w:val="en-GB"/>
+        </w:rPr>
+        <w:t>With : (e.g. Student:innen)</w:t>
       </w:r>
     </w:p>
     <w:p>
@@ -3404,49 +3358,7 @@
         <w:rPr>
           <w:lang w:val="en-GB"/>
         </w:rPr>
-        <w:t xml:space="preserve">Written with both </w:t>
-      </w:r>
-      <w:proofErr w:type="gramStart"/>
-      <w:r>
-        <w:rPr>
-          <w:lang w:val="en-GB"/>
-        </w:rPr>
-        <w:t>pairs</w:t>
-      </w:r>
-      <w:proofErr w:type="gramEnd"/>
-      <w:r>
-        <w:rPr>
-          <w:lang w:val="en-GB"/>
-        </w:rPr>
-        <w:t xml:space="preserve"> w/ f first; w/ m first (e.g. </w:t>
-      </w:r>
-      <w:proofErr w:type="spellStart"/>
-      <w:r>
-        <w:rPr>
-          <w:lang w:val="en-GB"/>
-        </w:rPr>
-        <w:t>Studenten</w:t>
-      </w:r>
-      <w:proofErr w:type="spellEnd"/>
-      <w:r>
-        <w:rPr>
-          <w:lang w:val="en-GB"/>
-        </w:rPr>
-        <w:t xml:space="preserve"> und </w:t>
-      </w:r>
-      <w:proofErr w:type="spellStart"/>
-      <w:r>
-        <w:rPr>
-          <w:lang w:val="en-GB"/>
-        </w:rPr>
-        <w:t>Studentinnen</w:t>
-      </w:r>
-      <w:proofErr w:type="spellEnd"/>
-      <w:r>
-        <w:rPr>
-          <w:lang w:val="en-GB"/>
-        </w:rPr>
-        <w:t>)</w:t>
+        <w:t>Written with both pairs w/ f first; w/ m first (e.g. Studenten und Studentinnen)</w:t>
       </w:r>
     </w:p>
     <w:p>
@@ -3513,6 +3425,21 @@
         <w:t>Dependent Measures</w:t>
       </w:r>
       <w:bookmarkEnd w:id="9"/>
+      <w:r>
+        <w:rPr>
+          <w:lang w:val="en-GB"/>
+        </w:rPr>
+        <w:t xml:space="preserve"> </w:t>
+      </w:r>
+      <w:r>
+        <w:rPr>
+          <w:b w:val="0"/>
+          <w:sz w:val="32"/>
+          <w:szCs w:val="32"/>
+          <w:lang w:val="en-GB"/>
+        </w:rPr>
+        <w:t>(Aylina)</w:t>
+      </w:r>
     </w:p>
     <w:p>
       <w:pPr>
@@ -3563,49 +3490,7 @@
         <w:rPr>
           <w:lang w:val="en-GB"/>
         </w:rPr>
-        <w:t xml:space="preserve">Early </w:t>
-      </w:r>
-      <w:proofErr w:type="gramStart"/>
-      <w:r>
-        <w:rPr>
-          <w:lang w:val="en-GB"/>
-        </w:rPr>
-        <w:t>Measure(</w:t>
-      </w:r>
-      <w:proofErr w:type="gramEnd"/>
-      <w:r>
-        <w:rPr>
-          <w:lang w:val="en-GB"/>
-        </w:rPr>
-        <w:t>start time</w:t>
-      </w:r>
-      <w:proofErr w:type="gramStart"/>
-      <w:r>
-        <w:rPr>
-          <w:lang w:val="en-GB"/>
-        </w:rPr>
-        <w:t>):fixation</w:t>
-      </w:r>
-      <w:proofErr w:type="gramEnd"/>
-      <w:r>
-        <w:rPr>
-          <w:lang w:val="en-GB"/>
-        </w:rPr>
-        <w:t xml:space="preserve"> duration on role </w:t>
-      </w:r>
-      <w:proofErr w:type="spellStart"/>
-      <w:r>
-        <w:rPr>
-          <w:lang w:val="en-GB"/>
-        </w:rPr>
-        <w:t>roun</w:t>
-      </w:r>
-      <w:proofErr w:type="spellEnd"/>
-      <w:r>
-        <w:rPr>
-          <w:lang w:val="en-GB"/>
-        </w:rPr>
-        <w:t xml:space="preserve"> / anaphor</w:t>
+        <w:t>Early Measure(start time):fixation duration on role roun / anaphor</w:t>
       </w:r>
     </w:p>
     <w:p>
@@ -3687,6 +3572,12 @@
         <w:t>2. Experimental methods</w:t>
       </w:r>
       <w:bookmarkEnd w:id="10"/>
+      <w:r>
+        <w:rPr>
+          <w:lang w:val="en-GB"/>
+        </w:rPr>
+        <w:t xml:space="preserve"> (Sophie)</w:t>
+      </w:r>
     </w:p>
     <w:p>
       <w:pPr>
@@ -3703,6 +3594,18 @@
         <w:t>2.1 Participants</w:t>
       </w:r>
       <w:bookmarkEnd w:id="11"/>
+      <w:r>
+        <w:rPr>
+          <w:lang w:val="en-GB"/>
+        </w:rPr>
+        <w:t xml:space="preserve"> </w:t>
+      </w:r>
+      <w:r>
+        <w:rPr>
+          <w:lang w:val="en-GB"/>
+        </w:rPr>
+        <w:t>(Sophie)</w:t>
+      </w:r>
     </w:p>
     <w:p>
       <w:pPr>
@@ -3716,21 +3619,7 @@
         <w:rPr>
           <w:lang w:val="en-GB"/>
         </w:rPr>
-        <w:t xml:space="preserve">For the Participants we decided to only involve native German speaker because the different role noun forms could be more difficult to process for non-native speakers. Then we thought about how many participants we need for our experiment. Because we are using six different conditions, we got six different lists from the </w:t>
-      </w:r>
-      <w:proofErr w:type="spellStart"/>
-      <w:r>
-        <w:rPr>
-          <w:lang w:val="en-GB"/>
-        </w:rPr>
-        <w:t>latin</w:t>
-      </w:r>
-      <w:proofErr w:type="spellEnd"/>
-      <w:r>
-        <w:rPr>
-          <w:lang w:val="en-GB"/>
-        </w:rPr>
-        <w:t xml:space="preserve"> square design. So, for that it would be optimal to get a participant number that is a multiple of six. To get every list covered the same for a better distribution.   </w:t>
+        <w:t xml:space="preserve">For the Participants we decided to only involve native German speaker because the different role noun forms could be more difficult to process for non-native speakers. Then we thought about how many participants we need for our experiment. Because we are using six different conditions, we got six different lists from the latin square design. So, for that it would be optimal to get a participant number that is a multiple of six. To get every list covered the same for a better distribution.   </w:t>
       </w:r>
     </w:p>
     <w:p>
@@ -3748,6 +3637,18 @@
         <w:t>2.2 Materials/Stimuli</w:t>
       </w:r>
       <w:bookmarkEnd w:id="12"/>
+      <w:r>
+        <w:rPr>
+          <w:lang w:val="en-GB"/>
+        </w:rPr>
+        <w:t xml:space="preserve"> </w:t>
+      </w:r>
+      <w:r>
+        <w:rPr>
+          <w:lang w:val="en-GB"/>
+        </w:rPr>
+        <w:t>(Sophie)</w:t>
+      </w:r>
     </w:p>
     <w:p>
       <w:pPr>
@@ -3851,55 +3752,13 @@
         <w:rPr>
           <w:lang w:val="en-GB"/>
         </w:rPr>
-        <w:t xml:space="preserve"> Because that were too </w:t>
-      </w:r>
-      <w:proofErr w:type="gramStart"/>
-      <w:r>
-        <w:rPr>
-          <w:lang w:val="en-GB"/>
-        </w:rPr>
-        <w:t>much</w:t>
-      </w:r>
-      <w:proofErr w:type="gramEnd"/>
-      <w:r>
-        <w:rPr>
-          <w:lang w:val="en-GB"/>
-        </w:rPr>
-        <w:t xml:space="preserve"> conditions </w:t>
-      </w:r>
-      <w:proofErr w:type="gramStart"/>
-      <w:r>
-        <w:rPr>
-          <w:lang w:val="en-GB"/>
-        </w:rPr>
-        <w:t>and also</w:t>
-      </w:r>
-      <w:proofErr w:type="gramEnd"/>
-      <w:r>
-        <w:rPr>
-          <w:lang w:val="en-GB"/>
-        </w:rPr>
-        <w:t xml:space="preserve"> the </w:t>
-      </w:r>
-      <w:proofErr w:type="gramStart"/>
-      <w:r>
-        <w:rPr>
-          <w:lang w:val="en-GB"/>
-        </w:rPr>
-        <w:t xml:space="preserve">gender </w:t>
-      </w:r>
-      <w:r>
-        <w:rPr>
-          <w:lang w:val="en-GB"/>
-        </w:rPr>
-        <w:t>neutral</w:t>
-      </w:r>
-      <w:proofErr w:type="gramEnd"/>
-      <w:r>
-        <w:rPr>
-          <w:lang w:val="en-GB"/>
-        </w:rPr>
-        <w:t xml:space="preserve"> form not really is gender neutral because it could be associated more with male than female. </w:t>
+        <w:t xml:space="preserve"> Because that were too much conditions and also the gender </w:t>
+      </w:r>
+      <w:r>
+        <w:rPr>
+          <w:lang w:val="en-GB"/>
+        </w:rPr>
+        <w:t xml:space="preserve">neutral form not really is gender neutral because it could be associated more with male than female. </w:t>
       </w:r>
     </w:p>
     <w:p>
@@ -4043,14 +3902,12 @@
                 <w:lang w:val="en-GB"/>
               </w:rPr>
             </w:pPr>
-            <w:proofErr w:type="spellStart"/>
             <w:r>
               <w:rPr>
                 <w:lang w:val="en-GB"/>
               </w:rPr>
               <w:t>Männer</w:t>
             </w:r>
-            <w:proofErr w:type="spellEnd"/>
           </w:p>
         </w:tc>
       </w:tr>
@@ -4169,14 +4026,12 @@
                 <w:lang w:val="en-GB"/>
               </w:rPr>
             </w:pPr>
-            <w:proofErr w:type="spellStart"/>
             <w:r>
               <w:rPr>
                 <w:lang w:val="en-GB"/>
               </w:rPr>
               <w:t>Männer</w:t>
             </w:r>
-            <w:proofErr w:type="spellEnd"/>
           </w:p>
         </w:tc>
       </w:tr>
@@ -4295,14 +4150,12 @@
                 <w:lang w:val="en-GB"/>
               </w:rPr>
             </w:pPr>
-            <w:proofErr w:type="spellStart"/>
             <w:r>
               <w:rPr>
                 <w:lang w:val="en-GB"/>
               </w:rPr>
               <w:t>Männer</w:t>
             </w:r>
-            <w:proofErr w:type="spellEnd"/>
           </w:p>
         </w:tc>
       </w:tr>
@@ -4396,13 +4249,8 @@
         <w:fldChar w:fldCharType="end"/>
       </w:r>
       <w:r>
-        <w:t xml:space="preserve">: </w:t>
-      </w:r>
-      <w:proofErr w:type="spellStart"/>
-      <w:r>
-        <w:t>Conditions</w:t>
-      </w:r>
-      <w:proofErr w:type="spellEnd"/>
+        <w:t>: Conditions</w:t>
+      </w:r>
     </w:p>
     <w:p>
       <w:pPr>
@@ -4761,21 +4609,7 @@
         <w:rPr>
           <w:lang w:val="en-GB"/>
         </w:rPr>
-        <w:t xml:space="preserve">After we used the </w:t>
-      </w:r>
-      <w:proofErr w:type="spellStart"/>
-      <w:r>
-        <w:rPr>
-          <w:lang w:val="en-GB"/>
-        </w:rPr>
-        <w:t>latin</w:t>
-      </w:r>
-      <w:proofErr w:type="spellEnd"/>
-      <w:r>
-        <w:rPr>
-          <w:lang w:val="en-GB"/>
-        </w:rPr>
-        <w:t xml:space="preserve"> square design on the 18 sentences with the 6 conditions we got 6 lists to cover every sentence with every condition.  </w:t>
+        <w:t xml:space="preserve">After we used the latin square design on the 18 sentences with the 6 conditions we got 6 lists to cover every sentence with every condition.  </w:t>
       </w:r>
     </w:p>
     <w:tbl>
@@ -7548,21 +7382,7 @@
         <w:rPr>
           <w:lang w:val="en-GB"/>
         </w:rPr>
-        <w:t xml:space="preserve">In Total we get 108 sentences after applying the </w:t>
-      </w:r>
-      <w:proofErr w:type="spellStart"/>
-      <w:r>
-        <w:rPr>
-          <w:lang w:val="en-GB"/>
-        </w:rPr>
-        <w:t>latin</w:t>
-      </w:r>
-      <w:proofErr w:type="spellEnd"/>
-      <w:r>
-        <w:rPr>
-          <w:lang w:val="en-GB"/>
-        </w:rPr>
-        <w:t xml:space="preserve"> square design to the 18 base sentences with the six conditions. </w:t>
+        <w:t xml:space="preserve">In Total we get 108 sentences after applying the latin square design to the 18 base sentences with the six conditions. </w:t>
       </w:r>
     </w:p>
     <w:p>
@@ -7608,6 +7428,18 @@
         <w:t xml:space="preserve"> Study Design</w:t>
       </w:r>
       <w:bookmarkEnd w:id="13"/>
+      <w:r>
+        <w:rPr>
+          <w:lang w:val="en-GB"/>
+        </w:rPr>
+        <w:t xml:space="preserve"> </w:t>
+      </w:r>
+      <w:r>
+        <w:rPr>
+          <w:lang w:val="en-GB"/>
+        </w:rPr>
+        <w:t>(Sophie)</w:t>
+      </w:r>
     </w:p>
     <w:p>
       <w:pPr>
@@ -7643,6 +7475,18 @@
         <w:t xml:space="preserve"> Experiment (implementation)</w:t>
       </w:r>
       <w:bookmarkEnd w:id="14"/>
+      <w:r>
+        <w:rPr>
+          <w:lang w:val="en-GB"/>
+        </w:rPr>
+        <w:t xml:space="preserve"> </w:t>
+      </w:r>
+      <w:r>
+        <w:rPr>
+          <w:lang w:val="en-GB"/>
+        </w:rPr>
+        <w:t>(Sophie)</w:t>
+      </w:r>
     </w:p>
     <w:p>
       <w:pPr>
@@ -7673,14 +7517,9 @@
       </w:pPr>
       <w:bookmarkStart w:id="16" w:name="_Toc235476219"/>
       <w:r>
-        <w:t xml:space="preserve">3.1 </w:t>
-      </w:r>
-      <w:proofErr w:type="spellStart"/>
-      <w:r>
-        <w:t>Preprocessing</w:t>
+        <w:t>3.1 Preprocessing</w:t>
       </w:r>
       <w:bookmarkEnd w:id="16"/>
-      <w:proofErr w:type="spellEnd"/>
     </w:p>
     <w:p>
       <w:pPr>
@@ -7696,35 +7535,7 @@
         <w:rPr>
           <w:lang w:val="de-DE"/>
         </w:rPr>
-        <w:t xml:space="preserve">Eye </w:t>
-      </w:r>
-      <w:proofErr w:type="spellStart"/>
-      <w:r>
-        <w:rPr>
-          <w:lang w:val="de-DE"/>
-        </w:rPr>
-        <w:t>movements</w:t>
-      </w:r>
-      <w:proofErr w:type="spellEnd"/>
-      <w:r>
-        <w:rPr>
-          <w:lang w:val="de-DE"/>
-        </w:rPr>
-        <w:t xml:space="preserve"> </w:t>
-      </w:r>
-      <w:proofErr w:type="spellStart"/>
-      <w:r>
-        <w:rPr>
-          <w:lang w:val="de-DE"/>
-        </w:rPr>
-        <w:t>recorded</w:t>
-      </w:r>
-      <w:proofErr w:type="spellEnd"/>
-      <w:r>
-        <w:rPr>
-          <w:lang w:val="de-DE"/>
-        </w:rPr>
-        <w:t> </w:t>
+        <w:t>Eye movements recorded </w:t>
       </w:r>
     </w:p>
     <w:p>
@@ -7737,42 +7548,12 @@
           <w:lang w:val="de-DE"/>
         </w:rPr>
       </w:pPr>
-      <w:proofErr w:type="spellStart"/>
       <w:r>
         <w:rPr>
           <w:lang w:val="de-DE"/>
         </w:rPr>
-        <w:t>participants</w:t>
-      </w:r>
-      <w:proofErr w:type="spellEnd"/>
-      <w:r>
-        <w:rPr>
-          <w:lang w:val="de-DE"/>
-        </w:rPr>
-        <w:t xml:space="preserve"> </w:t>
-      </w:r>
-      <w:proofErr w:type="spellStart"/>
-      <w:r>
-        <w:rPr>
-          <w:lang w:val="de-DE"/>
-        </w:rPr>
-        <w:t>read</w:t>
-      </w:r>
-      <w:proofErr w:type="spellEnd"/>
-      <w:r>
-        <w:rPr>
-          <w:lang w:val="de-DE"/>
-        </w:rPr>
-        <w:t xml:space="preserve"> 18 </w:t>
-      </w:r>
-      <w:proofErr w:type="spellStart"/>
-      <w:r>
-        <w:rPr>
-          <w:lang w:val="de-DE"/>
-        </w:rPr>
-        <w:t>sentences</w:t>
-      </w:r>
-      <w:proofErr w:type="spellEnd"/>
+        <w:t>participants read 18 sentences</w:t>
+      </w:r>
     </w:p>
     <w:p>
       <w:pPr>
@@ -7784,33 +7565,11 @@
           <w:lang w:val="de-DE"/>
         </w:rPr>
       </w:pPr>
-      <w:proofErr w:type="spellStart"/>
       <w:r>
         <w:rPr>
           <w:lang w:val="de-DE"/>
         </w:rPr>
-        <w:t>Exclude</w:t>
-      </w:r>
-      <w:proofErr w:type="spellEnd"/>
-      <w:r>
-        <w:rPr>
-          <w:lang w:val="de-DE"/>
-        </w:rPr>
-        <w:t xml:space="preserve"> invalid </w:t>
-      </w:r>
-      <w:proofErr w:type="spellStart"/>
-      <w:r>
-        <w:rPr>
-          <w:lang w:val="de-DE"/>
-        </w:rPr>
-        <w:t>trials</w:t>
-      </w:r>
-      <w:proofErr w:type="spellEnd"/>
-      <w:r>
-        <w:rPr>
-          <w:lang w:val="de-DE"/>
-        </w:rPr>
-        <w:t> </w:t>
+        <w:t>Exclude invalid trials </w:t>
       </w:r>
     </w:p>
     <w:p>
@@ -7823,43 +7582,13 @@
           <w:lang w:val="de-DE"/>
         </w:rPr>
       </w:pPr>
-      <w:proofErr w:type="spellStart"/>
       <w:r>
         <w:rPr>
           <w:lang w:val="de-DE"/>
         </w:rPr>
         <w:lastRenderedPageBreak/>
-        <w:t>Participant</w:t>
-      </w:r>
-      <w:proofErr w:type="spellEnd"/>
-      <w:r>
-        <w:rPr>
-          <w:lang w:val="de-DE"/>
-        </w:rPr>
-        <w:t xml:space="preserve"> </w:t>
-      </w:r>
-      <w:proofErr w:type="spellStart"/>
-      <w:r>
-        <w:rPr>
-          <w:lang w:val="de-DE"/>
-        </w:rPr>
-        <w:t>looked</w:t>
-      </w:r>
-      <w:proofErr w:type="spellEnd"/>
-      <w:r>
-        <w:rPr>
-          <w:lang w:val="de-DE"/>
-        </w:rPr>
-        <w:t xml:space="preserve"> </w:t>
-      </w:r>
-      <w:proofErr w:type="spellStart"/>
-      <w:r>
-        <w:rPr>
-          <w:lang w:val="de-DE"/>
-        </w:rPr>
-        <w:t>away</w:t>
-      </w:r>
-      <w:proofErr w:type="spellEnd"/>
+        <w:t>Participant looked away</w:t>
+      </w:r>
     </w:p>
     <w:p>
       <w:pPr>
@@ -7888,28 +7617,12 @@
           <w:lang w:val="de-DE"/>
         </w:rPr>
       </w:pPr>
-      <w:proofErr w:type="spellStart"/>
       <w:r>
         <w:rPr>
           <w:lang w:val="de-DE"/>
         </w:rPr>
-        <w:t>Exclude</w:t>
-      </w:r>
-      <w:proofErr w:type="spellEnd"/>
-      <w:r>
-        <w:rPr>
-          <w:lang w:val="de-DE"/>
-        </w:rPr>
-        <w:t xml:space="preserve"> invalid </w:t>
-      </w:r>
-      <w:proofErr w:type="spellStart"/>
-      <w:r>
-        <w:rPr>
-          <w:lang w:val="de-DE"/>
-        </w:rPr>
-        <w:t>data</w:t>
-      </w:r>
-      <w:proofErr w:type="spellEnd"/>
+        <w:t>Exclude invalid data</w:t>
+      </w:r>
     </w:p>
     <w:p>
       <w:pPr>
@@ -7921,28 +7634,12 @@
           <w:lang w:val="de-DE"/>
         </w:rPr>
       </w:pPr>
-      <w:proofErr w:type="spellStart"/>
       <w:r>
         <w:rPr>
           <w:lang w:val="de-DE"/>
         </w:rPr>
-        <w:t>remove</w:t>
-      </w:r>
-      <w:proofErr w:type="spellEnd"/>
-      <w:r>
-        <w:rPr>
-          <w:lang w:val="de-DE"/>
-        </w:rPr>
-        <w:t xml:space="preserve"> </w:t>
-      </w:r>
-      <w:proofErr w:type="spellStart"/>
-      <w:r>
-        <w:rPr>
-          <w:lang w:val="de-DE"/>
-        </w:rPr>
-        <w:t>blinks</w:t>
-      </w:r>
-      <w:proofErr w:type="spellEnd"/>
+        <w:t>remove blinks</w:t>
+      </w:r>
     </w:p>
     <w:p>
       <w:pPr>
@@ -7958,16 +7655,8 @@
         <w:rPr>
           <w:lang w:val="de-DE"/>
         </w:rPr>
-        <w:t xml:space="preserve">track </w:t>
-      </w:r>
-      <w:proofErr w:type="spellStart"/>
-      <w:r>
-        <w:rPr>
-          <w:lang w:val="de-DE"/>
-        </w:rPr>
-        <w:t>loss</w:t>
-      </w:r>
-      <w:proofErr w:type="spellEnd"/>
+        <w:t>track loss</w:t>
+      </w:r>
     </w:p>
     <w:p>
       <w:pPr>
@@ -8000,16 +7689,8 @@
         <w:rPr>
           <w:lang w:val="de-DE"/>
         </w:rPr>
-        <w:t xml:space="preserve">Role </w:t>
-      </w:r>
-      <w:proofErr w:type="spellStart"/>
-      <w:r>
-        <w:rPr>
-          <w:lang w:val="de-DE"/>
-        </w:rPr>
-        <w:t>noun</w:t>
-      </w:r>
-      <w:proofErr w:type="spellEnd"/>
+        <w:t>Role noun</w:t>
+      </w:r>
     </w:p>
     <w:p>
       <w:pPr>
@@ -8021,14 +7702,12 @@
           <w:lang w:val="de-DE"/>
         </w:rPr>
       </w:pPr>
-      <w:proofErr w:type="spellStart"/>
       <w:r>
         <w:rPr>
           <w:lang w:val="de-DE"/>
         </w:rPr>
         <w:t>Anaphor</w:t>
       </w:r>
-      <w:proofErr w:type="spellEnd"/>
     </w:p>
     <w:p>
       <w:pPr>
@@ -8040,14 +7719,12 @@
           <w:lang w:val="de-DE"/>
         </w:rPr>
       </w:pPr>
-      <w:proofErr w:type="spellStart"/>
       <w:r>
         <w:rPr>
           <w:lang w:val="de-DE"/>
         </w:rPr>
         <w:t>Spillover</w:t>
       </w:r>
-      <w:proofErr w:type="spellEnd"/>
     </w:p>
     <w:p>
       <w:pPr>
@@ -8066,22 +7743,9 @@
       </w:pPr>
       <w:bookmarkStart w:id="17" w:name="_Toc235476220"/>
       <w:r>
-        <w:t xml:space="preserve">3.2 </w:t>
-      </w:r>
-      <w:proofErr w:type="spellStart"/>
-      <w:r>
-        <w:t>Expected</w:t>
-      </w:r>
-      <w:proofErr w:type="spellEnd"/>
-      <w:r>
-        <w:t xml:space="preserve"> </w:t>
-      </w:r>
-      <w:proofErr w:type="spellStart"/>
-      <w:r>
-        <w:t>Results</w:t>
+        <w:t>3.2 Expected Results</w:t>
       </w:r>
       <w:bookmarkEnd w:id="17"/>
-      <w:proofErr w:type="spellEnd"/>
     </w:p>
     <w:tbl>
       <w:tblPr>
@@ -8140,7 +7804,6 @@
                 <w:lang w:val="de-DE"/>
               </w:rPr>
             </w:pPr>
-            <w:proofErr w:type="spellStart"/>
             <w:r>
               <w:rPr>
                 <w:b/>
@@ -8149,7 +7812,6 @@
               </w:rPr>
               <w:t>Condition</w:t>
             </w:r>
-            <w:proofErr w:type="spellEnd"/>
           </w:p>
         </w:tc>
         <w:tc>
@@ -8176,34 +7838,14 @@
                 <w:lang w:val="de-DE"/>
               </w:rPr>
             </w:pPr>
-            <w:proofErr w:type="spellStart"/>
             <w:r>
               <w:rPr>
                 <w:b/>
                 <w:bCs/>
                 <w:lang w:val="de-DE"/>
               </w:rPr>
-              <w:t>Expected</w:t>
-            </w:r>
-            <w:proofErr w:type="spellEnd"/>
-            <w:r>
-              <w:rPr>
-                <w:b/>
-                <w:bCs/>
-                <w:lang w:val="de-DE"/>
-              </w:rPr>
-              <w:t xml:space="preserve"> </w:t>
-            </w:r>
-            <w:proofErr w:type="spellStart"/>
-            <w:r>
-              <w:rPr>
-                <w:b/>
-                <w:bCs/>
-                <w:lang w:val="de-DE"/>
-              </w:rPr>
-              <w:t>Result</w:t>
-            </w:r>
-            <w:proofErr w:type="spellEnd"/>
+              <w:t>Expected Result</w:t>
+            </w:r>
           </w:p>
         </w:tc>
       </w:tr>
@@ -8235,19 +7877,11 @@
                 <w:lang w:val="de-DE"/>
               </w:rPr>
             </w:pPr>
-            <w:proofErr w:type="spellStart"/>
             <w:r>
               <w:rPr>
                 <w:lang w:val="de-DE"/>
               </w:rPr>
-              <w:t>Masculine</w:t>
-            </w:r>
-            <w:proofErr w:type="spellEnd"/>
-            <w:r>
-              <w:rPr>
-                <w:lang w:val="de-DE"/>
-              </w:rPr>
-              <w:t xml:space="preserve"> -&gt; Männer</w:t>
+              <w:t>Masculine -&gt; Männer</w:t>
             </w:r>
           </w:p>
         </w:tc>
@@ -8275,47 +7909,11 @@
                 <w:lang w:val="de-DE"/>
               </w:rPr>
             </w:pPr>
-            <w:proofErr w:type="gramStart"/>
             <w:r>
               <w:rPr>
                 <w:lang w:val="de-DE"/>
               </w:rPr>
-              <w:t>Fastest</w:t>
-            </w:r>
-            <w:proofErr w:type="gramEnd"/>
-            <w:r>
-              <w:rPr>
-                <w:lang w:val="de-DE"/>
-              </w:rPr>
-              <w:t xml:space="preserve"> </w:t>
-            </w:r>
-            <w:proofErr w:type="spellStart"/>
-            <w:r>
-              <w:rPr>
-                <w:lang w:val="de-DE"/>
-              </w:rPr>
-              <w:t>processing</w:t>
-            </w:r>
-            <w:proofErr w:type="spellEnd"/>
-            <w:r>
-              <w:rPr>
-                <w:lang w:val="de-DE"/>
-              </w:rPr>
-              <w:t xml:space="preserve"> (</w:t>
-            </w:r>
-            <w:proofErr w:type="spellStart"/>
-            <w:r>
-              <w:rPr>
-                <w:lang w:val="de-DE"/>
-              </w:rPr>
-              <w:t>gender</w:t>
-            </w:r>
-            <w:proofErr w:type="spellEnd"/>
-            <w:r>
-              <w:rPr>
-                <w:lang w:val="de-DE"/>
-              </w:rPr>
-              <w:t xml:space="preserve"> match)</w:t>
+              <w:t>Fastest processing (gender match)</w:t>
             </w:r>
           </w:p>
         </w:tc>
@@ -8348,19 +7946,11 @@
                 <w:lang w:val="de-DE"/>
               </w:rPr>
             </w:pPr>
-            <w:proofErr w:type="spellStart"/>
             <w:r>
               <w:rPr>
                 <w:lang w:val="de-DE"/>
               </w:rPr>
-              <w:t>Masculine</w:t>
-            </w:r>
-            <w:proofErr w:type="spellEnd"/>
-            <w:r>
-              <w:rPr>
-                <w:lang w:val="de-DE"/>
-              </w:rPr>
-              <w:t xml:space="preserve"> -&gt; Frauen</w:t>
+              <w:t>Masculine -&gt; Frauen</w:t>
             </w:r>
           </w:p>
         </w:tc>
@@ -8392,21 +7982,7 @@
               <w:rPr>
                 <w:lang w:val="en-GB"/>
               </w:rPr>
-              <w:t xml:space="preserve">Longer </w:t>
-            </w:r>
-            <w:proofErr w:type="gramStart"/>
-            <w:r>
-              <w:rPr>
-                <w:lang w:val="en-GB"/>
-              </w:rPr>
-              <w:t>processing  (</w:t>
-            </w:r>
-            <w:proofErr w:type="gramEnd"/>
-            <w:r>
-              <w:rPr>
-                <w:lang w:val="en-GB"/>
-              </w:rPr>
-              <w:t>possible male bias)</w:t>
+              <w:t>Longer processing  (possible male bias)</w:t>
             </w:r>
           </w:p>
         </w:tc>
@@ -8471,47 +8047,11 @@
                 <w:lang w:val="de-DE"/>
               </w:rPr>
             </w:pPr>
-            <w:proofErr w:type="gramStart"/>
             <w:r>
               <w:rPr>
                 <w:lang w:val="de-DE"/>
               </w:rPr>
-              <w:t>Fastest</w:t>
-            </w:r>
-            <w:proofErr w:type="gramEnd"/>
-            <w:r>
-              <w:rPr>
-                <w:lang w:val="de-DE"/>
-              </w:rPr>
-              <w:t xml:space="preserve"> </w:t>
-            </w:r>
-            <w:proofErr w:type="spellStart"/>
-            <w:r>
-              <w:rPr>
-                <w:lang w:val="de-DE"/>
-              </w:rPr>
-              <w:t>processing</w:t>
-            </w:r>
-            <w:proofErr w:type="spellEnd"/>
-            <w:r>
-              <w:rPr>
-                <w:lang w:val="de-DE"/>
-              </w:rPr>
-              <w:t xml:space="preserve"> (</w:t>
-            </w:r>
-            <w:proofErr w:type="spellStart"/>
-            <w:r>
-              <w:rPr>
-                <w:lang w:val="de-DE"/>
-              </w:rPr>
-              <w:t>gender</w:t>
-            </w:r>
-            <w:proofErr w:type="spellEnd"/>
-            <w:r>
-              <w:rPr>
-                <w:lang w:val="de-DE"/>
-              </w:rPr>
-              <w:t xml:space="preserve"> match)</w:t>
+              <w:t>Fastest processing (gender match)</w:t>
             </w:r>
           </w:p>
         </w:tc>
@@ -8580,51 +8120,7 @@
               <w:rPr>
                 <w:lang w:val="de-DE"/>
               </w:rPr>
-              <w:t xml:space="preserve">Longest </w:t>
-            </w:r>
-            <w:proofErr w:type="spellStart"/>
-            <w:proofErr w:type="gramStart"/>
-            <w:r>
-              <w:rPr>
-                <w:lang w:val="de-DE"/>
-              </w:rPr>
-              <w:t>processing</w:t>
-            </w:r>
-            <w:proofErr w:type="spellEnd"/>
-            <w:r>
-              <w:rPr>
-                <w:lang w:val="de-DE"/>
-              </w:rPr>
-              <w:t xml:space="preserve">  (</w:t>
-            </w:r>
-            <w:proofErr w:type="spellStart"/>
-            <w:proofErr w:type="gramEnd"/>
-            <w:r>
-              <w:rPr>
-                <w:lang w:val="de-DE"/>
-              </w:rPr>
-              <w:t>gender</w:t>
-            </w:r>
-            <w:proofErr w:type="spellEnd"/>
-            <w:r>
-              <w:rPr>
-                <w:lang w:val="de-DE"/>
-              </w:rPr>
-              <w:t xml:space="preserve"> </w:t>
-            </w:r>
-            <w:proofErr w:type="spellStart"/>
-            <w:r>
-              <w:rPr>
-                <w:lang w:val="de-DE"/>
-              </w:rPr>
-              <w:t>mismatch</w:t>
-            </w:r>
-            <w:proofErr w:type="spellEnd"/>
-            <w:r>
-              <w:rPr>
-                <w:lang w:val="de-DE"/>
-              </w:rPr>
-              <w:t>)</w:t>
+              <w:t>Longest processing  (gender mismatch)</w:t>
             </w:r>
           </w:p>
         </w:tc>
@@ -8795,23 +8291,7 @@
         <w:t>3</w:t>
       </w:r>
       <w:r>
-        <w:t xml:space="preserve"> Quality Control (</w:t>
-      </w:r>
-      <w:proofErr w:type="spellStart"/>
-      <w:r>
-        <w:t>includes</w:t>
-      </w:r>
-      <w:proofErr w:type="spellEnd"/>
-      <w:r>
-        <w:t xml:space="preserve"> </w:t>
-      </w:r>
-      <w:proofErr w:type="spellStart"/>
-      <w:r>
-        <w:t>plots</w:t>
-      </w:r>
-      <w:proofErr w:type="spellEnd"/>
-      <w:r>
-        <w:t>)</w:t>
+        <w:t xml:space="preserve"> Quality Control (includes plots)</w:t>
       </w:r>
       <w:bookmarkEnd w:id="18"/>
     </w:p>
@@ -9161,16 +8641,8 @@
         <w:rPr>
           <w:lang w:val="de-DE"/>
         </w:rPr>
-        <w:t xml:space="preserve">Regression </w:t>
-      </w:r>
-      <w:proofErr w:type="spellStart"/>
-      <w:r>
-        <w:rPr>
-          <w:lang w:val="de-DE"/>
-        </w:rPr>
-        <w:t>Probabilities</w:t>
-      </w:r>
-      <w:proofErr w:type="spellEnd"/>
+        <w:t>Regression Probabilities</w:t>
+      </w:r>
     </w:p>
     <w:p>
       <w:pPr>
@@ -9186,21 +8658,7 @@
         <w:rPr>
           <w:lang w:val="de-DE"/>
         </w:rPr>
-        <w:t>Go-</w:t>
-      </w:r>
-      <w:proofErr w:type="spellStart"/>
-      <w:r>
-        <w:rPr>
-          <w:lang w:val="de-DE"/>
-        </w:rPr>
-        <w:t>past</w:t>
-      </w:r>
-      <w:proofErr w:type="spellEnd"/>
-      <w:r>
-        <w:rPr>
-          <w:lang w:val="de-DE"/>
-        </w:rPr>
-        <w:t xml:space="preserve"> Time</w:t>
+        <w:t>Go-past Time</w:t>
       </w:r>
     </w:p>
     <w:p>
@@ -9321,6 +8779,18 @@
         <w:t>Questionnaire</w:t>
       </w:r>
       <w:bookmarkEnd w:id="23"/>
+      <w:r>
+        <w:rPr>
+          <w:lang w:val="en-GB"/>
+        </w:rPr>
+        <w:t xml:space="preserve"> </w:t>
+      </w:r>
+      <w:r>
+        <w:rPr>
+          <w:lang w:val="en-GB"/>
+        </w:rPr>
+        <w:t>(Sophie)</w:t>
+      </w:r>
     </w:p>
     <w:p>
       <w:pPr>
@@ -9376,47 +8846,17 @@
         </w:rPr>
         <w:t xml:space="preserve">The part during the experiment contains the Question that is shown as the comprehension question after each sentences slide. There we noted what the participant remembered but especially if they explicitly use a gendered role noun in their answer. As it is only a question to </w:t>
       </w:r>
-      <w:proofErr w:type="gramStart"/>
       <w:r>
         <w:rPr>
           <w:lang w:val="en-GB"/>
         </w:rPr>
         <w:t>make sure</w:t>
       </w:r>
-      <w:proofErr w:type="gramEnd"/>
-      <w:r>
-        <w:rPr>
-          <w:lang w:val="en-GB"/>
-        </w:rPr>
-        <w:t xml:space="preserve"> they really read the sentences </w:t>
-      </w:r>
-      <w:proofErr w:type="gramStart"/>
-      <w:r>
-        <w:rPr>
-          <w:lang w:val="en-GB"/>
-        </w:rPr>
-        <w:t>its</w:t>
-      </w:r>
-      <w:proofErr w:type="gramEnd"/>
-      <w:r>
-        <w:rPr>
-          <w:lang w:val="en-GB"/>
-        </w:rPr>
-        <w:t xml:space="preserve"> not the most important think that they get the context right. More important is what they remembered like do they use the male, female or gender inclusive form or do they use “</w:t>
-      </w:r>
-      <w:proofErr w:type="spellStart"/>
-      <w:r>
-        <w:rPr>
-          <w:lang w:val="en-GB"/>
-        </w:rPr>
-        <w:t>Männer</w:t>
-      </w:r>
-      <w:proofErr w:type="spellEnd"/>
-      <w:r>
-        <w:rPr>
-          <w:lang w:val="en-GB"/>
-        </w:rPr>
-        <w:t xml:space="preserve">” or “Frauen” while answering. While they answer we also note if there is a confusion that we detect. That could be by the participant having problems articulate the answer or they don’t remember exactly or only can </w:t>
+      <w:r>
+        <w:rPr>
+          <w:lang w:val="en-GB"/>
+        </w:rPr>
+        <w:t xml:space="preserve"> they really read the sentences its not the most important think that they get the context right. More important is what they remembered like do they use the male, female or gender inclusive form or do they use “Männer” or “Frauen” while answering. While they answer we also note if there is a confusion that we detect. That could be by the participant having problems articulate the answer or they don’t remember exactly or only can </w:t>
       </w:r>
       <w:r>
         <w:rPr>
@@ -9443,35 +8883,7 @@
         <w:rPr>
           <w:lang w:val="en-GB"/>
         </w:rPr>
-        <w:t xml:space="preserve">The first question is about the participants usage of gender inclusive language in spoken and in written language. We ask this question to see if the participants that uses often gender inclusive language also has a better processing time of written gender inclusive language compared to male and female forms. Or if there is no correlation. Then we ask how often they notice gender inclusive language in spoken and written language also to see if there is correlation. After that we ask about their standing about gender inclusive language to see if that has a correlation. People often have a strong standing for or against gender inclusive language and one of the reasons from people that are against it is that </w:t>
-      </w:r>
-      <w:proofErr w:type="gramStart"/>
-      <w:r>
-        <w:rPr>
-          <w:lang w:val="en-GB"/>
-        </w:rPr>
-        <w:t>its</w:t>
-      </w:r>
-      <w:proofErr w:type="gramEnd"/>
-      <w:r>
-        <w:rPr>
-          <w:lang w:val="en-GB"/>
-        </w:rPr>
-        <w:t xml:space="preserve"> harder to process </w:t>
-      </w:r>
-      <w:proofErr w:type="spellStart"/>
-      <w:r>
-        <w:rPr>
-          <w:lang w:val="en-GB"/>
-        </w:rPr>
-        <w:t>textes</w:t>
-      </w:r>
-      <w:proofErr w:type="spellEnd"/>
-      <w:r>
-        <w:rPr>
-          <w:lang w:val="en-GB"/>
-        </w:rPr>
-        <w:t xml:space="preserve"> with gender inclusive language so it would </w:t>
+        <w:t xml:space="preserve">The first question is about the participants usage of gender inclusive language in spoken and in written language. We ask this question to see if the participants that uses often gender inclusive language also has a better processing time of written gender inclusive language compared to male and female forms. Or if there is no correlation. Then we ask how often they notice gender inclusive language in spoken and written language also to see if there is correlation. After that we ask about their standing about gender inclusive language to see if that has a correlation. People often have a strong standing for or against gender inclusive language and one of the reasons from people that are against it is that its harder to process textes with gender inclusive language so it would </w:t>
       </w:r>
       <w:r>
         <w:rPr>
@@ -9484,21 +8896,7 @@
         <w:rPr>
           <w:lang w:val="en-GB"/>
         </w:rPr>
-        <w:t xml:space="preserve">first </w:t>
-      </w:r>
-      <w:proofErr w:type="gramStart"/>
-      <w:r>
-        <w:rPr>
-          <w:lang w:val="en-GB"/>
-        </w:rPr>
-        <w:t>came into contact with</w:t>
-      </w:r>
-      <w:proofErr w:type="gramEnd"/>
-      <w:r>
-        <w:rPr>
-          <w:lang w:val="en-GB"/>
-        </w:rPr>
-        <w:t xml:space="preserve"> </w:t>
+        <w:t xml:space="preserve">first came into contact with </w:t>
       </w:r>
       <w:r>
         <w:rPr>
@@ -9522,21 +8920,7 @@
         <w:rPr>
           <w:lang w:val="en-GB"/>
         </w:rPr>
-        <w:t xml:space="preserve">point in time when they first confronted </w:t>
-      </w:r>
-      <w:proofErr w:type="gramStart"/>
-      <w:r>
-        <w:rPr>
-          <w:lang w:val="en-GB"/>
-        </w:rPr>
-        <w:t>with  gender</w:t>
-      </w:r>
-      <w:proofErr w:type="gramEnd"/>
-      <w:r>
-        <w:rPr>
-          <w:lang w:val="en-GB"/>
-        </w:rPr>
-        <w:t xml:space="preserve"> </w:t>
+        <w:t xml:space="preserve">point in time when they first confronted with  gender </w:t>
       </w:r>
       <w:r>
         <w:rPr>
@@ -9578,30 +8962,8 @@
         <w:rPr>
           <w:lang w:val="de-DE"/>
         </w:rPr>
-        <w:t xml:space="preserve">Analyze </w:t>
-      </w:r>
-      <w:proofErr w:type="spellStart"/>
-      <w:r>
-        <w:rPr>
-          <w:lang w:val="de-DE"/>
-        </w:rPr>
-        <w:t>questionnaire</w:t>
-      </w:r>
-      <w:proofErr w:type="spellEnd"/>
-      <w:r>
-        <w:rPr>
-          <w:lang w:val="de-DE"/>
-        </w:rPr>
-        <w:t xml:space="preserve"> </w:t>
-      </w:r>
-      <w:proofErr w:type="spellStart"/>
-      <w:r>
-        <w:rPr>
-          <w:lang w:val="de-DE"/>
-        </w:rPr>
-        <w:t>responses</w:t>
-      </w:r>
-      <w:proofErr w:type="spellEnd"/>
+        <w:t>Analyze questionnaire responses</w:t>
+      </w:r>
     </w:p>
     <w:p>
       <w:pPr>
@@ -9685,6 +9047,12 @@
         <w:t>iscussion</w:t>
       </w:r>
       <w:bookmarkEnd w:id="25"/>
+      <w:r>
+        <w:rPr>
+          <w:lang w:val="en-GB"/>
+        </w:rPr>
+        <w:t xml:space="preserve"> (Aylina)</w:t>
+      </w:r>
     </w:p>
     <w:p>
       <w:pPr>
@@ -10084,20 +9452,12 @@
           <w:lang w:val="en-GB"/>
         </w:rPr>
       </w:pPr>
-      <w:proofErr w:type="spellStart"/>
       <w:r>
         <w:rPr>
           <w:lang w:val="en-GB"/>
         </w:rPr>
         <w:lastRenderedPageBreak/>
-        <w:t>Contibution</w:t>
-      </w:r>
-      <w:proofErr w:type="spellEnd"/>
-      <w:r>
-        <w:rPr>
-          <w:lang w:val="en-GB"/>
-        </w:rPr>
-        <w:t xml:space="preserve"> Table</w:t>
+        <w:t>Contibution Table</w:t>
       </w:r>
     </w:p>
     <w:tbl>
@@ -10161,14 +9521,12 @@
                 <w:lang w:val="en-GB"/>
               </w:rPr>
             </w:pPr>
-            <w:proofErr w:type="spellStart"/>
             <w:r>
               <w:rPr>
                 <w:lang w:val="en-GB"/>
               </w:rPr>
               <w:t>Qianyue</w:t>
             </w:r>
-            <w:proofErr w:type="spellEnd"/>
           </w:p>
         </w:tc>
         <w:tc>
@@ -13444,7 +12802,6 @@
   <w:style w:type="character" w:default="1" w:styleId="Absatz-Standardschriftart">
     <w:name w:val="Default Paragraph Font"/>
     <w:uiPriority w:val="1"/>
-    <w:semiHidden/>
     <w:unhideWhenUsed/>
   </w:style>
   <w:style w:type="table" w:default="1" w:styleId="NormaleTabelle">
@@ -14235,11 +13592,13 @@
   <w:rsids>
     <w:rsidRoot w:val="006730F7"/>
     <w:rsid w:val="001830B6"/>
+    <w:rsid w:val="001E1B03"/>
     <w:rsid w:val="003C30B9"/>
     <w:rsid w:val="006730F7"/>
     <w:rsid w:val="00B50854"/>
     <w:rsid w:val="00C4247E"/>
     <w:rsid w:val="00C73C78"/>
+    <w:rsid w:val="00D32F32"/>
     <w:rsid w:val="00DC5186"/>
     <w:rsid w:val="00DF3B53"/>
     <w:rsid w:val="00DF6F07"/>

</xml_diff>

<commit_message>
fixed the text size
</commit_message>
<xml_diff>
--- a/report/final_report.docx
+++ b/report/final_report.docx
@@ -4174,14 +4174,12 @@
         </w:rPr>
         <w:t xml:space="preserve"> Because that were too </w:t>
       </w:r>
-      <w:proofErr w:type="gramStart"/>
-      <w:r>
-        <w:rPr>
-          <w:lang w:val="en-GB"/>
-        </w:rPr>
-        <w:t>much</w:t>
-      </w:r>
-      <w:proofErr w:type="gramEnd"/>
+      <w:r>
+        <w:rPr>
+          <w:lang w:val="en-GB"/>
+        </w:rPr>
+        <w:t>many</w:t>
+      </w:r>
       <w:r>
         <w:rPr>
           <w:lang w:val="en-GB"/>
@@ -7950,55 +7948,13 @@
         <w:rPr>
           <w:lang w:val="en-GB"/>
         </w:rPr>
-        <w:t>2</w:t>
-      </w:r>
-      <w:r>
-        <w:rPr>
-          <w:lang w:val="en-GB"/>
-        </w:rPr>
-        <w:t>.</w:t>
-      </w:r>
-      <w:r>
-        <w:rPr>
-          <w:lang w:val="en-GB"/>
-        </w:rPr>
-        <w:t>3</w:t>
-      </w:r>
-      <w:r>
-        <w:rPr>
-          <w:lang w:val="en-GB"/>
-        </w:rPr>
-        <w:t>.</w:t>
-      </w:r>
-      <w:r>
-        <w:rPr>
-          <w:lang w:val="en-GB"/>
-        </w:rPr>
-        <w:t>1</w:t>
-      </w:r>
-      <w:r>
-        <w:rPr>
-          <w:lang w:val="en-GB"/>
-        </w:rPr>
-        <w:t xml:space="preserve"> </w:t>
-      </w:r>
-      <w:r>
-        <w:rPr>
-          <w:lang w:val="en-GB"/>
-        </w:rPr>
-        <w:t>Experiment Process</w:t>
-      </w:r>
-      <w:r>
-        <w:rPr>
-          <w:lang w:val="en-GB"/>
-        </w:rPr>
-        <w:t xml:space="preserve"> </w:t>
-      </w:r>
-      <w:r>
-        <w:rPr>
-          <w:lang w:val="en-GB"/>
-        </w:rPr>
-        <w:t>(Sophie)</w:t>
+        <w:t>2.3.1 Experiment Process</w:t>
+      </w:r>
+      <w:r>
+        <w:rPr>
+          <w:lang w:val="en-GB"/>
+        </w:rPr>
+        <w:t xml:space="preserve"> (Sophie)</w:t>
       </w:r>
       <w:bookmarkEnd w:id="14"/>
     </w:p>
@@ -8016,37 +7972,7 @@
         <w:rPr>
           <w:lang w:val="en-GB"/>
         </w:rPr>
-        <w:t>2</w:t>
-      </w:r>
-      <w:r>
-        <w:rPr>
-          <w:lang w:val="en-GB"/>
-        </w:rPr>
-        <w:t>.</w:t>
-      </w:r>
-      <w:r>
-        <w:rPr>
-          <w:lang w:val="en-GB"/>
-        </w:rPr>
-        <w:t>3</w:t>
-      </w:r>
-      <w:r>
-        <w:rPr>
-          <w:lang w:val="en-GB"/>
-        </w:rPr>
-        <w:t>.</w:t>
-      </w:r>
-      <w:r>
-        <w:rPr>
-          <w:lang w:val="en-GB"/>
-        </w:rPr>
-        <w:t>2</w:t>
-      </w:r>
-      <w:r>
-        <w:rPr>
-          <w:lang w:val="en-GB"/>
-        </w:rPr>
-        <w:t xml:space="preserve"> </w:t>
+        <w:t xml:space="preserve">2.3.2 </w:t>
       </w:r>
       <w:r>
         <w:rPr>
@@ -8200,7 +8126,19 @@
         <w:rPr>
           <w:lang w:val="en-GB"/>
         </w:rPr>
-        <w:t xml:space="preserve">After the experiment the participants get to answer the Post Experiment Questions, these we use to better understand the background of the participants. For the first two questions we use a scale from 1 to 5 where 1 means low and 5 means high. The first question is about the participants usage of gender inclusive language in spoken and in written language. We ask this question to see if the participants that uses often gender inclusive language also has a better processing time of written gender inclusive language compared to male and female forms. Or if there is no correlation. Then we ask how often they notice gender inclusive language in spoken and written language also to see if there is correlation. After that we ask about their standing about gender inclusive language to see if that has a correlation. People often have a strong standing for or against gender inclusive language and one of the reasons from people that are against it is that </w:t>
+        <w:t xml:space="preserve">After the experiment the participants get to answer the Post Experiment Questions, these we use to better understand the background of the participants. </w:t>
+      </w:r>
+      <w:r>
+        <w:rPr>
+          <w:lang w:val="en-GB"/>
+        </w:rPr>
+        <w:t>The first question contains the participants to assume what the experiment was about. For the next two</w:t>
+      </w:r>
+      <w:r>
+        <w:rPr>
+          <w:lang w:val="en-GB"/>
+        </w:rPr>
+        <w:t xml:space="preserve"> questions we use a scale from 1 to 5 where 1 means low and 5 means high. The first question is about the participants usage of gender inclusive language in spoken and in written language. We ask this question to see if the participants that uses often gender inclusive language also has a better processing time of written gender inclusive language compared to male and female forms. Or if there is no correlation. Then we ask how often they notice gender inclusive language in spoken and written language also to see if there is correlation. After that we ask about their standing about gender inclusive language to see if that has a correlation. People often have a strong standing for or against gender inclusive language and one of the reasons from people that are against it is that </w:t>
       </w:r>
       <w:proofErr w:type="spellStart"/>
       <w:proofErr w:type="gramStart"/>
@@ -8297,10 +8235,137 @@
     </w:p>
     <w:p>
       <w:pPr>
-        <w:rPr>
-          <w:lang w:val="en-GB"/>
-        </w:rPr>
-      </w:pPr>
+        <w:spacing w:line="360" w:lineRule="auto"/>
+        <w:jc w:val="both"/>
+        <w:rPr>
+          <w:lang w:val="en-GB"/>
+        </w:rPr>
+      </w:pPr>
+    </w:p>
+    <w:p>
+      <w:pPr>
+        <w:spacing w:line="360" w:lineRule="auto"/>
+        <w:jc w:val="both"/>
+        <w:rPr>
+          <w:lang w:val="en-GB"/>
+        </w:rPr>
+      </w:pPr>
+      <w:r>
+        <w:rPr>
+          <w:lang w:val="en-GB"/>
+        </w:rPr>
+        <w:t xml:space="preserve">Challenges </w:t>
+      </w:r>
+    </w:p>
+    <w:p>
+      <w:pPr>
+        <w:spacing w:line="360" w:lineRule="auto"/>
+        <w:jc w:val="both"/>
+        <w:rPr>
+          <w:i/>
+          <w:iCs/>
+          <w:lang w:val="en-GB"/>
+        </w:rPr>
+      </w:pPr>
+      <w:r>
+        <w:rPr>
+          <w:lang w:val="en-GB"/>
+        </w:rPr>
+        <w:lastRenderedPageBreak/>
+        <w:t xml:space="preserve">After the pilot went well and we prepared everything for our first data collection we faced a new problem that didn’t occur before. We got a warning in the console: </w:t>
+      </w:r>
+      <w:r>
+        <w:rPr>
+          <w:lang w:val="en-GB"/>
+        </w:rPr>
+        <w:br/>
+      </w:r>
+      <w:r>
+        <w:rPr>
+          <w:i/>
+          <w:iCs/>
+          <w:lang w:val="en-GB"/>
+        </w:rPr>
+        <w:t>[logger:</w:t>
+      </w:r>
+      <w:proofErr w:type="gramStart"/>
+      <w:r>
+        <w:rPr>
+          <w:i/>
+          <w:iCs/>
+          <w:lang w:val="en-GB"/>
+        </w:rPr>
+        <w:t>67:WARNING</w:t>
+      </w:r>
+      <w:proofErr w:type="gramEnd"/>
+      <w:r>
+        <w:rPr>
+          <w:i/>
+          <w:iCs/>
+          <w:lang w:val="en-GB"/>
+        </w:rPr>
+        <w:t>] the variable word was created after the first logger call and will therefore not be logged.</w:t>
+      </w:r>
+    </w:p>
+    <w:p>
+      <w:pPr>
+        <w:spacing w:line="360" w:lineRule="auto"/>
+        <w:jc w:val="both"/>
+        <w:rPr>
+          <w:lang w:val="en-GB"/>
+        </w:rPr>
+      </w:pPr>
+      <w:r>
+        <w:rPr>
+          <w:lang w:val="en-GB"/>
+        </w:rPr>
+        <w:t xml:space="preserve">We got this Warning with all our variables and after checking the log file we </w:t>
+      </w:r>
+      <w:r>
+        <w:rPr>
+          <w:lang w:val="en-GB"/>
+        </w:rPr>
+        <w:t>saw</w:t>
+      </w:r>
+      <w:r>
+        <w:rPr>
+          <w:lang w:val="en-GB"/>
+        </w:rPr>
+        <w:t xml:space="preserve"> that all variables indeed didn’t </w:t>
+      </w:r>
+      <w:proofErr w:type="gramStart"/>
+      <w:r>
+        <w:rPr>
+          <w:lang w:val="en-GB"/>
+        </w:rPr>
+        <w:t>got</w:t>
+      </w:r>
+      <w:proofErr w:type="gramEnd"/>
+      <w:r>
+        <w:rPr>
+          <w:lang w:val="en-GB"/>
+        </w:rPr>
+        <w:t xml:space="preserve"> logged. And a lot of these variables must be logged like the position from anaphor, role noun and the spillover region is very important. </w:t>
+      </w:r>
+      <w:r>
+        <w:rPr>
+          <w:lang w:val="en-GB"/>
+        </w:rPr>
+        <w:t>We also tested the Open Sesame file from the pilot and got the same warning</w:t>
+      </w:r>
+      <w:r>
+        <w:rPr>
+          <w:lang w:val="en-GB"/>
+        </w:rPr>
+        <w:t xml:space="preserve"> even though it didn’t appear during the pilot where everything was working as intended. </w:t>
+      </w:r>
+      <w:r>
+        <w:rPr>
+          <w:lang w:val="en-GB"/>
+        </w:rPr>
+        <w:br/>
+        <w:t xml:space="preserve">But after a lot of trial and error we found a solution to fix that problem. We included an inline script at the beginning of the experiment where we initialized all our variables and that fixed the problem and all variables got logged as intended. </w:t>
+      </w:r>
     </w:p>
     <w:p>
       <w:pPr>
@@ -8314,7 +8379,6 @@
         <w:rPr>
           <w:lang w:val="en-GB"/>
         </w:rPr>
-        <w:lastRenderedPageBreak/>
         <w:t>3. Analysis methods</w:t>
       </w:r>
       <w:r>
@@ -8357,13 +8421,7 @@
         <w:rPr>
           <w:lang w:val="en-GB"/>
         </w:rPr>
-        <w:t xml:space="preserve"> </w:t>
-      </w:r>
-      <w:r>
-        <w:rPr>
-          <w:lang w:val="en-GB"/>
-        </w:rPr>
-        <w:t>(</w:t>
+        <w:t xml:space="preserve"> (</w:t>
       </w:r>
       <w:proofErr w:type="spellStart"/>
       <w:r>
@@ -8786,19 +8844,7 @@
         <w:rPr>
           <w:lang w:val="en-GB"/>
         </w:rPr>
-        <w:t>(</w:t>
-      </w:r>
-      <w:r>
-        <w:rPr>
-          <w:lang w:val="en-GB"/>
-        </w:rPr>
-        <w:t>Aylina</w:t>
-      </w:r>
-      <w:r>
-        <w:rPr>
-          <w:lang w:val="en-GB"/>
-        </w:rPr>
-        <w:t>)</w:t>
+        <w:t>(Aylina)</w:t>
       </w:r>
       <w:bookmarkEnd w:id="19"/>
     </w:p>
@@ -8959,6 +9005,7 @@
               <w:rPr>
                 <w:lang w:val="de-DE"/>
               </w:rPr>
+              <w:lastRenderedPageBreak/>
               <w:t>Masculine</w:t>
             </w:r>
             <w:proofErr w:type="spellEnd"/>
@@ -9513,7 +9560,6 @@
         <w:rPr>
           <w:lang w:val="en-GB"/>
         </w:rPr>
-        <w:lastRenderedPageBreak/>
         <w:t>3.</w:t>
       </w:r>
       <w:r>
@@ -9626,6 +9672,7 @@
         <w:rPr>
           <w:noProof/>
         </w:rPr>
+        <w:lastRenderedPageBreak/>
         <w:drawing>
           <wp:inline distT="0" distB="0" distL="0" distR="0" wp14:anchorId="1B664E93" wp14:editId="66792230">
             <wp:extent cx="5760720" cy="3201035"/>
@@ -9686,7 +9733,6 @@
         <w:rPr>
           <w:noProof/>
         </w:rPr>
-        <w:lastRenderedPageBreak/>
         <w:drawing>
           <wp:inline distT="0" distB="0" distL="0" distR="0" wp14:anchorId="0C2989E3" wp14:editId="229EDD59">
             <wp:extent cx="5760720" cy="3201035"/>
@@ -9747,6 +9793,7 @@
         <w:rPr>
           <w:noProof/>
         </w:rPr>
+        <w:lastRenderedPageBreak/>
         <w:drawing>
           <wp:inline distT="0" distB="0" distL="0" distR="0" wp14:anchorId="4C512CAC" wp14:editId="3537D111">
             <wp:extent cx="5760720" cy="3695065"/>
@@ -9863,13 +9910,7 @@
         <w:rPr>
           <w:lang w:val="en-GB"/>
         </w:rPr>
-        <w:t xml:space="preserve"> </w:t>
-      </w:r>
-      <w:r>
-        <w:rPr>
-          <w:lang w:val="en-GB"/>
-        </w:rPr>
-        <w:t>(</w:t>
+        <w:t xml:space="preserve"> (</w:t>
       </w:r>
       <w:proofErr w:type="spellStart"/>
       <w:proofErr w:type="gramEnd"/>
@@ -9992,7 +10033,6 @@
         <w:rPr>
           <w:lang w:val="en-GB"/>
         </w:rPr>
-        <w:lastRenderedPageBreak/>
         <w:t>Compare eye-tracking measures across conditions</w:t>
       </w:r>
     </w:p>
@@ -10027,19 +10067,7 @@
         <w:rPr>
           <w:lang w:val="en-GB"/>
         </w:rPr>
-        <w:t xml:space="preserve"> </w:t>
-      </w:r>
-      <w:r>
-        <w:rPr>
-          <w:lang w:val="en-GB"/>
-        </w:rPr>
-        <w:t>(</w:t>
-      </w:r>
-      <w:r>
-        <w:rPr>
-          <w:lang w:val="en-GB"/>
-        </w:rPr>
-        <w:t xml:space="preserve">Aylina &amp; </w:t>
+        <w:t xml:space="preserve"> (Aylina &amp; </w:t>
       </w:r>
       <w:proofErr w:type="spellStart"/>
       <w:r>
@@ -10172,13 +10200,7 @@
         <w:rPr>
           <w:lang w:val="en-GB"/>
         </w:rPr>
-        <w:t xml:space="preserve"> </w:t>
-      </w:r>
-      <w:r>
-        <w:rPr>
-          <w:lang w:val="en-GB"/>
-        </w:rPr>
-        <w:t xml:space="preserve">(Aylina &amp; </w:t>
+        <w:t xml:space="preserve"> (Aylina &amp; </w:t>
       </w:r>
       <w:proofErr w:type="spellStart"/>
       <w:r>
@@ -10218,13 +10240,7 @@
         <w:rPr>
           <w:lang w:val="en-GB"/>
         </w:rPr>
-        <w:t xml:space="preserve"> </w:t>
-      </w:r>
-      <w:r>
-        <w:rPr>
-          <w:lang w:val="en-GB"/>
-        </w:rPr>
-        <w:t>(Aylina)</w:t>
+        <w:t xml:space="preserve"> (Aylina)</w:t>
       </w:r>
     </w:p>
     <w:p>
@@ -10259,13 +10275,7 @@
         <w:rPr>
           <w:lang w:val="en-GB"/>
         </w:rPr>
-        <w:t xml:space="preserve"> </w:t>
-      </w:r>
-      <w:r>
-        <w:rPr>
-          <w:lang w:val="en-GB"/>
-        </w:rPr>
-        <w:t>(</w:t>
+        <w:t xml:space="preserve"> (</w:t>
       </w:r>
       <w:proofErr w:type="spellStart"/>
       <w:r>
@@ -10301,6 +10311,7 @@
         <w:rPr>
           <w:lang w:val="en-GB"/>
         </w:rPr>
+        <w:lastRenderedPageBreak/>
         <w:t xml:space="preserve">3.4.3 </w:t>
       </w:r>
       <w:r>
@@ -10313,13 +10324,7 @@
         <w:rPr>
           <w:lang w:val="en-GB"/>
         </w:rPr>
-        <w:t xml:space="preserve"> </w:t>
-      </w:r>
-      <w:r>
-        <w:rPr>
-          <w:lang w:val="en-GB"/>
-        </w:rPr>
-        <w:t xml:space="preserve">(Aylina &amp; </w:t>
+        <w:t xml:space="preserve"> (Aylina &amp; </w:t>
       </w:r>
       <w:proofErr w:type="spellStart"/>
       <w:r>
@@ -10400,13 +10405,7 @@
         <w:rPr>
           <w:lang w:val="en-GB"/>
         </w:rPr>
-        <w:t xml:space="preserve"> </w:t>
-      </w:r>
-      <w:r>
-        <w:rPr>
-          <w:lang w:val="en-GB"/>
-        </w:rPr>
-        <w:t>(</w:t>
+        <w:t xml:space="preserve"> (</w:t>
       </w:r>
       <w:proofErr w:type="spellStart"/>
       <w:r>
@@ -10513,13 +10512,7 @@
         <w:rPr>
           <w:lang w:val="en-GB"/>
         </w:rPr>
-        <w:t>Aylina</w:t>
-      </w:r>
-      <w:r>
-        <w:rPr>
-          <w:lang w:val="en-GB"/>
-        </w:rPr>
-        <w:t>)</w:t>
+        <w:t>Aylina)</w:t>
       </w:r>
     </w:p>
     <w:p>
@@ -10689,7 +10682,6 @@
         <w:rPr>
           <w:lang w:val="en-GB"/>
         </w:rPr>
-        <w:lastRenderedPageBreak/>
         <w:t>Limitations</w:t>
       </w:r>
     </w:p>
@@ -15203,7 +15195,9 @@
     <w:rsidRoot w:val="006730F7"/>
     <w:rsid w:val="001830B6"/>
     <w:rsid w:val="001E1B03"/>
+    <w:rsid w:val="00335C5F"/>
     <w:rsid w:val="003C30B9"/>
+    <w:rsid w:val="00516574"/>
     <w:rsid w:val="006730F7"/>
     <w:rsid w:val="00B50854"/>
     <w:rsid w:val="00C4247E"/>

</xml_diff>

<commit_message>
add notes to intro test
</commit_message>
<xml_diff>
--- a/report/final_report.docx
+++ b/report/final_report.docx
@@ -1,6 +1,6 @@
 
 <file path=word/document.xml><?xml version="1.0" encoding="utf-8"?>
-<w:document xmlns:wpc="http://schemas.microsoft.com/office/word/2010/wordprocessingCanvas" xmlns:cx="http://schemas.microsoft.com/office/drawing/2014/chartex" xmlns:cx1="http://schemas.microsoft.com/office/drawing/2015/9/8/chartex" xmlns:cx2="http://schemas.microsoft.com/office/drawing/2015/10/21/chartex" xmlns:cx3="http://schemas.microsoft.com/office/drawing/2016/5/9/chartex" xmlns:cx4="http://schemas.microsoft.com/office/drawing/2016/5/10/chartex" xmlns:cx5="http://schemas.microsoft.com/office/drawing/2016/5/11/chartex" xmlns:cx6="http://schemas.microsoft.com/office/drawing/2016/5/12/chartex" xmlns:cx7="http://schemas.microsoft.com/office/drawing/2016/5/13/chartex" xmlns:cx8="http://schemas.microsoft.com/office/drawing/2016/5/14/chartex" xmlns:mc="http://schemas.openxmlformats.org/markup-compatibility/2006" xmlns:aink="http://schemas.microsoft.com/office/drawing/2016/ink" xmlns:am3d="http://schemas.microsoft.com/office/drawing/2017/model3d" xmlns:o="urn:schemas-microsoft-com:office:office" xmlns:oel="http://schemas.microsoft.com/office/2019/extlst" xmlns:r="http://schemas.openxmlformats.org/officeDocument/2006/relationships" xmlns:m="http://schemas.openxmlformats.org/officeDocument/2006/math" xmlns:v="urn:schemas-microsoft-com:vml" xmlns:wp14="http://schemas.microsoft.com/office/word/2010/wordprocessingDrawing" xmlns:wp="http://schemas.openxmlformats.org/drawingml/2006/wordprocessingDrawing" xmlns:w10="urn:schemas-microsoft-com:office:word" xmlns:w="http://schemas.openxmlformats.org/wordprocessingml/2006/main" xmlns:w14="http://schemas.microsoft.com/office/word/2010/wordml" xmlns:w15="http://schemas.microsoft.com/office/word/2012/wordml" xmlns:w16cex="http://schemas.microsoft.com/office/word/2018/wordml/cex" xmlns:w16cid="http://schemas.microsoft.com/office/word/2016/wordml/cid" xmlns:w16="http://schemas.microsoft.com/office/word/2018/wordml" xmlns:w16du="http://schemas.microsoft.com/office/word/2023/wordml/word16du" xmlns:w16sdtdh="http://schemas.microsoft.com/office/word/2020/wordml/sdtdatahash" xmlns:w16sdtfl="http://schemas.microsoft.com/office/word/2024/wordml/sdtformatlock" xmlns:w16se="http://schemas.microsoft.com/office/word/2015/wordml/symex" xmlns:wpg="http://schemas.microsoft.com/office/word/2010/wordprocessingGroup" xmlns:wpi="http://schemas.microsoft.com/office/word/2010/wordprocessingInk" xmlns:wne="http://schemas.microsoft.com/office/word/2006/wordml" xmlns:wps="http://schemas.microsoft.com/office/word/2010/wordprocessingShape" mc:Ignorable="w14 w15 w16se w16cid w16 w16cex w16sdtdh w16sdtfl w16du wp14">
+<w:document xmlns:wpc="http://schemas.microsoft.com/office/word/2010/wordprocessingCanvas" xmlns:cx="http://schemas.microsoft.com/office/drawing/2014/chartex" xmlns:cx1="http://schemas.microsoft.com/office/drawing/2015/9/8/chartex" xmlns:cx2="http://schemas.microsoft.com/office/drawing/2015/10/21/chartex" xmlns:cx3="http://schemas.microsoft.com/office/drawing/2016/5/9/chartex" xmlns:cx4="http://schemas.microsoft.com/office/drawing/2016/5/10/chartex" xmlns:cx5="http://schemas.microsoft.com/office/drawing/2016/5/11/chartex" xmlns:cx6="http://schemas.microsoft.com/office/drawing/2016/5/12/chartex" xmlns:cx7="http://schemas.microsoft.com/office/drawing/2016/5/13/chartex" xmlns:cx8="http://schemas.microsoft.com/office/drawing/2016/5/14/chartex" xmlns:mc="http://schemas.openxmlformats.org/markup-compatibility/2006" xmlns:aink="http://schemas.microsoft.com/office/drawing/2016/ink" xmlns:am3d="http://schemas.microsoft.com/office/drawing/2017/model3d" xmlns:o="urn:schemas-microsoft-com:office:office" xmlns:r="http://schemas.openxmlformats.org/officeDocument/2006/relationships" xmlns:m="http://schemas.openxmlformats.org/officeDocument/2006/math" xmlns:v="urn:schemas-microsoft-com:vml" xmlns:wp14="http://schemas.microsoft.com/office/word/2010/wordprocessingDrawing" xmlns:wp="http://schemas.openxmlformats.org/drawingml/2006/wordprocessingDrawing" xmlns:w10="urn:schemas-microsoft-com:office:word" xmlns:w="http://schemas.openxmlformats.org/wordprocessingml/2006/main" xmlns:w14="http://schemas.microsoft.com/office/word/2010/wordml" xmlns:w15="http://schemas.microsoft.com/office/word/2012/wordml" xmlns:w16cid="http://schemas.microsoft.com/office/word/2016/wordml/cid" xmlns:w16se="http://schemas.microsoft.com/office/word/2015/wordml/symex" xmlns:wpg="http://schemas.microsoft.com/office/word/2010/wordprocessingGroup" xmlns:wpi="http://schemas.microsoft.com/office/word/2010/wordprocessingInk" xmlns:wne="http://schemas.microsoft.com/office/word/2006/wordml" xmlns:wps="http://schemas.microsoft.com/office/word/2010/wordprocessingShape" mc:Ignorable="w14 w15 w16se w16cid wp14">
   <w:body>
     <w:p>
       <w:pPr>
@@ -3035,7 +3035,7 @@
           <w:sz w:val="36"/>
         </w:rPr>
         <w:lastRenderedPageBreak/>
-        <w:t xml:space="preserve">List </w:t>
+        <w:t xml:space="preserve">List of </w:t>
       </w:r>
       <w:proofErr w:type="spellStart"/>
       <w:r>
@@ -3043,17 +3043,10 @@
           <w:b/>
           <w:sz w:val="36"/>
         </w:rPr>
-        <w:t>of</w:t>
-      </w:r>
+        <w:t>Tables</w:t>
+      </w:r>
+      <w:bookmarkEnd w:id="2"/>
       <w:proofErr w:type="spellEnd"/>
-      <w:r>
-        <w:rPr>
-          <w:b/>
-          <w:sz w:val="36"/>
-        </w:rPr>
-        <w:t xml:space="preserve"> Tables</w:t>
-      </w:r>
-      <w:bookmarkEnd w:id="2"/>
     </w:p>
     <w:p>
       <w:pPr>
@@ -3235,27 +3228,295 @@
         <w:rPr>
           <w:lang w:val="en-GB"/>
         </w:rPr>
-        <w:t>Why does grammatical gender matter?</w:t>
+        <w:t xml:space="preserve">In 1949 Simone de Beauvoir famously wrote: </w:t>
+      </w:r>
+      <w:r>
+        <w:rPr>
+          <w:lang w:val="en-GB"/>
+        </w:rPr>
+        <w:t xml:space="preserve">“Humanity is male and man defines women not in herself, but as relative to him; she is not regarded as an autonomous being. […] He is the subject, he is the Absolute – she is the Other.” </w:t>
+      </w:r>
+      <w:r>
+        <w:rPr>
+          <w:lang w:val="en-GB"/>
+        </w:rPr>
+        <w:t xml:space="preserve"> (Beauvoir, Simone de (1949), The second sec, </w:t>
+      </w:r>
+      <w:proofErr w:type="spellStart"/>
+      <w:r>
+        <w:rPr>
+          <w:lang w:val="en-GB"/>
+        </w:rPr>
+        <w:t>Parshley</w:t>
+      </w:r>
+      <w:proofErr w:type="spellEnd"/>
+      <w:r>
+        <w:rPr>
+          <w:lang w:val="en-GB"/>
+        </w:rPr>
+        <w:t>, H.M. trans (1953), London)</w:t>
       </w:r>
     </w:p>
     <w:p>
       <w:pPr>
         <w:spacing w:line="360" w:lineRule="auto"/>
-        <w:rPr>
-          <w:lang w:val="en-GB"/>
-        </w:rPr>
-      </w:pPr>
-      <w:r>
-        <w:rPr>
-          <w:lang w:val="en-GB"/>
-        </w:rPr>
-        <w:t>Discussions surrounding the generic masculine</w:t>
-      </w:r>
-      <w:r>
-        <w:rPr>
-          <w:lang w:val="en-GB"/>
-        </w:rPr>
-        <w:br/>
+        <w:jc w:val="both"/>
+        <w:rPr>
+          <w:lang w:val="en-GB"/>
+        </w:rPr>
+      </w:pPr>
+      <w:r>
+        <w:rPr>
+          <w:lang w:val="en-GB"/>
+        </w:rPr>
+        <w:t>The context in which women are treated as a deviation from the male from happens to also be embedded in one of the most fundamental building blocks of society: language itself. How often is the word “man” used in such a way</w:t>
+      </w:r>
+      <w:r>
+        <w:rPr>
+          <w:lang w:val="en-GB"/>
+        </w:rPr>
+        <w:t xml:space="preserve"> that it seems impossible to decide whether it refers to males or all human beings.</w:t>
+      </w:r>
+    </w:p>
+    <w:p>
+      <w:pPr>
+        <w:spacing w:line="360" w:lineRule="auto"/>
+        <w:jc w:val="both"/>
+        <w:rPr>
+          <w:lang w:val="en-GB"/>
+        </w:rPr>
+      </w:pPr>
+      <w:r>
+        <w:rPr>
+          <w:lang w:val="en-GB"/>
+        </w:rPr>
+        <w:t>English</w:t>
+      </w:r>
+      <w:r>
+        <w:rPr>
+          <w:lang w:val="en-GB"/>
+        </w:rPr>
+        <w:t xml:space="preserve"> is not a grammatically gendered language. Most nouns do not belong to noun</w:t>
+      </w:r>
+      <w:r>
+        <w:rPr>
+          <w:lang w:val="en-GB"/>
+        </w:rPr>
+        <w:t xml:space="preserve">-gender classes like masculine/feminine/neuter and words around the noun do not usually change form to match such a class, the way a gender-inflected language such as German does. </w:t>
+      </w:r>
+      <w:r>
+        <w:rPr>
+          <w:lang w:val="en-GB"/>
+        </w:rPr>
+        <w:t xml:space="preserve">Take for example “the doctor”. From that alone you are not able to assign a specific gender to the person. However, in German it would be “der </w:t>
+      </w:r>
+      <w:proofErr w:type="spellStart"/>
+      <w:r>
+        <w:rPr>
+          <w:lang w:val="en-GB"/>
+        </w:rPr>
+        <w:t>Arzt</w:t>
+      </w:r>
+      <w:proofErr w:type="spellEnd"/>
+      <w:r>
+        <w:rPr>
+          <w:lang w:val="en-GB"/>
+        </w:rPr>
+        <w:t xml:space="preserve">” for males and “die </w:t>
+      </w:r>
+      <w:proofErr w:type="spellStart"/>
+      <w:r>
+        <w:rPr>
+          <w:lang w:val="en-GB"/>
+        </w:rPr>
+        <w:t>Ärztin</w:t>
+      </w:r>
+      <w:proofErr w:type="spellEnd"/>
+      <w:r>
+        <w:rPr>
+          <w:lang w:val="en-GB"/>
+        </w:rPr>
+        <w:t xml:space="preserve">” for females. </w:t>
+      </w:r>
+      <w:r>
+        <w:rPr>
+          <w:lang w:val="en-GB"/>
+        </w:rPr>
+        <w:t>When it comes to nouns that refer to people</w:t>
+      </w:r>
+      <w:r>
+        <w:rPr>
+          <w:lang w:val="en-GB"/>
+        </w:rPr>
+        <w:t xml:space="preserve">, while both male and female terms exist, the standard gender used is </w:t>
+      </w:r>
+      <w:r>
+        <w:rPr>
+          <w:lang w:val="en-GB"/>
+        </w:rPr>
+        <w:t>most often</w:t>
+      </w:r>
+      <w:r>
+        <w:rPr>
+          <w:lang w:val="en-GB"/>
+        </w:rPr>
+        <w:t xml:space="preserve"> masculine</w:t>
+      </w:r>
+      <w:r>
+        <w:rPr>
+          <w:lang w:val="en-GB"/>
+        </w:rPr>
+        <w:t>. This also can be seen when referring to groups of people.</w:t>
+      </w:r>
+      <w:r>
+        <w:rPr>
+          <w:lang w:val="en-GB"/>
+        </w:rPr>
+        <w:t xml:space="preserve"> </w:t>
+      </w:r>
+      <w:r>
+        <w:rPr>
+          <w:lang w:val="en-GB"/>
+        </w:rPr>
+        <w:t>When the gender is unknown or the group is mixed the generic masculine is used.</w:t>
+      </w:r>
+      <w:bookmarkStart w:id="5" w:name="_GoBack"/>
+      <w:bookmarkEnd w:id="5"/>
+    </w:p>
+    <w:p>
+      <w:pPr>
+        <w:spacing w:line="360" w:lineRule="auto"/>
+        <w:jc w:val="both"/>
+        <w:rPr>
+          <w:lang w:val="en-GB"/>
+        </w:rPr>
+      </w:pPr>
+      <w:r>
+        <w:rPr>
+          <w:lang w:val="en-GB"/>
+        </w:rPr>
+        <w:t>In</w:t>
+      </w:r>
+      <w:r>
+        <w:rPr>
+          <w:lang w:val="en-GB"/>
+        </w:rPr>
+        <w:t xml:space="preserve"> their 2015 paper looking at self-report bias</w:t>
+      </w:r>
+      <w:r>
+        <w:rPr>
+          <w:lang w:val="en-GB"/>
+        </w:rPr>
+        <w:t xml:space="preserve"> in psychological studies, </w:t>
+      </w:r>
+      <w:proofErr w:type="spellStart"/>
+      <w:r>
+        <w:rPr>
+          <w:lang w:val="en-GB"/>
+        </w:rPr>
+        <w:t>Vainapel</w:t>
+      </w:r>
+      <w:proofErr w:type="spellEnd"/>
+      <w:r>
+        <w:rPr>
+          <w:lang w:val="en-GB"/>
+        </w:rPr>
+        <w:t xml:space="preserve"> et. Al</w:t>
+      </w:r>
+      <w:r>
+        <w:rPr>
+          <w:lang w:val="en-GB"/>
+        </w:rPr>
+        <w:t xml:space="preserve"> found that the use of the generic masculine in questionnaires affected women’s response</w:t>
+      </w:r>
+      <w:r>
+        <w:rPr>
+          <w:lang w:val="en-GB"/>
+        </w:rPr>
+        <w:t>s</w:t>
+      </w:r>
+    </w:p>
+    <w:p>
+      <w:pPr>
+        <w:spacing w:line="360" w:lineRule="auto"/>
+        <w:jc w:val="both"/>
+        <w:rPr>
+          <w:lang w:val="en-GB"/>
+        </w:rPr>
+      </w:pPr>
+      <w:r>
+        <w:rPr>
+          <w:lang w:val="en-GB"/>
+        </w:rPr>
+        <w:tab/>
+      </w:r>
+      <w:r>
+        <w:rPr>
+          <w:lang w:val="de-DE"/>
+        </w:rPr>
+        <w:t>(</w:t>
+      </w:r>
+      <w:proofErr w:type="spellStart"/>
+      <w:r>
+        <w:rPr>
+          <w:lang w:val="de-DE"/>
+        </w:rPr>
+        <w:t>Vainapel</w:t>
+      </w:r>
+      <w:proofErr w:type="spellEnd"/>
+      <w:r>
+        <w:rPr>
+          <w:lang w:val="de-DE"/>
+        </w:rPr>
+        <w:t xml:space="preserve">, S., </w:t>
+      </w:r>
+      <w:proofErr w:type="spellStart"/>
+      <w:r>
+        <w:rPr>
+          <w:lang w:val="de-DE"/>
+        </w:rPr>
+        <w:t>Shamir</w:t>
+      </w:r>
+      <w:proofErr w:type="spellEnd"/>
+      <w:r>
+        <w:rPr>
+          <w:lang w:val="de-DE"/>
+        </w:rPr>
+        <w:t xml:space="preserve">, O. Y., </w:t>
+      </w:r>
+      <w:proofErr w:type="spellStart"/>
+      <w:r>
+        <w:rPr>
+          <w:lang w:val="de-DE"/>
+        </w:rPr>
+        <w:t>Tenenbaum</w:t>
+      </w:r>
+      <w:proofErr w:type="spellEnd"/>
+      <w:r>
+        <w:rPr>
+          <w:lang w:val="de-DE"/>
+        </w:rPr>
+        <w:t xml:space="preserve">, Y., &amp; </w:t>
+      </w:r>
+      <w:proofErr w:type="spellStart"/>
+      <w:r>
+        <w:rPr>
+          <w:lang w:val="de-DE"/>
+        </w:rPr>
+        <w:t>Gilam</w:t>
+      </w:r>
+      <w:proofErr w:type="spellEnd"/>
+      <w:r>
+        <w:rPr>
+          <w:lang w:val="de-DE"/>
+        </w:rPr>
+        <w:t xml:space="preserve">, G. (2015). </w:t>
+      </w:r>
+      <w:r>
+        <w:rPr>
+          <w:lang w:val="en-GB"/>
+        </w:rPr>
+        <w:t xml:space="preserve">The dark side of gendered language: The masculine-generic form as a cause for self-report bias. Psychological Assessment, 27(4), 1513–1519. </w:t>
       </w:r>
       <w:hyperlink r:id="rId15" w:history="1">
         <w:r>
@@ -3263,35 +3524,66 @@
             <w:rStyle w:val="Hyperlink"/>
             <w:lang w:val="en-GB"/>
           </w:rPr>
-          <w:t>https://link.springer.com/c</w:t>
+          <w:t>https://doi.org/10.1037/pas0000156</w:t>
         </w:r>
+      </w:hyperlink>
+      <w:r>
+        <w:rPr>
+          <w:lang w:val="en-GB"/>
+        </w:rPr>
+        <w:t xml:space="preserve"> )</w:t>
+      </w:r>
+    </w:p>
+    <w:p>
+      <w:pPr>
+        <w:spacing w:line="360" w:lineRule="auto"/>
+        <w:jc w:val="both"/>
+        <w:rPr>
+          <w:lang w:val="en-GB"/>
+        </w:rPr>
+      </w:pPr>
+    </w:p>
+    <w:p>
+      <w:pPr>
+        <w:spacing w:line="360" w:lineRule="auto"/>
+        <w:jc w:val="both"/>
+        <w:rPr>
+          <w:lang w:val="en-GB"/>
+        </w:rPr>
+      </w:pPr>
+      <w:r>
+        <w:rPr>
+          <w:lang w:val="en-GB"/>
+        </w:rPr>
+        <w:t>Why does grammatical gender matter?</w:t>
+      </w:r>
+    </w:p>
+    <w:p>
+      <w:pPr>
+        <w:spacing w:line="360" w:lineRule="auto"/>
+        <w:rPr>
+          <w:lang w:val="en-GB"/>
+        </w:rPr>
+      </w:pPr>
+      <w:r>
+        <w:rPr>
+          <w:lang w:val="en-GB"/>
+        </w:rPr>
+        <w:t>Discussions surrounding the generic masculine</w:t>
+      </w:r>
+      <w:r>
+        <w:rPr>
+          <w:lang w:val="en-GB"/>
+        </w:rPr>
+        <w:br/>
+      </w:r>
+      <w:hyperlink r:id="rId16" w:history="1">
         <w:r>
           <w:rPr>
             <w:rStyle w:val="Hyperlink"/>
             <w:lang w:val="en-GB"/>
           </w:rPr>
-          <w:t>h</w:t>
-        </w:r>
-        <w:r>
-          <w:rPr>
-            <w:rStyle w:val="Hyperlink"/>
-            <w:lang w:val="en-GB"/>
-          </w:rPr>
-          <w:t>apter/10.1007</w:t>
-        </w:r>
-        <w:r>
-          <w:rPr>
-            <w:rStyle w:val="Hyperlink"/>
-            <w:lang w:val="en-GB"/>
-          </w:rPr>
-          <w:t>/</w:t>
-        </w:r>
-        <w:r>
-          <w:rPr>
-            <w:rStyle w:val="Hyperlink"/>
-            <w:lang w:val="en-GB"/>
-          </w:rPr>
-          <w:t>978-3-322-83937-4_4</w:t>
+          <w:t>https://link.springer.com/chapter/10.1007/978-3-322-83937-4_4</w:t>
         </w:r>
       </w:hyperlink>
     </w:p>
@@ -3306,19 +3598,8 @@
         <w:rPr>
           <w:lang w:val="en-GB"/>
         </w:rPr>
-        <w:t xml:space="preserve">Gender </w:t>
-      </w:r>
-      <w:r>
-        <w:rPr>
-          <w:lang w:val="en-GB"/>
-        </w:rPr>
-        <w:t xml:space="preserve">language </w:t>
-      </w:r>
-      <w:r>
-        <w:rPr>
-          <w:lang w:val="en-GB"/>
-        </w:rPr>
-        <w:t>Survey:</w:t>
+        <w:lastRenderedPageBreak/>
+        <w:t>Gender language Survey:</w:t>
       </w:r>
       <w:r>
         <w:rPr>
@@ -3326,7 +3607,7 @@
         </w:rPr>
         <w:br/>
       </w:r>
-      <w:hyperlink r:id="rId16" w:history="1">
+      <w:hyperlink r:id="rId17" w:history="1">
         <w:r>
           <w:rPr>
             <w:rStyle w:val="Hyperlink"/>
@@ -3355,7 +3636,7 @@
         </w:rPr>
         <w:br/>
       </w:r>
-      <w:hyperlink r:id="rId17" w:history="1">
+      <w:hyperlink r:id="rId18" w:history="1">
         <w:r>
           <w:rPr>
             <w:rStyle w:val="Hyperlink"/>
@@ -3376,15 +3657,9 @@
         <w:rPr>
           <w:lang w:val="en-GB"/>
         </w:rPr>
-        <w:t xml:space="preserve">Study to the star form: </w:t>
-      </w:r>
-      <w:r>
-        <w:rPr>
-          <w:lang w:val="en-GB"/>
-        </w:rPr>
-        <w:t xml:space="preserve">Friedrich et al. (2021) </w:t>
-      </w:r>
-      <w:hyperlink r:id="rId18" w:history="1">
+        <w:t xml:space="preserve">Study to the star form: Friedrich et al. (2021) </w:t>
+      </w:r>
+      <w:hyperlink r:id="rId19" w:history="1">
         <w:r>
           <w:rPr>
             <w:rStyle w:val="Hyperlink"/>
@@ -3413,7 +3688,7 @@
         </w:rPr>
         <w:t>A “two-sentence study” on the glottal stop and spoken gender-inclusive language: Körner et al. (2024)</w:t>
       </w:r>
-      <w:hyperlink r:id="rId19" w:history="1">
+      <w:hyperlink r:id="rId20" w:history="1">
         <w:r>
           <w:rPr>
             <w:rStyle w:val="Hyperlink"/>
@@ -3442,13 +3717,21 @@
         </w:rPr>
         <w:t xml:space="preserve"> </w:t>
       </w:r>
-      <w:r>
-        <w:rPr>
-          <w:lang w:val="en-GB"/>
-        </w:rPr>
-        <w:t xml:space="preserve">Ferstl (2023) </w:t>
-      </w:r>
-      <w:hyperlink r:id="rId20" w:history="1">
+      <w:proofErr w:type="spellStart"/>
+      <w:r>
+        <w:rPr>
+          <w:lang w:val="en-GB"/>
+        </w:rPr>
+        <w:t>Ferstl</w:t>
+      </w:r>
+      <w:proofErr w:type="spellEnd"/>
+      <w:r>
+        <w:rPr>
+          <w:lang w:val="en-GB"/>
+        </w:rPr>
+        <w:t xml:space="preserve"> (2023) </w:t>
+      </w:r>
+      <w:hyperlink r:id="rId21" w:history="1">
         <w:r>
           <w:rPr>
             <w:rStyle w:val="Hyperlink"/>
@@ -3485,7 +3768,7 @@
         </w:rPr>
         <w:t xml:space="preserve"> (2010)</w:t>
       </w:r>
-      <w:hyperlink r:id="rId21" w:history="1">
+      <w:hyperlink r:id="rId22" w:history="1">
         <w:r>
           <w:rPr>
             <w:rStyle w:val="Hyperlink"/>
@@ -3595,12 +3878,11 @@
           <w:lang w:val="en-GB"/>
         </w:rPr>
       </w:pPr>
-      <w:bookmarkStart w:id="5" w:name="_Toc235728785"/>
-      <w:r>
-        <w:rPr>
-          <w:lang w:val="en-GB"/>
-        </w:rPr>
-        <w:lastRenderedPageBreak/>
+      <w:bookmarkStart w:id="6" w:name="_Toc235728785"/>
+      <w:r>
+        <w:rPr>
+          <w:lang w:val="en-GB"/>
+        </w:rPr>
         <w:t>1.2 Motivation</w:t>
       </w:r>
       <w:r>
@@ -3616,7 +3898,7 @@
         </w:rPr>
         <w:t>(Aylina)</w:t>
       </w:r>
-      <w:bookmarkEnd w:id="5"/>
+      <w:bookmarkEnd w:id="6"/>
     </w:p>
     <w:p>
       <w:pPr>
@@ -3686,11 +3968,12 @@
           <w:lang w:val="en-GB"/>
         </w:rPr>
       </w:pPr>
-      <w:bookmarkStart w:id="6" w:name="_Toc235728786"/>
-      <w:r>
-        <w:rPr>
-          <w:lang w:val="en-GB"/>
-        </w:rPr>
+      <w:bookmarkStart w:id="7" w:name="_Toc235728786"/>
+      <w:r>
+        <w:rPr>
+          <w:lang w:val="en-GB"/>
+        </w:rPr>
+        <w:lastRenderedPageBreak/>
         <w:t>1.3 Research Question</w:t>
       </w:r>
       <w:r>
@@ -3706,7 +3989,7 @@
         </w:rPr>
         <w:t>(Aylina)</w:t>
       </w:r>
-      <w:bookmarkEnd w:id="6"/>
+      <w:bookmarkEnd w:id="7"/>
     </w:p>
     <w:p>
       <w:pPr>
@@ -3731,7 +4014,7 @@
           <w:lang w:val="en-GB"/>
         </w:rPr>
       </w:pPr>
-      <w:bookmarkStart w:id="7" w:name="_Toc235728787"/>
+      <w:bookmarkStart w:id="8" w:name="_Toc235728787"/>
       <w:r>
         <w:rPr>
           <w:lang w:val="en-GB"/>
@@ -3753,7 +4036,7 @@
         </w:rPr>
         <w:t>(Aylina)</w:t>
       </w:r>
-      <w:bookmarkEnd w:id="7"/>
+      <w:bookmarkEnd w:id="8"/>
     </w:p>
     <w:p>
       <w:pPr>
@@ -3808,7 +4091,7 @@
           <w:lang w:val="en-GB"/>
         </w:rPr>
       </w:pPr>
-      <w:bookmarkStart w:id="8" w:name="_Toc235728788"/>
+      <w:bookmarkStart w:id="9" w:name="_Toc235728788"/>
       <w:r>
         <w:rPr>
           <w:lang w:val="en-GB"/>
@@ -3848,7 +4131,7 @@
         </w:rPr>
         <w:t>(Aylina)</w:t>
       </w:r>
-      <w:bookmarkEnd w:id="8"/>
+      <w:bookmarkEnd w:id="9"/>
     </w:p>
     <w:p>
       <w:pPr>
@@ -3931,7 +4214,6 @@
         <w:t xml:space="preserve"> (e.g. </w:t>
       </w:r>
       <w:proofErr w:type="spellStart"/>
-      <w:proofErr w:type="gramStart"/>
       <w:r>
         <w:rPr>
           <w:lang w:val="en-GB"/>
@@ -3939,7 +4221,6 @@
         <w:t>Student:innen</w:t>
       </w:r>
       <w:proofErr w:type="spellEnd"/>
-      <w:proofErr w:type="gramEnd"/>
       <w:r>
         <w:rPr>
           <w:lang w:val="en-GB"/>
@@ -4041,7 +4322,7 @@
           <w:lang w:val="en-GB"/>
         </w:rPr>
       </w:pPr>
-      <w:bookmarkStart w:id="9" w:name="_Toc235728789"/>
+      <w:bookmarkStart w:id="10" w:name="_Toc235728789"/>
       <w:r>
         <w:rPr>
           <w:lang w:val="en-GB"/>
@@ -4081,7 +4362,7 @@
         </w:rPr>
         <w:t>(Aylina)</w:t>
       </w:r>
-      <w:bookmarkEnd w:id="9"/>
+      <w:bookmarkEnd w:id="10"/>
     </w:p>
     <w:p>
       <w:pPr>
@@ -4146,21 +4427,7 @@
         <w:rPr>
           <w:lang w:val="en-GB"/>
         </w:rPr>
-        <w:t>start time</w:t>
-      </w:r>
-      <w:proofErr w:type="gramStart"/>
-      <w:r>
-        <w:rPr>
-          <w:lang w:val="en-GB"/>
-        </w:rPr>
-        <w:t>):fixation</w:t>
-      </w:r>
-      <w:proofErr w:type="gramEnd"/>
-      <w:r>
-        <w:rPr>
-          <w:lang w:val="en-GB"/>
-        </w:rPr>
-        <w:t xml:space="preserve"> duration on role </w:t>
+        <w:t xml:space="preserve">start time):fixation duration on role </w:t>
       </w:r>
       <w:proofErr w:type="spellStart"/>
       <w:r>
@@ -4248,7 +4515,7 @@
           <w:lang w:val="en-GB"/>
         </w:rPr>
       </w:pPr>
-      <w:bookmarkStart w:id="10" w:name="_Toc235728790"/>
+      <w:bookmarkStart w:id="11" w:name="_Toc235728790"/>
       <w:r>
         <w:rPr>
           <w:lang w:val="en-GB"/>
@@ -4261,7 +4528,7 @@
         </w:rPr>
         <w:t xml:space="preserve"> (Sophie)</w:t>
       </w:r>
-      <w:bookmarkEnd w:id="10"/>
+      <w:bookmarkEnd w:id="11"/>
     </w:p>
     <w:p>
       <w:pPr>
@@ -4270,7 +4537,7 @@
           <w:lang w:val="en-GB"/>
         </w:rPr>
       </w:pPr>
-      <w:bookmarkStart w:id="11" w:name="_Toc235728791"/>
+      <w:bookmarkStart w:id="12" w:name="_Toc235728791"/>
       <w:r>
         <w:rPr>
           <w:lang w:val="en-GB"/>
@@ -4283,7 +4550,7 @@
         </w:rPr>
         <w:t xml:space="preserve"> (Sophie)</w:t>
       </w:r>
-      <w:bookmarkEnd w:id="11"/>
+      <w:bookmarkEnd w:id="12"/>
     </w:p>
     <w:p>
       <w:pPr>
@@ -4321,7 +4588,7 @@
           <w:lang w:val="en-GB"/>
         </w:rPr>
       </w:pPr>
-      <w:bookmarkStart w:id="12" w:name="_Toc235728792"/>
+      <w:bookmarkStart w:id="13" w:name="_Toc235728792"/>
       <w:r>
         <w:rPr>
           <w:lang w:val="en-GB"/>
@@ -4334,7 +4601,7 @@
         </w:rPr>
         <w:t xml:space="preserve"> (Sophie)</w:t>
       </w:r>
-      <w:bookmarkEnd w:id="12"/>
+      <w:bookmarkEnd w:id="13"/>
     </w:p>
     <w:p>
       <w:pPr>
@@ -4450,21 +4717,7 @@
         <w:rPr>
           <w:lang w:val="en-GB"/>
         </w:rPr>
-        <w:t xml:space="preserve"> conditions </w:t>
-      </w:r>
-      <w:proofErr w:type="gramStart"/>
-      <w:r>
-        <w:rPr>
-          <w:lang w:val="en-GB"/>
-        </w:rPr>
-        <w:t>and also</w:t>
-      </w:r>
-      <w:proofErr w:type="gramEnd"/>
-      <w:r>
-        <w:rPr>
-          <w:lang w:val="en-GB"/>
-        </w:rPr>
-        <w:t xml:space="preserve"> the </w:t>
+        <w:t xml:space="preserve"> conditions and also the </w:t>
       </w:r>
       <w:proofErr w:type="gramStart"/>
       <w:r>
@@ -8173,7 +8426,7 @@
           <w:lang w:val="en-GB"/>
         </w:rPr>
       </w:pPr>
-      <w:bookmarkStart w:id="13" w:name="_Toc235728793"/>
+      <w:bookmarkStart w:id="14" w:name="_Toc235728793"/>
       <w:r>
         <w:rPr>
           <w:lang w:val="en-GB"/>
@@ -8198,7 +8451,7 @@
         </w:rPr>
         <w:t xml:space="preserve"> (Sophie)</w:t>
       </w:r>
-      <w:bookmarkEnd w:id="13"/>
+      <w:bookmarkEnd w:id="14"/>
     </w:p>
     <w:p>
       <w:pPr>
@@ -8209,7 +8462,7 @@
           <w:lang w:val="en-GB"/>
         </w:rPr>
       </w:pPr>
-      <w:bookmarkStart w:id="14" w:name="_Toc235728794"/>
+      <w:bookmarkStart w:id="15" w:name="_Toc235728794"/>
       <w:r>
         <w:rPr>
           <w:lang w:val="en-GB"/>
@@ -8222,7 +8475,7 @@
         </w:rPr>
         <w:t xml:space="preserve"> (Sophie)</w:t>
       </w:r>
-      <w:bookmarkEnd w:id="14"/>
+      <w:bookmarkEnd w:id="15"/>
     </w:p>
     <w:p>
       <w:pPr>
@@ -8233,7 +8486,7 @@
           <w:lang w:val="en-GB"/>
         </w:rPr>
       </w:pPr>
-      <w:bookmarkStart w:id="15" w:name="_Toc235728795"/>
+      <w:bookmarkStart w:id="16" w:name="_Toc235728795"/>
       <w:r>
         <w:rPr>
           <w:lang w:val="en-GB"/>
@@ -8258,7 +8511,7 @@
         </w:rPr>
         <w:t>(Sophie)</w:t>
       </w:r>
-      <w:bookmarkEnd w:id="15"/>
+      <w:bookmarkEnd w:id="16"/>
     </w:p>
     <w:p>
       <w:pPr>
@@ -8333,24 +8586,9 @@
           <w:lang w:val="en-GB"/>
         </w:rPr>
         <w:lastRenderedPageBreak/>
-        <w:t xml:space="preserve">their answer. As it is only a question to </w:t>
-      </w:r>
-      <w:proofErr w:type="gramStart"/>
-      <w:r>
-        <w:rPr>
-          <w:lang w:val="en-GB"/>
-        </w:rPr>
-        <w:t>make sure</w:t>
-      </w:r>
-      <w:proofErr w:type="gramEnd"/>
-      <w:r>
-        <w:rPr>
-          <w:lang w:val="en-GB"/>
-        </w:rPr>
-        <w:t xml:space="preserve"> they really read the sentences </w:t>
+        <w:t xml:space="preserve">their answer. As it is only a question to make sure they really read the sentences </w:t>
       </w:r>
       <w:proofErr w:type="spellStart"/>
-      <w:proofErr w:type="gramStart"/>
       <w:r>
         <w:rPr>
           <w:lang w:val="en-GB"/>
@@ -8358,7 +8596,6 @@
         <w:t>its</w:t>
       </w:r>
       <w:proofErr w:type="spellEnd"/>
-      <w:proofErr w:type="gramEnd"/>
       <w:r>
         <w:rPr>
           <w:lang w:val="en-GB"/>
@@ -8407,7 +8644,6 @@
         <w:t xml:space="preserve"> questions we use a scale from 1 to 5 where 1 means low and 5 means high. The first question is about the participants usage of gender inclusive language in spoken and in written language. We ask this question to see if the participants that uses often gender inclusive language also has a better processing time of written gender inclusive language compared to male and female forms. Or if there is no correlation. Then we ask how often they notice gender inclusive language in spoken and written language also to see if there is correlation. After that we ask about their standing about gender inclusive language to see if that has a correlation. People often have a strong standing for or against gender inclusive language and one of the reasons from people that are against it is that </w:t>
       </w:r>
       <w:proofErr w:type="spellStart"/>
-      <w:proofErr w:type="gramStart"/>
       <w:r>
         <w:rPr>
           <w:lang w:val="en-GB"/>
@@ -8415,7 +8651,6 @@
         <w:t>its</w:t>
       </w:r>
       <w:proofErr w:type="spellEnd"/>
-      <w:proofErr w:type="gramEnd"/>
       <w:r>
         <w:rPr>
           <w:lang w:val="en-GB"/>
@@ -8434,21 +8669,7 @@
         <w:rPr>
           <w:lang w:val="en-GB"/>
         </w:rPr>
-        <w:t xml:space="preserve"> with gender inclusive language so it would be interesting to see if that is only the case for participants that are against gender inclusive language or maybe has nothing to do with. Then we ask about their political spectrum since parties often have a specific stance on gender inclusive language. Then as last question we ask at what point they first </w:t>
-      </w:r>
-      <w:proofErr w:type="gramStart"/>
-      <w:r>
-        <w:rPr>
-          <w:lang w:val="en-GB"/>
-        </w:rPr>
-        <w:t>came into contact with</w:t>
-      </w:r>
-      <w:proofErr w:type="gramEnd"/>
-      <w:r>
-        <w:rPr>
-          <w:lang w:val="en-GB"/>
-        </w:rPr>
-        <w:t xml:space="preserve"> gender inclusive language to determine a connection between processing time and the point in time when they first confronted with gender inclusive.  </w:t>
+        <w:t xml:space="preserve"> with gender inclusive language so it would be interesting to see if that is only the case for participants that are against gender inclusive language or maybe has nothing to do with. Then we ask about their political spectrum since parties often have a specific stance on gender inclusive language. Then as last question we ask at what point they first came into contact with gender inclusive language to determine a connection between processing time and the point in time when they first confronted with gender inclusive.  </w:t>
       </w:r>
     </w:p>
     <w:p>
@@ -8472,7 +8693,7 @@
           <w:lang w:val="en-GB"/>
         </w:rPr>
       </w:pPr>
-      <w:bookmarkStart w:id="16" w:name="_Toc235728796"/>
+      <w:bookmarkStart w:id="17" w:name="_Toc235728796"/>
       <w:r>
         <w:rPr>
           <w:lang w:val="en-GB"/>
@@ -8497,7 +8718,7 @@
         </w:rPr>
         <w:t xml:space="preserve"> (Sophie)</w:t>
       </w:r>
-      <w:bookmarkEnd w:id="16"/>
+      <w:bookmarkEnd w:id="17"/>
     </w:p>
     <w:p>
       <w:pPr>
@@ -8597,21 +8818,7 @@
         <w:rPr>
           <w:lang w:val="en-GB"/>
         </w:rPr>
-        <w:t xml:space="preserve"> that all variables indeed didn’t </w:t>
-      </w:r>
-      <w:proofErr w:type="gramStart"/>
-      <w:r>
-        <w:rPr>
-          <w:lang w:val="en-GB"/>
-        </w:rPr>
-        <w:t>got</w:t>
-      </w:r>
-      <w:proofErr w:type="gramEnd"/>
-      <w:r>
-        <w:rPr>
-          <w:lang w:val="en-GB"/>
-        </w:rPr>
-        <w:t xml:space="preserve"> logged. And a lot of these variables must be logged like the position from anaphor, role noun and the spillover region is very important. We also tested the Open Sesame file from the pilot and got the same warning even though it didn’t appear during the pilot where everything was working as intended. </w:t>
+        <w:t xml:space="preserve"> that all variables indeed didn’t got logged. And a lot of these variables must be logged like the position from anaphor, role noun and the spillover region is very important. We also tested the Open Sesame file from the pilot and got the same warning even though it didn’t appear during the pilot where everything was working as intended. </w:t>
       </w:r>
       <w:r>
         <w:rPr>
@@ -8628,7 +8835,7 @@
           <w:lang w:val="en-GB"/>
         </w:rPr>
       </w:pPr>
-      <w:bookmarkStart w:id="17" w:name="_Toc235728797"/>
+      <w:bookmarkStart w:id="18" w:name="_Toc235728797"/>
       <w:r>
         <w:rPr>
           <w:lang w:val="en-GB"/>
@@ -8655,7 +8862,7 @@
         </w:rPr>
         <w:t>)</w:t>
       </w:r>
-      <w:bookmarkEnd w:id="17"/>
+      <w:bookmarkEnd w:id="18"/>
     </w:p>
     <w:p>
       <w:pPr>
@@ -8664,13 +8871,21 @@
           <w:lang w:val="en-GB"/>
         </w:rPr>
       </w:pPr>
-      <w:bookmarkStart w:id="18" w:name="_Toc235728798"/>
-      <w:r>
-        <w:rPr>
-          <w:lang w:val="en-GB"/>
-        </w:rPr>
-        <w:t>3.1 Preprocessing</w:t>
-      </w:r>
+      <w:bookmarkStart w:id="19" w:name="_Toc235728798"/>
+      <w:r>
+        <w:rPr>
+          <w:lang w:val="en-GB"/>
+        </w:rPr>
+        <w:t xml:space="preserve">3.1 </w:t>
+      </w:r>
+      <w:proofErr w:type="spellStart"/>
+      <w:r>
+        <w:rPr>
+          <w:lang w:val="en-GB"/>
+        </w:rPr>
+        <w:t>Preprocessing</w:t>
+      </w:r>
+      <w:proofErr w:type="spellEnd"/>
       <w:r>
         <w:rPr>
           <w:lang w:val="en-GB"/>
@@ -8691,7 +8906,7 @@
         </w:rPr>
         <w:t>)</w:t>
       </w:r>
-      <w:bookmarkEnd w:id="18"/>
+      <w:bookmarkEnd w:id="19"/>
     </w:p>
     <w:p>
       <w:pPr>
@@ -9006,11 +9221,19 @@
           <w:lang w:val="de-DE"/>
         </w:rPr>
       </w:pPr>
+      <w:proofErr w:type="spellStart"/>
       <w:r>
         <w:rPr>
           <w:lang w:val="de-DE"/>
         </w:rPr>
-        <w:t xml:space="preserve">Role </w:t>
+        <w:t>Role</w:t>
+      </w:r>
+      <w:proofErr w:type="spellEnd"/>
+      <w:r>
+        <w:rPr>
+          <w:lang w:val="de-DE"/>
+        </w:rPr>
+        <w:t xml:space="preserve"> </w:t>
       </w:r>
       <w:proofErr w:type="spellStart"/>
       <w:r>
@@ -9074,7 +9297,7 @@
       <w:pPr>
         <w:pStyle w:val="berschrift2"/>
       </w:pPr>
-      <w:bookmarkStart w:id="19" w:name="_Toc235728799"/>
+      <w:bookmarkStart w:id="20" w:name="_Toc235728799"/>
       <w:r>
         <w:t xml:space="preserve">3.2 </w:t>
       </w:r>
@@ -9100,7 +9323,7 @@
         </w:rPr>
         <w:t>(Aylina)</w:t>
       </w:r>
-      <w:bookmarkEnd w:id="19"/>
+      <w:bookmarkEnd w:id="20"/>
     </w:p>
     <w:tbl>
       <w:tblPr>
@@ -9295,18 +9518,38 @@
                 <w:lang w:val="de-DE"/>
               </w:rPr>
             </w:pPr>
-            <w:proofErr w:type="gramStart"/>
             <w:r>
               <w:rPr>
                 <w:lang w:val="de-DE"/>
               </w:rPr>
-              <w:t>Fastest</w:t>
-            </w:r>
-            <w:proofErr w:type="gramEnd"/>
+              <w:t xml:space="preserve">Fastest </w:t>
+            </w:r>
+            <w:proofErr w:type="spellStart"/>
             <w:r>
               <w:rPr>
                 <w:lang w:val="de-DE"/>
               </w:rPr>
+              <w:t>processing</w:t>
+            </w:r>
+            <w:proofErr w:type="spellEnd"/>
+            <w:r>
+              <w:rPr>
+                <w:lang w:val="de-DE"/>
+              </w:rPr>
+              <w:t xml:space="preserve"> (</w:t>
+            </w:r>
+            <w:proofErr w:type="spellStart"/>
+            <w:r>
+              <w:rPr>
+                <w:lang w:val="de-DE"/>
+              </w:rPr>
+              <w:t>gender</w:t>
+            </w:r>
+            <w:proofErr w:type="spellEnd"/>
+            <w:r>
+              <w:rPr>
+                <w:lang w:val="de-DE"/>
+              </w:rPr>
               <w:t xml:space="preserve"> </w:t>
             </w:r>
             <w:proofErr w:type="spellStart"/>
@@ -9314,28 +9557,14 @@
               <w:rPr>
                 <w:lang w:val="de-DE"/>
               </w:rPr>
-              <w:t>processing</w:t>
+              <w:t>match</w:t>
             </w:r>
             <w:proofErr w:type="spellEnd"/>
             <w:r>
               <w:rPr>
                 <w:lang w:val="de-DE"/>
               </w:rPr>
-              <w:t xml:space="preserve"> (</w:t>
-            </w:r>
-            <w:proofErr w:type="spellStart"/>
-            <w:r>
-              <w:rPr>
-                <w:lang w:val="de-DE"/>
-              </w:rPr>
-              <w:t>gender</w:t>
-            </w:r>
-            <w:proofErr w:type="spellEnd"/>
-            <w:r>
-              <w:rPr>
-                <w:lang w:val="de-DE"/>
-              </w:rPr>
-              <w:t xml:space="preserve"> match)</w:t>
+              <w:t>)</w:t>
             </w:r>
           </w:p>
         </w:tc>
@@ -9491,18 +9720,38 @@
                 <w:lang w:val="de-DE"/>
               </w:rPr>
             </w:pPr>
-            <w:proofErr w:type="gramStart"/>
             <w:r>
               <w:rPr>
                 <w:lang w:val="de-DE"/>
               </w:rPr>
-              <w:t>Fastest</w:t>
-            </w:r>
-            <w:proofErr w:type="gramEnd"/>
+              <w:t xml:space="preserve">Fastest </w:t>
+            </w:r>
+            <w:proofErr w:type="spellStart"/>
             <w:r>
               <w:rPr>
                 <w:lang w:val="de-DE"/>
               </w:rPr>
+              <w:t>processing</w:t>
+            </w:r>
+            <w:proofErr w:type="spellEnd"/>
+            <w:r>
+              <w:rPr>
+                <w:lang w:val="de-DE"/>
+              </w:rPr>
+              <w:t xml:space="preserve"> (</w:t>
+            </w:r>
+            <w:proofErr w:type="spellStart"/>
+            <w:r>
+              <w:rPr>
+                <w:lang w:val="de-DE"/>
+              </w:rPr>
+              <w:t>gender</w:t>
+            </w:r>
+            <w:proofErr w:type="spellEnd"/>
+            <w:r>
+              <w:rPr>
+                <w:lang w:val="de-DE"/>
+              </w:rPr>
               <w:t xml:space="preserve"> </w:t>
             </w:r>
             <w:proofErr w:type="spellStart"/>
@@ -9510,28 +9759,14 @@
               <w:rPr>
                 <w:lang w:val="de-DE"/>
               </w:rPr>
-              <w:t>processing</w:t>
+              <w:t>match</w:t>
             </w:r>
             <w:proofErr w:type="spellEnd"/>
             <w:r>
               <w:rPr>
                 <w:lang w:val="de-DE"/>
               </w:rPr>
-              <w:t xml:space="preserve"> (</w:t>
-            </w:r>
-            <w:proofErr w:type="spellStart"/>
-            <w:r>
-              <w:rPr>
-                <w:lang w:val="de-DE"/>
-              </w:rPr>
-              <w:t>gender</w:t>
-            </w:r>
-            <w:proofErr w:type="spellEnd"/>
-            <w:r>
-              <w:rPr>
-                <w:lang w:val="de-DE"/>
-              </w:rPr>
-              <w:t xml:space="preserve"> match)</w:t>
+              <w:t>)</w:t>
             </w:r>
           </w:p>
         </w:tc>
@@ -9596,11 +9831,19 @@
                 <w:lang w:val="de-DE"/>
               </w:rPr>
             </w:pPr>
+            <w:proofErr w:type="spellStart"/>
             <w:r>
               <w:rPr>
                 <w:lang w:val="de-DE"/>
               </w:rPr>
-              <w:t xml:space="preserve">Longest </w:t>
+              <w:t>Longest</w:t>
+            </w:r>
+            <w:proofErr w:type="spellEnd"/>
+            <w:r>
+              <w:rPr>
+                <w:lang w:val="de-DE"/>
+              </w:rPr>
+              <w:t xml:space="preserve"> </w:t>
             </w:r>
             <w:proofErr w:type="spellStart"/>
             <w:proofErr w:type="gramStart"/>
@@ -9809,7 +10052,7 @@
           <w:lang w:val="en-GB"/>
         </w:rPr>
       </w:pPr>
-      <w:bookmarkStart w:id="20" w:name="_Toc235728800"/>
+      <w:bookmarkStart w:id="21" w:name="_Toc235728800"/>
       <w:r>
         <w:rPr>
           <w:lang w:val="en-GB"/>
@@ -9854,7 +10097,7 @@
         </w:rPr>
         <w:t>)</w:t>
       </w:r>
-      <w:bookmarkEnd w:id="20"/>
+      <w:bookmarkEnd w:id="21"/>
     </w:p>
     <w:p>
       <w:pPr>
@@ -9884,7 +10127,7 @@
                     </pic:cNvPicPr>
                   </pic:nvPicPr>
                   <pic:blipFill>
-                    <a:blip r:embed="rId22">
+                    <a:blip r:embed="rId23">
                       <a:extLst>
                         <a:ext uri="{28A0092B-C50C-407E-A947-70E740481C1C}">
                           <a14:useLocalDpi xmlns:a14="http://schemas.microsoft.com/office/drawing/2010/main" val="0"/>
@@ -9940,66 +10183,6 @@
                 <pic:pic xmlns:pic="http://schemas.openxmlformats.org/drawingml/2006/picture">
                   <pic:nvPicPr>
                     <pic:cNvPr id="0" name="Picture 3"/>
-                    <pic:cNvPicPr>
-                      <a:picLocks noChangeAspect="1" noChangeArrowheads="1"/>
-                    </pic:cNvPicPr>
-                  </pic:nvPicPr>
-                  <pic:blipFill>
-                    <a:blip r:embed="rId23">
-                      <a:extLst>
-                        <a:ext uri="{28A0092B-C50C-407E-A947-70E740481C1C}">
-                          <a14:useLocalDpi xmlns:a14="http://schemas.microsoft.com/office/drawing/2010/main" val="0"/>
-                        </a:ext>
-                      </a:extLst>
-                    </a:blip>
-                    <a:srcRect/>
-                    <a:stretch>
-                      <a:fillRect/>
-                    </a:stretch>
-                  </pic:blipFill>
-                  <pic:spPr bwMode="auto">
-                    <a:xfrm>
-                      <a:off x="0" y="0"/>
-                      <a:ext cx="5760720" cy="3201035"/>
-                    </a:xfrm>
-                    <a:prstGeom prst="rect">
-                      <a:avLst/>
-                    </a:prstGeom>
-                    <a:noFill/>
-                    <a:ln>
-                      <a:noFill/>
-                    </a:ln>
-                  </pic:spPr>
-                </pic:pic>
-              </a:graphicData>
-            </a:graphic>
-          </wp:inline>
-        </w:drawing>
-      </w:r>
-    </w:p>
-    <w:p>
-      <w:pPr>
-        <w:rPr>
-          <w:lang w:val="en-GB"/>
-        </w:rPr>
-      </w:pPr>
-      <w:r>
-        <w:rPr>
-          <w:noProof/>
-        </w:rPr>
-        <w:drawing>
-          <wp:inline distT="0" distB="0" distL="0" distR="0" wp14:anchorId="0C2989E3" wp14:editId="229EDD59">
-            <wp:extent cx="5760720" cy="3201035"/>
-            <wp:effectExtent l="0" t="0" r="0" b="0"/>
-            <wp:docPr id="30418028" name="Grafik 4"/>
-            <wp:cNvGraphicFramePr>
-              <a:graphicFrameLocks xmlns:a="http://schemas.openxmlformats.org/drawingml/2006/main" noChangeAspect="1"/>
-            </wp:cNvGraphicFramePr>
-            <a:graphic xmlns:a="http://schemas.openxmlformats.org/drawingml/2006/main">
-              <a:graphicData uri="http://schemas.openxmlformats.org/drawingml/2006/picture">
-                <pic:pic xmlns:pic="http://schemas.openxmlformats.org/drawingml/2006/picture">
-                  <pic:nvPicPr>
-                    <pic:cNvPr id="0" name="Picture 7"/>
                     <pic:cNvPicPr>
                       <a:picLocks noChangeAspect="1" noChangeArrowheads="1"/>
                     </pic:cNvPicPr>
@@ -10047,6 +10230,66 @@
         <w:rPr>
           <w:noProof/>
         </w:rPr>
+        <w:drawing>
+          <wp:inline distT="0" distB="0" distL="0" distR="0" wp14:anchorId="0C2989E3" wp14:editId="229EDD59">
+            <wp:extent cx="5760720" cy="3201035"/>
+            <wp:effectExtent l="0" t="0" r="0" b="0"/>
+            <wp:docPr id="30418028" name="Grafik 4"/>
+            <wp:cNvGraphicFramePr>
+              <a:graphicFrameLocks xmlns:a="http://schemas.openxmlformats.org/drawingml/2006/main" noChangeAspect="1"/>
+            </wp:cNvGraphicFramePr>
+            <a:graphic xmlns:a="http://schemas.openxmlformats.org/drawingml/2006/main">
+              <a:graphicData uri="http://schemas.openxmlformats.org/drawingml/2006/picture">
+                <pic:pic xmlns:pic="http://schemas.openxmlformats.org/drawingml/2006/picture">
+                  <pic:nvPicPr>
+                    <pic:cNvPr id="0" name="Picture 7"/>
+                    <pic:cNvPicPr>
+                      <a:picLocks noChangeAspect="1" noChangeArrowheads="1"/>
+                    </pic:cNvPicPr>
+                  </pic:nvPicPr>
+                  <pic:blipFill>
+                    <a:blip r:embed="rId25">
+                      <a:extLst>
+                        <a:ext uri="{28A0092B-C50C-407E-A947-70E740481C1C}">
+                          <a14:useLocalDpi xmlns:a14="http://schemas.microsoft.com/office/drawing/2010/main" val="0"/>
+                        </a:ext>
+                      </a:extLst>
+                    </a:blip>
+                    <a:srcRect/>
+                    <a:stretch>
+                      <a:fillRect/>
+                    </a:stretch>
+                  </pic:blipFill>
+                  <pic:spPr bwMode="auto">
+                    <a:xfrm>
+                      <a:off x="0" y="0"/>
+                      <a:ext cx="5760720" cy="3201035"/>
+                    </a:xfrm>
+                    <a:prstGeom prst="rect">
+                      <a:avLst/>
+                    </a:prstGeom>
+                    <a:noFill/>
+                    <a:ln>
+                      <a:noFill/>
+                    </a:ln>
+                  </pic:spPr>
+                </pic:pic>
+              </a:graphicData>
+            </a:graphic>
+          </wp:inline>
+        </w:drawing>
+      </w:r>
+    </w:p>
+    <w:p>
+      <w:pPr>
+        <w:rPr>
+          <w:lang w:val="en-GB"/>
+        </w:rPr>
+      </w:pPr>
+      <w:r>
+        <w:rPr>
+          <w:noProof/>
+        </w:rPr>
         <w:lastRenderedPageBreak/>
         <w:drawing>
           <wp:inline distT="0" distB="0" distL="0" distR="0" wp14:anchorId="4C512CAC" wp14:editId="3537D111">
@@ -10066,7 +10309,7 @@
                     </pic:cNvPicPr>
                   </pic:nvPicPr>
                   <pic:blipFill>
-                    <a:blip r:embed="rId25">
+                    <a:blip r:embed="rId26">
                       <a:extLst>
                         <a:ext uri="{28A0092B-C50C-407E-A947-70E740481C1C}">
                           <a14:useLocalDpi xmlns:a14="http://schemas.microsoft.com/office/drawing/2010/main" val="0"/>
@@ -10122,7 +10365,7 @@
         </w:rPr>
         <w:t> </w:t>
       </w:r>
-      <w:bookmarkStart w:id="21" w:name="_Toc235728801"/>
+      <w:bookmarkStart w:id="22" w:name="_Toc235728801"/>
       <w:r>
         <w:rPr>
           <w:lang w:val="en-GB"/>
@@ -10181,7 +10424,7 @@
         </w:rPr>
         <w:t>)</w:t>
       </w:r>
-      <w:bookmarkEnd w:id="21"/>
+      <w:bookmarkEnd w:id="22"/>
     </w:p>
     <w:p>
       <w:pPr>
@@ -10304,7 +10547,7 @@
           <w:lang w:val="en-GB"/>
         </w:rPr>
       </w:pPr>
-      <w:bookmarkStart w:id="22" w:name="_Toc235728802"/>
+      <w:bookmarkStart w:id="23" w:name="_Toc235728802"/>
       <w:r>
         <w:rPr>
           <w:lang w:val="en-GB"/>
@@ -10337,7 +10580,7 @@
         </w:rPr>
         <w:t>)</w:t>
       </w:r>
-      <w:bookmarkEnd w:id="22"/>
+      <w:bookmarkEnd w:id="23"/>
     </w:p>
     <w:p>
       <w:pPr>
@@ -10437,7 +10680,7 @@
           <w:lang w:val="en-GB"/>
         </w:rPr>
       </w:pPr>
-      <w:bookmarkStart w:id="23" w:name="_Toc235728803"/>
+      <w:bookmarkStart w:id="24" w:name="_Toc235728803"/>
       <w:r>
         <w:rPr>
           <w:lang w:val="en-GB"/>
@@ -10470,7 +10713,7 @@
         </w:rPr>
         <w:t>)</w:t>
       </w:r>
-      <w:bookmarkEnd w:id="23"/>
+      <w:bookmarkEnd w:id="24"/>
     </w:p>
     <w:p>
       <w:pPr>
@@ -10560,7 +10803,7 @@
           <w:lang w:val="en-GB"/>
         </w:rPr>
       </w:pPr>
-      <w:bookmarkStart w:id="24" w:name="_Toc235728804"/>
+      <w:bookmarkStart w:id="25" w:name="_Toc235728804"/>
       <w:r>
         <w:rPr>
           <w:lang w:val="en-GB"/>
@@ -10594,7 +10837,7 @@
         </w:rPr>
         <w:t>)</w:t>
       </w:r>
-      <w:bookmarkEnd w:id="24"/>
+      <w:bookmarkEnd w:id="25"/>
     </w:p>
     <w:p>
       <w:pPr>
@@ -10703,7 +10946,7 @@
           <w:lang w:val="en-GB"/>
         </w:rPr>
       </w:pPr>
-      <w:bookmarkStart w:id="25" w:name="_Toc235728805"/>
+      <w:bookmarkStart w:id="26" w:name="_Toc235728805"/>
       <w:r>
         <w:rPr>
           <w:lang w:val="en-GB"/>
@@ -10734,7 +10977,7 @@
         </w:rPr>
         <w:t>)</w:t>
       </w:r>
-      <w:bookmarkEnd w:id="25"/>
+      <w:bookmarkEnd w:id="26"/>
     </w:p>
     <w:p>
       <w:pPr>
@@ -10779,11 +11022,19 @@
           <w:lang w:val="de-DE"/>
         </w:rPr>
       </w:pPr>
+      <w:proofErr w:type="spellStart"/>
       <w:r>
         <w:rPr>
           <w:lang w:val="de-DE"/>
         </w:rPr>
-        <w:t xml:space="preserve">Analyze </w:t>
+        <w:t>Analyze</w:t>
+      </w:r>
+      <w:proofErr w:type="spellEnd"/>
+      <w:r>
+        <w:rPr>
+          <w:lang w:val="de-DE"/>
+        </w:rPr>
+        <w:t xml:space="preserve"> </w:t>
       </w:r>
       <w:proofErr w:type="spellStart"/>
       <w:r>
@@ -10839,14 +11090,14 @@
           <w:lang w:val="en-GB"/>
         </w:rPr>
       </w:pPr>
-      <w:bookmarkStart w:id="26" w:name="_Toc235728806"/>
+      <w:bookmarkStart w:id="27" w:name="_Toc235728806"/>
       <w:r>
         <w:rPr>
           <w:lang w:val="en-GB"/>
         </w:rPr>
         <w:t>4. Results</w:t>
       </w:r>
-      <w:bookmarkEnd w:id="26"/>
+      <w:bookmarkEnd w:id="27"/>
     </w:p>
     <w:p>
       <w:pPr>
@@ -10876,7 +11127,7 @@
           <w:lang w:val="en-GB"/>
         </w:rPr>
       </w:pPr>
-      <w:bookmarkStart w:id="27" w:name="_Toc235728807"/>
+      <w:bookmarkStart w:id="28" w:name="_Toc235728807"/>
       <w:r>
         <w:rPr>
           <w:lang w:val="en-GB"/>
@@ -10895,7 +11146,7 @@
         </w:rPr>
         <w:t xml:space="preserve"> (Aylina)</w:t>
       </w:r>
-      <w:bookmarkEnd w:id="27"/>
+      <w:bookmarkEnd w:id="28"/>
     </w:p>
     <w:p>
       <w:pPr>
@@ -10989,7 +11240,7 @@
           <w:lang w:val="en-GB"/>
         </w:rPr>
         <w:sectPr>
-          <w:footerReference w:type="default" r:id="rId26"/>
+          <w:footerReference w:type="default" r:id="rId27"/>
           <w:pgSz w:w="11906" w:h="16838"/>
           <w:pgMar w:top="1417" w:right="1417" w:bottom="1134" w:left="1417" w:header="708" w:footer="708" w:gutter="0"/>
           <w:pgNumType w:start="1"/>
@@ -11004,7 +11255,7 @@
           <w:lang w:val="en-GB"/>
         </w:rPr>
       </w:pPr>
-      <w:bookmarkStart w:id="28" w:name="_Toc235728808"/>
+      <w:bookmarkStart w:id="29" w:name="_Toc235728808"/>
       <w:r>
         <w:rPr>
           <w:lang w:val="en-GB"/>
@@ -11012,7 +11263,7 @@
         <w:lastRenderedPageBreak/>
         <w:t>Appendix</w:t>
       </w:r>
-      <w:bookmarkEnd w:id="28"/>
+      <w:bookmarkEnd w:id="29"/>
     </w:p>
     <w:p>
       <w:pPr>
@@ -11054,7 +11305,7 @@
                     <pic:cNvPicPr/>
                   </pic:nvPicPr>
                   <pic:blipFill>
-                    <a:blip r:embed="rId27"/>
+                    <a:blip r:embed="rId28"/>
                     <a:stretch>
                       <a:fillRect/>
                     </a:stretch>
@@ -11095,7 +11346,7 @@
                     <pic:cNvPicPr/>
                   </pic:nvPicPr>
                   <pic:blipFill>
-                    <a:blip r:embed="rId28"/>
+                    <a:blip r:embed="rId29"/>
                     <a:stretch>
                       <a:fillRect/>
                     </a:stretch>
@@ -11145,7 +11396,7 @@
                     <pic:cNvPicPr/>
                   </pic:nvPicPr>
                   <pic:blipFill>
-                    <a:blip r:embed="rId29"/>
+                    <a:blip r:embed="rId30"/>
                     <a:stretch>
                       <a:fillRect/>
                     </a:stretch>
@@ -11228,7 +11479,7 @@
         <w:br w:type="page"/>
       </w:r>
     </w:p>
-    <w:bookmarkStart w:id="29" w:name="_Toc235728809" w:displacedByCustomXml="next"/>
+    <w:bookmarkStart w:id="30" w:name="_Toc235728809" w:displacedByCustomXml="next"/>
     <w:sdt>
       <w:sdtPr>
         <w:rPr>
@@ -11257,7 +11508,7 @@
         </w:p>
       </w:sdtContent>
     </w:sdt>
-    <w:bookmarkEnd w:id="29" w:displacedByCustomXml="prev"/>
+    <w:bookmarkEnd w:id="30" w:displacedByCustomXml="prev"/>
     <w:p>
       <w:pPr>
         <w:tabs>
@@ -11295,7 +11546,7 @@
           <w:lang w:val="en-GB"/>
         </w:rPr>
       </w:pPr>
-      <w:bookmarkStart w:id="30" w:name="_Toc235728810"/>
+      <w:bookmarkStart w:id="31" w:name="_Toc235728810"/>
       <w:proofErr w:type="spellStart"/>
       <w:r>
         <w:rPr>
@@ -11311,7 +11562,7 @@
         </w:rPr>
         <w:t xml:space="preserve"> Table</w:t>
       </w:r>
-      <w:bookmarkEnd w:id="30"/>
+      <w:bookmarkEnd w:id="31"/>
     </w:p>
     <w:tbl>
       <w:tblPr>
@@ -12728,7 +12979,7 @@
       </w:pPr>
     </w:p>
     <w:sectPr>
-      <w:footerReference w:type="default" r:id="rId30"/>
+      <w:footerReference w:type="default" r:id="rId31"/>
       <w:pgSz w:w="11906" w:h="16838"/>
       <w:pgMar w:top="1417" w:right="1417" w:bottom="1134" w:left="1417" w:header="708" w:footer="708" w:gutter="0"/>
       <w:pgNumType w:start="4"/>
@@ -12739,7 +12990,7 @@
 </file>
 
 <file path=word/endnotes.xml><?xml version="1.0" encoding="utf-8"?>
-<w:endnotes xmlns:wpc="http://schemas.microsoft.com/office/word/2010/wordprocessingCanvas" xmlns:cx="http://schemas.microsoft.com/office/drawing/2014/chartex" xmlns:cx1="http://schemas.microsoft.com/office/drawing/2015/9/8/chartex" xmlns:cx2="http://schemas.microsoft.com/office/drawing/2015/10/21/chartex" xmlns:cx3="http://schemas.microsoft.com/office/drawing/2016/5/9/chartex" xmlns:cx4="http://schemas.microsoft.com/office/drawing/2016/5/10/chartex" xmlns:cx5="http://schemas.microsoft.com/office/drawing/2016/5/11/chartex" xmlns:cx6="http://schemas.microsoft.com/office/drawing/2016/5/12/chartex" xmlns:cx7="http://schemas.microsoft.com/office/drawing/2016/5/13/chartex" xmlns:cx8="http://schemas.microsoft.com/office/drawing/2016/5/14/chartex" xmlns:mc="http://schemas.openxmlformats.org/markup-compatibility/2006" xmlns:aink="http://schemas.microsoft.com/office/drawing/2016/ink" xmlns:am3d="http://schemas.microsoft.com/office/drawing/2017/model3d" xmlns:o="urn:schemas-microsoft-com:office:office" xmlns:oel="http://schemas.microsoft.com/office/2019/extlst" xmlns:r="http://schemas.openxmlformats.org/officeDocument/2006/relationships" xmlns:m="http://schemas.openxmlformats.org/officeDocument/2006/math" xmlns:v="urn:schemas-microsoft-com:vml" xmlns:wp14="http://schemas.microsoft.com/office/word/2010/wordprocessingDrawing" xmlns:wp="http://schemas.openxmlformats.org/drawingml/2006/wordprocessingDrawing" xmlns:w10="urn:schemas-microsoft-com:office:word" xmlns:w="http://schemas.openxmlformats.org/wordprocessingml/2006/main" xmlns:w14="http://schemas.microsoft.com/office/word/2010/wordml" xmlns:w15="http://schemas.microsoft.com/office/word/2012/wordml" xmlns:w16cex="http://schemas.microsoft.com/office/word/2018/wordml/cex" xmlns:w16cid="http://schemas.microsoft.com/office/word/2016/wordml/cid" xmlns:w16="http://schemas.microsoft.com/office/word/2018/wordml" xmlns:w16du="http://schemas.microsoft.com/office/word/2023/wordml/word16du" xmlns:w16sdtdh="http://schemas.microsoft.com/office/word/2020/wordml/sdtdatahash" xmlns:w16sdtfl="http://schemas.microsoft.com/office/word/2024/wordml/sdtformatlock" xmlns:w16se="http://schemas.microsoft.com/office/word/2015/wordml/symex" xmlns:wpg="http://schemas.microsoft.com/office/word/2010/wordprocessingGroup" xmlns:wpi="http://schemas.microsoft.com/office/word/2010/wordprocessingInk" xmlns:wne="http://schemas.microsoft.com/office/word/2006/wordml" xmlns:wps="http://schemas.microsoft.com/office/word/2010/wordprocessingShape" mc:Ignorable="w14 w15 w16se w16cid w16 w16cex w16sdtdh w16sdtfl w16du wp14">
+<w:endnotes xmlns:wpc="http://schemas.microsoft.com/office/word/2010/wordprocessingCanvas" xmlns:cx="http://schemas.microsoft.com/office/drawing/2014/chartex" xmlns:cx1="http://schemas.microsoft.com/office/drawing/2015/9/8/chartex" xmlns:cx2="http://schemas.microsoft.com/office/drawing/2015/10/21/chartex" xmlns:cx3="http://schemas.microsoft.com/office/drawing/2016/5/9/chartex" xmlns:cx4="http://schemas.microsoft.com/office/drawing/2016/5/10/chartex" xmlns:cx5="http://schemas.microsoft.com/office/drawing/2016/5/11/chartex" xmlns:cx6="http://schemas.microsoft.com/office/drawing/2016/5/12/chartex" xmlns:cx7="http://schemas.microsoft.com/office/drawing/2016/5/13/chartex" xmlns:cx8="http://schemas.microsoft.com/office/drawing/2016/5/14/chartex" xmlns:mc="http://schemas.openxmlformats.org/markup-compatibility/2006" xmlns:aink="http://schemas.microsoft.com/office/drawing/2016/ink" xmlns:am3d="http://schemas.microsoft.com/office/drawing/2017/model3d" xmlns:o="urn:schemas-microsoft-com:office:office" xmlns:r="http://schemas.openxmlformats.org/officeDocument/2006/relationships" xmlns:m="http://schemas.openxmlformats.org/officeDocument/2006/math" xmlns:v="urn:schemas-microsoft-com:vml" xmlns:wp14="http://schemas.microsoft.com/office/word/2010/wordprocessingDrawing" xmlns:wp="http://schemas.openxmlformats.org/drawingml/2006/wordprocessingDrawing" xmlns:w10="urn:schemas-microsoft-com:office:word" xmlns:w="http://schemas.openxmlformats.org/wordprocessingml/2006/main" xmlns:w14="http://schemas.microsoft.com/office/word/2010/wordml" xmlns:w15="http://schemas.microsoft.com/office/word/2012/wordml" xmlns:w16cid="http://schemas.microsoft.com/office/word/2016/wordml/cid" xmlns:w16se="http://schemas.microsoft.com/office/word/2015/wordml/symex" xmlns:wpg="http://schemas.microsoft.com/office/word/2010/wordprocessingGroup" xmlns:wpi="http://schemas.microsoft.com/office/word/2010/wordprocessingInk" xmlns:wne="http://schemas.microsoft.com/office/word/2006/wordml" xmlns:wps="http://schemas.microsoft.com/office/word/2010/wordprocessingShape" mc:Ignorable="w14 w15 w16se w16cid wp14">
   <w:endnote w:type="separator" w:id="-1">
     <w:p>
       <w:pPr>
@@ -12764,7 +13015,7 @@
 </file>
 
 <file path=word/footer1.xml><?xml version="1.0" encoding="utf-8"?>
-<w:ftr xmlns:wpc="http://schemas.microsoft.com/office/word/2010/wordprocessingCanvas" xmlns:cx="http://schemas.microsoft.com/office/drawing/2014/chartex" xmlns:cx1="http://schemas.microsoft.com/office/drawing/2015/9/8/chartex" xmlns:cx2="http://schemas.microsoft.com/office/drawing/2015/10/21/chartex" xmlns:cx3="http://schemas.microsoft.com/office/drawing/2016/5/9/chartex" xmlns:cx4="http://schemas.microsoft.com/office/drawing/2016/5/10/chartex" xmlns:cx5="http://schemas.microsoft.com/office/drawing/2016/5/11/chartex" xmlns:cx6="http://schemas.microsoft.com/office/drawing/2016/5/12/chartex" xmlns:cx7="http://schemas.microsoft.com/office/drawing/2016/5/13/chartex" xmlns:cx8="http://schemas.microsoft.com/office/drawing/2016/5/14/chartex" xmlns:mc="http://schemas.openxmlformats.org/markup-compatibility/2006" xmlns:aink="http://schemas.microsoft.com/office/drawing/2016/ink" xmlns:am3d="http://schemas.microsoft.com/office/drawing/2017/model3d" xmlns:o="urn:schemas-microsoft-com:office:office" xmlns:oel="http://schemas.microsoft.com/office/2019/extlst" xmlns:r="http://schemas.openxmlformats.org/officeDocument/2006/relationships" xmlns:m="http://schemas.openxmlformats.org/officeDocument/2006/math" xmlns:v="urn:schemas-microsoft-com:vml" xmlns:wp14="http://schemas.microsoft.com/office/word/2010/wordprocessingDrawing" xmlns:wp="http://schemas.openxmlformats.org/drawingml/2006/wordprocessingDrawing" xmlns:w10="urn:schemas-microsoft-com:office:word" xmlns:w="http://schemas.openxmlformats.org/wordprocessingml/2006/main" xmlns:w14="http://schemas.microsoft.com/office/word/2010/wordml" xmlns:w15="http://schemas.microsoft.com/office/word/2012/wordml" xmlns:w16cex="http://schemas.microsoft.com/office/word/2018/wordml/cex" xmlns:w16cid="http://schemas.microsoft.com/office/word/2016/wordml/cid" xmlns:w16="http://schemas.microsoft.com/office/word/2018/wordml" xmlns:w16du="http://schemas.microsoft.com/office/word/2023/wordml/word16du" xmlns:w16sdtdh="http://schemas.microsoft.com/office/word/2020/wordml/sdtdatahash" xmlns:w16sdtfl="http://schemas.microsoft.com/office/word/2024/wordml/sdtformatlock" xmlns:w16se="http://schemas.microsoft.com/office/word/2015/wordml/symex" xmlns:wpg="http://schemas.microsoft.com/office/word/2010/wordprocessingGroup" xmlns:wpi="http://schemas.microsoft.com/office/word/2010/wordprocessingInk" xmlns:wne="http://schemas.microsoft.com/office/word/2006/wordml" xmlns:wps="http://schemas.microsoft.com/office/word/2010/wordprocessingShape" mc:Ignorable="w14 w15 w16se w16cid w16 w16cex w16sdtdh w16sdtfl w16du wp14">
+<w:ftr xmlns:wpc="http://schemas.microsoft.com/office/word/2010/wordprocessingCanvas" xmlns:cx="http://schemas.microsoft.com/office/drawing/2014/chartex" xmlns:cx1="http://schemas.microsoft.com/office/drawing/2015/9/8/chartex" xmlns:cx2="http://schemas.microsoft.com/office/drawing/2015/10/21/chartex" xmlns:cx3="http://schemas.microsoft.com/office/drawing/2016/5/9/chartex" xmlns:cx4="http://schemas.microsoft.com/office/drawing/2016/5/10/chartex" xmlns:cx5="http://schemas.microsoft.com/office/drawing/2016/5/11/chartex" xmlns:cx6="http://schemas.microsoft.com/office/drawing/2016/5/12/chartex" xmlns:cx7="http://schemas.microsoft.com/office/drawing/2016/5/13/chartex" xmlns:cx8="http://schemas.microsoft.com/office/drawing/2016/5/14/chartex" xmlns:mc="http://schemas.openxmlformats.org/markup-compatibility/2006" xmlns:aink="http://schemas.microsoft.com/office/drawing/2016/ink" xmlns:am3d="http://schemas.microsoft.com/office/drawing/2017/model3d" xmlns:o="urn:schemas-microsoft-com:office:office" xmlns:r="http://schemas.openxmlformats.org/officeDocument/2006/relationships" xmlns:m="http://schemas.openxmlformats.org/officeDocument/2006/math" xmlns:v="urn:schemas-microsoft-com:vml" xmlns:wp14="http://schemas.microsoft.com/office/word/2010/wordprocessingDrawing" xmlns:wp="http://schemas.openxmlformats.org/drawingml/2006/wordprocessingDrawing" xmlns:w10="urn:schemas-microsoft-com:office:word" xmlns:w="http://schemas.openxmlformats.org/wordprocessingml/2006/main" xmlns:w14="http://schemas.microsoft.com/office/word/2010/wordml" xmlns:w15="http://schemas.microsoft.com/office/word/2012/wordml" xmlns:w16cid="http://schemas.microsoft.com/office/word/2016/wordml/cid" xmlns:w16se="http://schemas.microsoft.com/office/word/2015/wordml/symex" xmlns:wpg="http://schemas.microsoft.com/office/word/2010/wordprocessingGroup" xmlns:wpi="http://schemas.microsoft.com/office/word/2010/wordprocessingInk" xmlns:wne="http://schemas.microsoft.com/office/word/2006/wordml" xmlns:wps="http://schemas.microsoft.com/office/word/2010/wordprocessingShape" mc:Ignorable="w14 w15 w16se w16cid wp14">
   <w:p>
     <w:pPr>
       <w:pStyle w:val="Fuzeile"/>
@@ -12774,7 +13025,7 @@
 </file>
 
 <file path=word/footer2.xml><?xml version="1.0" encoding="utf-8"?>
-<w:ftr xmlns:wpc="http://schemas.microsoft.com/office/word/2010/wordprocessingCanvas" xmlns:cx="http://schemas.microsoft.com/office/drawing/2014/chartex" xmlns:cx1="http://schemas.microsoft.com/office/drawing/2015/9/8/chartex" xmlns:cx2="http://schemas.microsoft.com/office/drawing/2015/10/21/chartex" xmlns:cx3="http://schemas.microsoft.com/office/drawing/2016/5/9/chartex" xmlns:cx4="http://schemas.microsoft.com/office/drawing/2016/5/10/chartex" xmlns:cx5="http://schemas.microsoft.com/office/drawing/2016/5/11/chartex" xmlns:cx6="http://schemas.microsoft.com/office/drawing/2016/5/12/chartex" xmlns:cx7="http://schemas.microsoft.com/office/drawing/2016/5/13/chartex" xmlns:cx8="http://schemas.microsoft.com/office/drawing/2016/5/14/chartex" xmlns:mc="http://schemas.openxmlformats.org/markup-compatibility/2006" xmlns:aink="http://schemas.microsoft.com/office/drawing/2016/ink" xmlns:am3d="http://schemas.microsoft.com/office/drawing/2017/model3d" xmlns:o="urn:schemas-microsoft-com:office:office" xmlns:oel="http://schemas.microsoft.com/office/2019/extlst" xmlns:r="http://schemas.openxmlformats.org/officeDocument/2006/relationships" xmlns:m="http://schemas.openxmlformats.org/officeDocument/2006/math" xmlns:v="urn:schemas-microsoft-com:vml" xmlns:wp14="http://schemas.microsoft.com/office/word/2010/wordprocessingDrawing" xmlns:wp="http://schemas.openxmlformats.org/drawingml/2006/wordprocessingDrawing" xmlns:w10="urn:schemas-microsoft-com:office:word" xmlns:w="http://schemas.openxmlformats.org/wordprocessingml/2006/main" xmlns:w14="http://schemas.microsoft.com/office/word/2010/wordml" xmlns:w15="http://schemas.microsoft.com/office/word/2012/wordml" xmlns:w16cex="http://schemas.microsoft.com/office/word/2018/wordml/cex" xmlns:w16cid="http://schemas.microsoft.com/office/word/2016/wordml/cid" xmlns:w16="http://schemas.microsoft.com/office/word/2018/wordml" xmlns:w16du="http://schemas.microsoft.com/office/word/2023/wordml/word16du" xmlns:w16sdtdh="http://schemas.microsoft.com/office/word/2020/wordml/sdtdatahash" xmlns:w16sdtfl="http://schemas.microsoft.com/office/word/2024/wordml/sdtformatlock" xmlns:w16se="http://schemas.microsoft.com/office/word/2015/wordml/symex" xmlns:wpg="http://schemas.microsoft.com/office/word/2010/wordprocessingGroup" xmlns:wpi="http://schemas.microsoft.com/office/word/2010/wordprocessingInk" xmlns:wne="http://schemas.microsoft.com/office/word/2006/wordml" xmlns:wps="http://schemas.microsoft.com/office/word/2010/wordprocessingShape" mc:Ignorable="w14 w15 w16se w16cid w16 w16cex w16sdtdh w16sdtfl w16du wp14">
+<w:ftr xmlns:wpc="http://schemas.microsoft.com/office/word/2010/wordprocessingCanvas" xmlns:cx="http://schemas.microsoft.com/office/drawing/2014/chartex" xmlns:cx1="http://schemas.microsoft.com/office/drawing/2015/9/8/chartex" xmlns:cx2="http://schemas.microsoft.com/office/drawing/2015/10/21/chartex" xmlns:cx3="http://schemas.microsoft.com/office/drawing/2016/5/9/chartex" xmlns:cx4="http://schemas.microsoft.com/office/drawing/2016/5/10/chartex" xmlns:cx5="http://schemas.microsoft.com/office/drawing/2016/5/11/chartex" xmlns:cx6="http://schemas.microsoft.com/office/drawing/2016/5/12/chartex" xmlns:cx7="http://schemas.microsoft.com/office/drawing/2016/5/13/chartex" xmlns:cx8="http://schemas.microsoft.com/office/drawing/2016/5/14/chartex" xmlns:mc="http://schemas.openxmlformats.org/markup-compatibility/2006" xmlns:aink="http://schemas.microsoft.com/office/drawing/2016/ink" xmlns:am3d="http://schemas.microsoft.com/office/drawing/2017/model3d" xmlns:o="urn:schemas-microsoft-com:office:office" xmlns:r="http://schemas.openxmlformats.org/officeDocument/2006/relationships" xmlns:m="http://schemas.openxmlformats.org/officeDocument/2006/math" xmlns:v="urn:schemas-microsoft-com:vml" xmlns:wp14="http://schemas.microsoft.com/office/word/2010/wordprocessingDrawing" xmlns:wp="http://schemas.openxmlformats.org/drawingml/2006/wordprocessingDrawing" xmlns:w10="urn:schemas-microsoft-com:office:word" xmlns:w="http://schemas.openxmlformats.org/wordprocessingml/2006/main" xmlns:w14="http://schemas.microsoft.com/office/word/2010/wordml" xmlns:w15="http://schemas.microsoft.com/office/word/2012/wordml" xmlns:w16cid="http://schemas.microsoft.com/office/word/2016/wordml/cid" xmlns:w16se="http://schemas.microsoft.com/office/word/2015/wordml/symex" xmlns:wpg="http://schemas.microsoft.com/office/word/2010/wordprocessingGroup" xmlns:wpi="http://schemas.microsoft.com/office/word/2010/wordprocessingInk" xmlns:wne="http://schemas.microsoft.com/office/word/2006/wordml" xmlns:wps="http://schemas.microsoft.com/office/word/2010/wordprocessingShape" mc:Ignorable="w14 w15 w16se w16cid wp14">
   <w:p>
     <w:pPr>
       <w:pBdr>
@@ -12818,7 +13069,7 @@
 </file>
 
 <file path=word/footer3.xml><?xml version="1.0" encoding="utf-8"?>
-<w:ftr xmlns:wpc="http://schemas.microsoft.com/office/word/2010/wordprocessingCanvas" xmlns:cx="http://schemas.microsoft.com/office/drawing/2014/chartex" xmlns:cx1="http://schemas.microsoft.com/office/drawing/2015/9/8/chartex" xmlns:cx2="http://schemas.microsoft.com/office/drawing/2015/10/21/chartex" xmlns:cx3="http://schemas.microsoft.com/office/drawing/2016/5/9/chartex" xmlns:cx4="http://schemas.microsoft.com/office/drawing/2016/5/10/chartex" xmlns:cx5="http://schemas.microsoft.com/office/drawing/2016/5/11/chartex" xmlns:cx6="http://schemas.microsoft.com/office/drawing/2016/5/12/chartex" xmlns:cx7="http://schemas.microsoft.com/office/drawing/2016/5/13/chartex" xmlns:cx8="http://schemas.microsoft.com/office/drawing/2016/5/14/chartex" xmlns:mc="http://schemas.openxmlformats.org/markup-compatibility/2006" xmlns:aink="http://schemas.microsoft.com/office/drawing/2016/ink" xmlns:am3d="http://schemas.microsoft.com/office/drawing/2017/model3d" xmlns:o="urn:schemas-microsoft-com:office:office" xmlns:oel="http://schemas.microsoft.com/office/2019/extlst" xmlns:r="http://schemas.openxmlformats.org/officeDocument/2006/relationships" xmlns:m="http://schemas.openxmlformats.org/officeDocument/2006/math" xmlns:v="urn:schemas-microsoft-com:vml" xmlns:wp14="http://schemas.microsoft.com/office/word/2010/wordprocessingDrawing" xmlns:wp="http://schemas.openxmlformats.org/drawingml/2006/wordprocessingDrawing" xmlns:w10="urn:schemas-microsoft-com:office:word" xmlns:w="http://schemas.openxmlformats.org/wordprocessingml/2006/main" xmlns:w14="http://schemas.microsoft.com/office/word/2010/wordml" xmlns:w15="http://schemas.microsoft.com/office/word/2012/wordml" xmlns:w16cex="http://schemas.microsoft.com/office/word/2018/wordml/cex" xmlns:w16cid="http://schemas.microsoft.com/office/word/2016/wordml/cid" xmlns:w16="http://schemas.microsoft.com/office/word/2018/wordml" xmlns:w16du="http://schemas.microsoft.com/office/word/2023/wordml/word16du" xmlns:w16sdtdh="http://schemas.microsoft.com/office/word/2020/wordml/sdtdatahash" xmlns:w16sdtfl="http://schemas.microsoft.com/office/word/2024/wordml/sdtformatlock" xmlns:w16se="http://schemas.microsoft.com/office/word/2015/wordml/symex" xmlns:wpg="http://schemas.microsoft.com/office/word/2010/wordprocessingGroup" xmlns:wpi="http://schemas.microsoft.com/office/word/2010/wordprocessingInk" xmlns:wne="http://schemas.microsoft.com/office/word/2006/wordml" xmlns:wps="http://schemas.microsoft.com/office/word/2010/wordprocessingShape" mc:Ignorable="w14 w15 w16se w16cid w16 w16cex w16sdtdh w16sdtfl w16du wp14">
+<w:ftr xmlns:wpc="http://schemas.microsoft.com/office/word/2010/wordprocessingCanvas" xmlns:cx="http://schemas.microsoft.com/office/drawing/2014/chartex" xmlns:cx1="http://schemas.microsoft.com/office/drawing/2015/9/8/chartex" xmlns:cx2="http://schemas.microsoft.com/office/drawing/2015/10/21/chartex" xmlns:cx3="http://schemas.microsoft.com/office/drawing/2016/5/9/chartex" xmlns:cx4="http://schemas.microsoft.com/office/drawing/2016/5/10/chartex" xmlns:cx5="http://schemas.microsoft.com/office/drawing/2016/5/11/chartex" xmlns:cx6="http://schemas.microsoft.com/office/drawing/2016/5/12/chartex" xmlns:cx7="http://schemas.microsoft.com/office/drawing/2016/5/13/chartex" xmlns:cx8="http://schemas.microsoft.com/office/drawing/2016/5/14/chartex" xmlns:mc="http://schemas.openxmlformats.org/markup-compatibility/2006" xmlns:aink="http://schemas.microsoft.com/office/drawing/2016/ink" xmlns:am3d="http://schemas.microsoft.com/office/drawing/2017/model3d" xmlns:o="urn:schemas-microsoft-com:office:office" xmlns:r="http://schemas.openxmlformats.org/officeDocument/2006/relationships" xmlns:m="http://schemas.openxmlformats.org/officeDocument/2006/math" xmlns:v="urn:schemas-microsoft-com:vml" xmlns:wp14="http://schemas.microsoft.com/office/word/2010/wordprocessingDrawing" xmlns:wp="http://schemas.openxmlformats.org/drawingml/2006/wordprocessingDrawing" xmlns:w10="urn:schemas-microsoft-com:office:word" xmlns:w="http://schemas.openxmlformats.org/wordprocessingml/2006/main" xmlns:w14="http://schemas.microsoft.com/office/word/2010/wordml" xmlns:w15="http://schemas.microsoft.com/office/word/2012/wordml" xmlns:w16cid="http://schemas.microsoft.com/office/word/2016/wordml/cid" xmlns:w16se="http://schemas.microsoft.com/office/word/2015/wordml/symex" xmlns:wpg="http://schemas.microsoft.com/office/word/2010/wordprocessingGroup" xmlns:wpi="http://schemas.microsoft.com/office/word/2010/wordprocessingInk" xmlns:wne="http://schemas.microsoft.com/office/word/2006/wordml" xmlns:wps="http://schemas.microsoft.com/office/word/2010/wordprocessingShape" mc:Ignorable="w14 w15 w16se w16cid wp14">
   <w:p>
     <w:pPr>
       <w:pStyle w:val="Fuzeile"/>
@@ -12828,7 +13079,7 @@
 </file>
 
 <file path=word/footer4.xml><?xml version="1.0" encoding="utf-8"?>
-<w:ftr xmlns:wpc="http://schemas.microsoft.com/office/word/2010/wordprocessingCanvas" xmlns:cx="http://schemas.microsoft.com/office/drawing/2014/chartex" xmlns:cx1="http://schemas.microsoft.com/office/drawing/2015/9/8/chartex" xmlns:cx2="http://schemas.microsoft.com/office/drawing/2015/10/21/chartex" xmlns:cx3="http://schemas.microsoft.com/office/drawing/2016/5/9/chartex" xmlns:cx4="http://schemas.microsoft.com/office/drawing/2016/5/10/chartex" xmlns:cx5="http://schemas.microsoft.com/office/drawing/2016/5/11/chartex" xmlns:cx6="http://schemas.microsoft.com/office/drawing/2016/5/12/chartex" xmlns:cx7="http://schemas.microsoft.com/office/drawing/2016/5/13/chartex" xmlns:cx8="http://schemas.microsoft.com/office/drawing/2016/5/14/chartex" xmlns:mc="http://schemas.openxmlformats.org/markup-compatibility/2006" xmlns:aink="http://schemas.microsoft.com/office/drawing/2016/ink" xmlns:am3d="http://schemas.microsoft.com/office/drawing/2017/model3d" xmlns:o="urn:schemas-microsoft-com:office:office" xmlns:oel="http://schemas.microsoft.com/office/2019/extlst" xmlns:r="http://schemas.openxmlformats.org/officeDocument/2006/relationships" xmlns:m="http://schemas.openxmlformats.org/officeDocument/2006/math" xmlns:v="urn:schemas-microsoft-com:vml" xmlns:wp14="http://schemas.microsoft.com/office/word/2010/wordprocessingDrawing" xmlns:wp="http://schemas.openxmlformats.org/drawingml/2006/wordprocessingDrawing" xmlns:w10="urn:schemas-microsoft-com:office:word" xmlns:w="http://schemas.openxmlformats.org/wordprocessingml/2006/main" xmlns:w14="http://schemas.microsoft.com/office/word/2010/wordml" xmlns:w15="http://schemas.microsoft.com/office/word/2012/wordml" xmlns:w16cex="http://schemas.microsoft.com/office/word/2018/wordml/cex" xmlns:w16cid="http://schemas.microsoft.com/office/word/2016/wordml/cid" xmlns:w16="http://schemas.microsoft.com/office/word/2018/wordml" xmlns:w16du="http://schemas.microsoft.com/office/word/2023/wordml/word16du" xmlns:w16sdtdh="http://schemas.microsoft.com/office/word/2020/wordml/sdtdatahash" xmlns:w16sdtfl="http://schemas.microsoft.com/office/word/2024/wordml/sdtformatlock" xmlns:w16se="http://schemas.microsoft.com/office/word/2015/wordml/symex" xmlns:wpg="http://schemas.microsoft.com/office/word/2010/wordprocessingGroup" xmlns:wpi="http://schemas.microsoft.com/office/word/2010/wordprocessingInk" xmlns:wne="http://schemas.microsoft.com/office/word/2006/wordml" xmlns:wps="http://schemas.microsoft.com/office/word/2010/wordprocessingShape" mc:Ignorable="w14 w15 w16se w16cid w16 w16cex w16sdtdh w16sdtfl w16du wp14">
+<w:ftr xmlns:wpc="http://schemas.microsoft.com/office/word/2010/wordprocessingCanvas" xmlns:cx="http://schemas.microsoft.com/office/drawing/2014/chartex" xmlns:cx1="http://schemas.microsoft.com/office/drawing/2015/9/8/chartex" xmlns:cx2="http://schemas.microsoft.com/office/drawing/2015/10/21/chartex" xmlns:cx3="http://schemas.microsoft.com/office/drawing/2016/5/9/chartex" xmlns:cx4="http://schemas.microsoft.com/office/drawing/2016/5/10/chartex" xmlns:cx5="http://schemas.microsoft.com/office/drawing/2016/5/11/chartex" xmlns:cx6="http://schemas.microsoft.com/office/drawing/2016/5/12/chartex" xmlns:cx7="http://schemas.microsoft.com/office/drawing/2016/5/13/chartex" xmlns:cx8="http://schemas.microsoft.com/office/drawing/2016/5/14/chartex" xmlns:mc="http://schemas.openxmlformats.org/markup-compatibility/2006" xmlns:aink="http://schemas.microsoft.com/office/drawing/2016/ink" xmlns:am3d="http://schemas.microsoft.com/office/drawing/2017/model3d" xmlns:o="urn:schemas-microsoft-com:office:office" xmlns:r="http://schemas.openxmlformats.org/officeDocument/2006/relationships" xmlns:m="http://schemas.openxmlformats.org/officeDocument/2006/math" xmlns:v="urn:schemas-microsoft-com:vml" xmlns:wp14="http://schemas.microsoft.com/office/word/2010/wordprocessingDrawing" xmlns:wp="http://schemas.openxmlformats.org/drawingml/2006/wordprocessingDrawing" xmlns:w10="urn:schemas-microsoft-com:office:word" xmlns:w="http://schemas.openxmlformats.org/wordprocessingml/2006/main" xmlns:w14="http://schemas.microsoft.com/office/word/2010/wordml" xmlns:w15="http://schemas.microsoft.com/office/word/2012/wordml" xmlns:w16cid="http://schemas.microsoft.com/office/word/2016/wordml/cid" xmlns:w16se="http://schemas.microsoft.com/office/word/2015/wordml/symex" xmlns:wpg="http://schemas.microsoft.com/office/word/2010/wordprocessingGroup" xmlns:wpi="http://schemas.microsoft.com/office/word/2010/wordprocessingInk" xmlns:wne="http://schemas.microsoft.com/office/word/2006/wordml" xmlns:wps="http://schemas.microsoft.com/office/word/2010/wordprocessingShape" mc:Ignorable="w14 w15 w16se w16cid wp14">
   <w:p>
     <w:pPr>
       <w:pBdr>
@@ -12903,7 +13154,7 @@
 </file>
 
 <file path=word/footer5.xml><?xml version="1.0" encoding="utf-8"?>
-<w:ftr xmlns:wpc="http://schemas.microsoft.com/office/word/2010/wordprocessingCanvas" xmlns:cx="http://schemas.microsoft.com/office/drawing/2014/chartex" xmlns:cx1="http://schemas.microsoft.com/office/drawing/2015/9/8/chartex" xmlns:cx2="http://schemas.microsoft.com/office/drawing/2015/10/21/chartex" xmlns:cx3="http://schemas.microsoft.com/office/drawing/2016/5/9/chartex" xmlns:cx4="http://schemas.microsoft.com/office/drawing/2016/5/10/chartex" xmlns:cx5="http://schemas.microsoft.com/office/drawing/2016/5/11/chartex" xmlns:cx6="http://schemas.microsoft.com/office/drawing/2016/5/12/chartex" xmlns:cx7="http://schemas.microsoft.com/office/drawing/2016/5/13/chartex" xmlns:cx8="http://schemas.microsoft.com/office/drawing/2016/5/14/chartex" xmlns:mc="http://schemas.openxmlformats.org/markup-compatibility/2006" xmlns:aink="http://schemas.microsoft.com/office/drawing/2016/ink" xmlns:am3d="http://schemas.microsoft.com/office/drawing/2017/model3d" xmlns:o="urn:schemas-microsoft-com:office:office" xmlns:oel="http://schemas.microsoft.com/office/2019/extlst" xmlns:r="http://schemas.openxmlformats.org/officeDocument/2006/relationships" xmlns:m="http://schemas.openxmlformats.org/officeDocument/2006/math" xmlns:v="urn:schemas-microsoft-com:vml" xmlns:wp14="http://schemas.microsoft.com/office/word/2010/wordprocessingDrawing" xmlns:wp="http://schemas.openxmlformats.org/drawingml/2006/wordprocessingDrawing" xmlns:w10="urn:schemas-microsoft-com:office:word" xmlns:w="http://schemas.openxmlformats.org/wordprocessingml/2006/main" xmlns:w14="http://schemas.microsoft.com/office/word/2010/wordml" xmlns:w15="http://schemas.microsoft.com/office/word/2012/wordml" xmlns:w16cex="http://schemas.microsoft.com/office/word/2018/wordml/cex" xmlns:w16cid="http://schemas.microsoft.com/office/word/2016/wordml/cid" xmlns:w16="http://schemas.microsoft.com/office/word/2018/wordml" xmlns:w16du="http://schemas.microsoft.com/office/word/2023/wordml/word16du" xmlns:w16sdtdh="http://schemas.microsoft.com/office/word/2020/wordml/sdtdatahash" xmlns:w16sdtfl="http://schemas.microsoft.com/office/word/2024/wordml/sdtformatlock" xmlns:w16se="http://schemas.microsoft.com/office/word/2015/wordml/symex" xmlns:wpg="http://schemas.microsoft.com/office/word/2010/wordprocessingGroup" xmlns:wpi="http://schemas.microsoft.com/office/word/2010/wordprocessingInk" xmlns:wne="http://schemas.microsoft.com/office/word/2006/wordml" xmlns:wps="http://schemas.microsoft.com/office/word/2010/wordprocessingShape" mc:Ignorable="w14 w15 w16se w16cid w16 w16cex w16sdtdh w16sdtfl w16du wp14">
+<w:ftr xmlns:wpc="http://schemas.microsoft.com/office/word/2010/wordprocessingCanvas" xmlns:cx="http://schemas.microsoft.com/office/drawing/2014/chartex" xmlns:cx1="http://schemas.microsoft.com/office/drawing/2015/9/8/chartex" xmlns:cx2="http://schemas.microsoft.com/office/drawing/2015/10/21/chartex" xmlns:cx3="http://schemas.microsoft.com/office/drawing/2016/5/9/chartex" xmlns:cx4="http://schemas.microsoft.com/office/drawing/2016/5/10/chartex" xmlns:cx5="http://schemas.microsoft.com/office/drawing/2016/5/11/chartex" xmlns:cx6="http://schemas.microsoft.com/office/drawing/2016/5/12/chartex" xmlns:cx7="http://schemas.microsoft.com/office/drawing/2016/5/13/chartex" xmlns:cx8="http://schemas.microsoft.com/office/drawing/2016/5/14/chartex" xmlns:mc="http://schemas.openxmlformats.org/markup-compatibility/2006" xmlns:aink="http://schemas.microsoft.com/office/drawing/2016/ink" xmlns:am3d="http://schemas.microsoft.com/office/drawing/2017/model3d" xmlns:o="urn:schemas-microsoft-com:office:office" xmlns:r="http://schemas.openxmlformats.org/officeDocument/2006/relationships" xmlns:m="http://schemas.openxmlformats.org/officeDocument/2006/math" xmlns:v="urn:schemas-microsoft-com:vml" xmlns:wp14="http://schemas.microsoft.com/office/word/2010/wordprocessingDrawing" xmlns:wp="http://schemas.openxmlformats.org/drawingml/2006/wordprocessingDrawing" xmlns:w10="urn:schemas-microsoft-com:office:word" xmlns:w="http://schemas.openxmlformats.org/wordprocessingml/2006/main" xmlns:w14="http://schemas.microsoft.com/office/word/2010/wordml" xmlns:w15="http://schemas.microsoft.com/office/word/2012/wordml" xmlns:w16cid="http://schemas.microsoft.com/office/word/2016/wordml/cid" xmlns:w16se="http://schemas.microsoft.com/office/word/2015/wordml/symex" xmlns:wpg="http://schemas.microsoft.com/office/word/2010/wordprocessingGroup" xmlns:wpi="http://schemas.microsoft.com/office/word/2010/wordprocessingInk" xmlns:wne="http://schemas.microsoft.com/office/word/2006/wordml" xmlns:wps="http://schemas.microsoft.com/office/word/2010/wordprocessingShape" mc:Ignorable="w14 w15 w16se w16cid wp14">
   <w:p>
     <w:pPr>
       <w:pBdr>
@@ -12978,7 +13229,7 @@
 </file>
 
 <file path=word/footer6.xml><?xml version="1.0" encoding="utf-8"?>
-<w:ftr xmlns:wpc="http://schemas.microsoft.com/office/word/2010/wordprocessingCanvas" xmlns:cx="http://schemas.microsoft.com/office/drawing/2014/chartex" xmlns:cx1="http://schemas.microsoft.com/office/drawing/2015/9/8/chartex" xmlns:cx2="http://schemas.microsoft.com/office/drawing/2015/10/21/chartex" xmlns:cx3="http://schemas.microsoft.com/office/drawing/2016/5/9/chartex" xmlns:cx4="http://schemas.microsoft.com/office/drawing/2016/5/10/chartex" xmlns:cx5="http://schemas.microsoft.com/office/drawing/2016/5/11/chartex" xmlns:cx6="http://schemas.microsoft.com/office/drawing/2016/5/12/chartex" xmlns:cx7="http://schemas.microsoft.com/office/drawing/2016/5/13/chartex" xmlns:cx8="http://schemas.microsoft.com/office/drawing/2016/5/14/chartex" xmlns:mc="http://schemas.openxmlformats.org/markup-compatibility/2006" xmlns:aink="http://schemas.microsoft.com/office/drawing/2016/ink" xmlns:am3d="http://schemas.microsoft.com/office/drawing/2017/model3d" xmlns:o="urn:schemas-microsoft-com:office:office" xmlns:oel="http://schemas.microsoft.com/office/2019/extlst" xmlns:r="http://schemas.openxmlformats.org/officeDocument/2006/relationships" xmlns:m="http://schemas.openxmlformats.org/officeDocument/2006/math" xmlns:v="urn:schemas-microsoft-com:vml" xmlns:wp14="http://schemas.microsoft.com/office/word/2010/wordprocessingDrawing" xmlns:wp="http://schemas.openxmlformats.org/drawingml/2006/wordprocessingDrawing" xmlns:w10="urn:schemas-microsoft-com:office:word" xmlns:w="http://schemas.openxmlformats.org/wordprocessingml/2006/main" xmlns:w14="http://schemas.microsoft.com/office/word/2010/wordml" xmlns:w15="http://schemas.microsoft.com/office/word/2012/wordml" xmlns:w16cex="http://schemas.microsoft.com/office/word/2018/wordml/cex" xmlns:w16cid="http://schemas.microsoft.com/office/word/2016/wordml/cid" xmlns:w16="http://schemas.microsoft.com/office/word/2018/wordml" xmlns:w16du="http://schemas.microsoft.com/office/word/2023/wordml/word16du" xmlns:w16sdtdh="http://schemas.microsoft.com/office/word/2020/wordml/sdtdatahash" xmlns:w16sdtfl="http://schemas.microsoft.com/office/word/2024/wordml/sdtformatlock" xmlns:w16se="http://schemas.microsoft.com/office/word/2015/wordml/symex" xmlns:wpg="http://schemas.microsoft.com/office/word/2010/wordprocessingGroup" xmlns:wpi="http://schemas.microsoft.com/office/word/2010/wordprocessingInk" xmlns:wne="http://schemas.microsoft.com/office/word/2006/wordml" xmlns:wps="http://schemas.microsoft.com/office/word/2010/wordprocessingShape" mc:Ignorable="w14 w15 w16se w16cid w16 w16cex w16sdtdh w16sdtfl w16du wp14">
+<w:ftr xmlns:wpc="http://schemas.microsoft.com/office/word/2010/wordprocessingCanvas" xmlns:cx="http://schemas.microsoft.com/office/drawing/2014/chartex" xmlns:cx1="http://schemas.microsoft.com/office/drawing/2015/9/8/chartex" xmlns:cx2="http://schemas.microsoft.com/office/drawing/2015/10/21/chartex" xmlns:cx3="http://schemas.microsoft.com/office/drawing/2016/5/9/chartex" xmlns:cx4="http://schemas.microsoft.com/office/drawing/2016/5/10/chartex" xmlns:cx5="http://schemas.microsoft.com/office/drawing/2016/5/11/chartex" xmlns:cx6="http://schemas.microsoft.com/office/drawing/2016/5/12/chartex" xmlns:cx7="http://schemas.microsoft.com/office/drawing/2016/5/13/chartex" xmlns:cx8="http://schemas.microsoft.com/office/drawing/2016/5/14/chartex" xmlns:mc="http://schemas.openxmlformats.org/markup-compatibility/2006" xmlns:aink="http://schemas.microsoft.com/office/drawing/2016/ink" xmlns:am3d="http://schemas.microsoft.com/office/drawing/2017/model3d" xmlns:o="urn:schemas-microsoft-com:office:office" xmlns:r="http://schemas.openxmlformats.org/officeDocument/2006/relationships" xmlns:m="http://schemas.openxmlformats.org/officeDocument/2006/math" xmlns:v="urn:schemas-microsoft-com:vml" xmlns:wp14="http://schemas.microsoft.com/office/word/2010/wordprocessingDrawing" xmlns:wp="http://schemas.openxmlformats.org/drawingml/2006/wordprocessingDrawing" xmlns:w10="urn:schemas-microsoft-com:office:word" xmlns:w="http://schemas.openxmlformats.org/wordprocessingml/2006/main" xmlns:w14="http://schemas.microsoft.com/office/word/2010/wordml" xmlns:w15="http://schemas.microsoft.com/office/word/2012/wordml" xmlns:w16cid="http://schemas.microsoft.com/office/word/2016/wordml/cid" xmlns:w16se="http://schemas.microsoft.com/office/word/2015/wordml/symex" xmlns:wpg="http://schemas.microsoft.com/office/word/2010/wordprocessingGroup" xmlns:wpi="http://schemas.microsoft.com/office/word/2010/wordprocessingInk" xmlns:wne="http://schemas.microsoft.com/office/word/2006/wordml" xmlns:wps="http://schemas.microsoft.com/office/word/2010/wordprocessingShape" mc:Ignorable="w14 w15 w16se w16cid wp14">
   <w:p>
     <w:pPr>
       <w:pBdr>
@@ -13059,7 +13310,7 @@
 </file>
 
 <file path=word/footnotes.xml><?xml version="1.0" encoding="utf-8"?>
-<w:footnotes xmlns:wpc="http://schemas.microsoft.com/office/word/2010/wordprocessingCanvas" xmlns:cx="http://schemas.microsoft.com/office/drawing/2014/chartex" xmlns:cx1="http://schemas.microsoft.com/office/drawing/2015/9/8/chartex" xmlns:cx2="http://schemas.microsoft.com/office/drawing/2015/10/21/chartex" xmlns:cx3="http://schemas.microsoft.com/office/drawing/2016/5/9/chartex" xmlns:cx4="http://schemas.microsoft.com/office/drawing/2016/5/10/chartex" xmlns:cx5="http://schemas.microsoft.com/office/drawing/2016/5/11/chartex" xmlns:cx6="http://schemas.microsoft.com/office/drawing/2016/5/12/chartex" xmlns:cx7="http://schemas.microsoft.com/office/drawing/2016/5/13/chartex" xmlns:cx8="http://schemas.microsoft.com/office/drawing/2016/5/14/chartex" xmlns:mc="http://schemas.openxmlformats.org/markup-compatibility/2006" xmlns:aink="http://schemas.microsoft.com/office/drawing/2016/ink" xmlns:am3d="http://schemas.microsoft.com/office/drawing/2017/model3d" xmlns:o="urn:schemas-microsoft-com:office:office" xmlns:oel="http://schemas.microsoft.com/office/2019/extlst" xmlns:r="http://schemas.openxmlformats.org/officeDocument/2006/relationships" xmlns:m="http://schemas.openxmlformats.org/officeDocument/2006/math" xmlns:v="urn:schemas-microsoft-com:vml" xmlns:wp14="http://schemas.microsoft.com/office/word/2010/wordprocessingDrawing" xmlns:wp="http://schemas.openxmlformats.org/drawingml/2006/wordprocessingDrawing" xmlns:w10="urn:schemas-microsoft-com:office:word" xmlns:w="http://schemas.openxmlformats.org/wordprocessingml/2006/main" xmlns:w14="http://schemas.microsoft.com/office/word/2010/wordml" xmlns:w15="http://schemas.microsoft.com/office/word/2012/wordml" xmlns:w16cex="http://schemas.microsoft.com/office/word/2018/wordml/cex" xmlns:w16cid="http://schemas.microsoft.com/office/word/2016/wordml/cid" xmlns:w16="http://schemas.microsoft.com/office/word/2018/wordml" xmlns:w16du="http://schemas.microsoft.com/office/word/2023/wordml/word16du" xmlns:w16sdtdh="http://schemas.microsoft.com/office/word/2020/wordml/sdtdatahash" xmlns:w16sdtfl="http://schemas.microsoft.com/office/word/2024/wordml/sdtformatlock" xmlns:w16se="http://schemas.microsoft.com/office/word/2015/wordml/symex" xmlns:wpg="http://schemas.microsoft.com/office/word/2010/wordprocessingGroup" xmlns:wpi="http://schemas.microsoft.com/office/word/2010/wordprocessingInk" xmlns:wne="http://schemas.microsoft.com/office/word/2006/wordml" xmlns:wps="http://schemas.microsoft.com/office/word/2010/wordprocessingShape" mc:Ignorable="w14 w15 w16se w16cid w16 w16cex w16sdtdh w16sdtfl w16du wp14">
+<w:footnotes xmlns:wpc="http://schemas.microsoft.com/office/word/2010/wordprocessingCanvas" xmlns:cx="http://schemas.microsoft.com/office/drawing/2014/chartex" xmlns:cx1="http://schemas.microsoft.com/office/drawing/2015/9/8/chartex" xmlns:cx2="http://schemas.microsoft.com/office/drawing/2015/10/21/chartex" xmlns:cx3="http://schemas.microsoft.com/office/drawing/2016/5/9/chartex" xmlns:cx4="http://schemas.microsoft.com/office/drawing/2016/5/10/chartex" xmlns:cx5="http://schemas.microsoft.com/office/drawing/2016/5/11/chartex" xmlns:cx6="http://schemas.microsoft.com/office/drawing/2016/5/12/chartex" xmlns:cx7="http://schemas.microsoft.com/office/drawing/2016/5/13/chartex" xmlns:cx8="http://schemas.microsoft.com/office/drawing/2016/5/14/chartex" xmlns:mc="http://schemas.openxmlformats.org/markup-compatibility/2006" xmlns:aink="http://schemas.microsoft.com/office/drawing/2016/ink" xmlns:am3d="http://schemas.microsoft.com/office/drawing/2017/model3d" xmlns:o="urn:schemas-microsoft-com:office:office" xmlns:r="http://schemas.openxmlformats.org/officeDocument/2006/relationships" xmlns:m="http://schemas.openxmlformats.org/officeDocument/2006/math" xmlns:v="urn:schemas-microsoft-com:vml" xmlns:wp14="http://schemas.microsoft.com/office/word/2010/wordprocessingDrawing" xmlns:wp="http://schemas.openxmlformats.org/drawingml/2006/wordprocessingDrawing" xmlns:w10="urn:schemas-microsoft-com:office:word" xmlns:w="http://schemas.openxmlformats.org/wordprocessingml/2006/main" xmlns:w14="http://schemas.microsoft.com/office/word/2010/wordml" xmlns:w15="http://schemas.microsoft.com/office/word/2012/wordml" xmlns:w16cid="http://schemas.microsoft.com/office/word/2016/wordml/cid" xmlns:w16se="http://schemas.microsoft.com/office/word/2015/wordml/symex" xmlns:wpg="http://schemas.microsoft.com/office/word/2010/wordprocessingGroup" xmlns:wpi="http://schemas.microsoft.com/office/word/2010/wordprocessingInk" xmlns:wne="http://schemas.microsoft.com/office/word/2006/wordml" xmlns:wps="http://schemas.microsoft.com/office/word/2010/wordprocessingShape" mc:Ignorable="w14 w15 w16se w16cid wp14">
   <w:footnote w:type="separator" w:id="-1">
     <w:p>
       <w:pPr>
@@ -13084,7 +13335,7 @@
 </file>
 
 <file path=word/header1.xml><?xml version="1.0" encoding="utf-8"?>
-<w:hdr xmlns:wpc="http://schemas.microsoft.com/office/word/2010/wordprocessingCanvas" xmlns:cx="http://schemas.microsoft.com/office/drawing/2014/chartex" xmlns:cx1="http://schemas.microsoft.com/office/drawing/2015/9/8/chartex" xmlns:cx2="http://schemas.microsoft.com/office/drawing/2015/10/21/chartex" xmlns:cx3="http://schemas.microsoft.com/office/drawing/2016/5/9/chartex" xmlns:cx4="http://schemas.microsoft.com/office/drawing/2016/5/10/chartex" xmlns:cx5="http://schemas.microsoft.com/office/drawing/2016/5/11/chartex" xmlns:cx6="http://schemas.microsoft.com/office/drawing/2016/5/12/chartex" xmlns:cx7="http://schemas.microsoft.com/office/drawing/2016/5/13/chartex" xmlns:cx8="http://schemas.microsoft.com/office/drawing/2016/5/14/chartex" xmlns:mc="http://schemas.openxmlformats.org/markup-compatibility/2006" xmlns:aink="http://schemas.microsoft.com/office/drawing/2016/ink" xmlns:am3d="http://schemas.microsoft.com/office/drawing/2017/model3d" xmlns:o="urn:schemas-microsoft-com:office:office" xmlns:oel="http://schemas.microsoft.com/office/2019/extlst" xmlns:r="http://schemas.openxmlformats.org/officeDocument/2006/relationships" xmlns:m="http://schemas.openxmlformats.org/officeDocument/2006/math" xmlns:v="urn:schemas-microsoft-com:vml" xmlns:wp14="http://schemas.microsoft.com/office/word/2010/wordprocessingDrawing" xmlns:wp="http://schemas.openxmlformats.org/drawingml/2006/wordprocessingDrawing" xmlns:w10="urn:schemas-microsoft-com:office:word" xmlns:w="http://schemas.openxmlformats.org/wordprocessingml/2006/main" xmlns:w14="http://schemas.microsoft.com/office/word/2010/wordml" xmlns:w15="http://schemas.microsoft.com/office/word/2012/wordml" xmlns:w16cex="http://schemas.microsoft.com/office/word/2018/wordml/cex" xmlns:w16cid="http://schemas.microsoft.com/office/word/2016/wordml/cid" xmlns:w16="http://schemas.microsoft.com/office/word/2018/wordml" xmlns:w16du="http://schemas.microsoft.com/office/word/2023/wordml/word16du" xmlns:w16sdtdh="http://schemas.microsoft.com/office/word/2020/wordml/sdtdatahash" xmlns:w16sdtfl="http://schemas.microsoft.com/office/word/2024/wordml/sdtformatlock" xmlns:w16se="http://schemas.microsoft.com/office/word/2015/wordml/symex" xmlns:wpg="http://schemas.microsoft.com/office/word/2010/wordprocessingGroup" xmlns:wpi="http://schemas.microsoft.com/office/word/2010/wordprocessingInk" xmlns:wne="http://schemas.microsoft.com/office/word/2006/wordml" xmlns:wps="http://schemas.microsoft.com/office/word/2010/wordprocessingShape" mc:Ignorable="w14 w15 w16se w16cid w16 w16cex w16sdtdh w16sdtfl w16du wp14">
+<w:hdr xmlns:wpc="http://schemas.microsoft.com/office/word/2010/wordprocessingCanvas" xmlns:cx="http://schemas.microsoft.com/office/drawing/2014/chartex" xmlns:cx1="http://schemas.microsoft.com/office/drawing/2015/9/8/chartex" xmlns:cx2="http://schemas.microsoft.com/office/drawing/2015/10/21/chartex" xmlns:cx3="http://schemas.microsoft.com/office/drawing/2016/5/9/chartex" xmlns:cx4="http://schemas.microsoft.com/office/drawing/2016/5/10/chartex" xmlns:cx5="http://schemas.microsoft.com/office/drawing/2016/5/11/chartex" xmlns:cx6="http://schemas.microsoft.com/office/drawing/2016/5/12/chartex" xmlns:cx7="http://schemas.microsoft.com/office/drawing/2016/5/13/chartex" xmlns:cx8="http://schemas.microsoft.com/office/drawing/2016/5/14/chartex" xmlns:mc="http://schemas.openxmlformats.org/markup-compatibility/2006" xmlns:aink="http://schemas.microsoft.com/office/drawing/2016/ink" xmlns:am3d="http://schemas.microsoft.com/office/drawing/2017/model3d" xmlns:o="urn:schemas-microsoft-com:office:office" xmlns:r="http://schemas.openxmlformats.org/officeDocument/2006/relationships" xmlns:m="http://schemas.openxmlformats.org/officeDocument/2006/math" xmlns:v="urn:schemas-microsoft-com:vml" xmlns:wp14="http://schemas.microsoft.com/office/word/2010/wordprocessingDrawing" xmlns:wp="http://schemas.openxmlformats.org/drawingml/2006/wordprocessingDrawing" xmlns:w10="urn:schemas-microsoft-com:office:word" xmlns:w="http://schemas.openxmlformats.org/wordprocessingml/2006/main" xmlns:w14="http://schemas.microsoft.com/office/word/2010/wordml" xmlns:w15="http://schemas.microsoft.com/office/word/2012/wordml" xmlns:w16cid="http://schemas.microsoft.com/office/word/2016/wordml/cid" xmlns:w16se="http://schemas.microsoft.com/office/word/2015/wordml/symex" xmlns:wpg="http://schemas.microsoft.com/office/word/2010/wordprocessingGroup" xmlns:wpi="http://schemas.microsoft.com/office/word/2010/wordprocessingInk" xmlns:wne="http://schemas.microsoft.com/office/word/2006/wordml" xmlns:wps="http://schemas.microsoft.com/office/word/2010/wordprocessingShape" mc:Ignorable="w14 w15 w16se w16cid wp14">
   <w:p>
     <w:pPr>
       <w:pStyle w:val="Kopfzeile"/>
@@ -13094,7 +13345,7 @@
 </file>
 
 <file path=word/header2.xml><?xml version="1.0" encoding="utf-8"?>
-<w:hdr xmlns:wpc="http://schemas.microsoft.com/office/word/2010/wordprocessingCanvas" xmlns:cx="http://schemas.microsoft.com/office/drawing/2014/chartex" xmlns:cx1="http://schemas.microsoft.com/office/drawing/2015/9/8/chartex" xmlns:cx2="http://schemas.microsoft.com/office/drawing/2015/10/21/chartex" xmlns:cx3="http://schemas.microsoft.com/office/drawing/2016/5/9/chartex" xmlns:cx4="http://schemas.microsoft.com/office/drawing/2016/5/10/chartex" xmlns:cx5="http://schemas.microsoft.com/office/drawing/2016/5/11/chartex" xmlns:cx6="http://schemas.microsoft.com/office/drawing/2016/5/12/chartex" xmlns:cx7="http://schemas.microsoft.com/office/drawing/2016/5/13/chartex" xmlns:cx8="http://schemas.microsoft.com/office/drawing/2016/5/14/chartex" xmlns:mc="http://schemas.openxmlformats.org/markup-compatibility/2006" xmlns:aink="http://schemas.microsoft.com/office/drawing/2016/ink" xmlns:am3d="http://schemas.microsoft.com/office/drawing/2017/model3d" xmlns:o="urn:schemas-microsoft-com:office:office" xmlns:oel="http://schemas.microsoft.com/office/2019/extlst" xmlns:r="http://schemas.openxmlformats.org/officeDocument/2006/relationships" xmlns:m="http://schemas.openxmlformats.org/officeDocument/2006/math" xmlns:v="urn:schemas-microsoft-com:vml" xmlns:wp14="http://schemas.microsoft.com/office/word/2010/wordprocessingDrawing" xmlns:wp="http://schemas.openxmlformats.org/drawingml/2006/wordprocessingDrawing" xmlns:w10="urn:schemas-microsoft-com:office:word" xmlns:w="http://schemas.openxmlformats.org/wordprocessingml/2006/main" xmlns:w14="http://schemas.microsoft.com/office/word/2010/wordml" xmlns:w15="http://schemas.microsoft.com/office/word/2012/wordml" xmlns:w16cex="http://schemas.microsoft.com/office/word/2018/wordml/cex" xmlns:w16cid="http://schemas.microsoft.com/office/word/2016/wordml/cid" xmlns:w16="http://schemas.microsoft.com/office/word/2018/wordml" xmlns:w16du="http://schemas.microsoft.com/office/word/2023/wordml/word16du" xmlns:w16sdtdh="http://schemas.microsoft.com/office/word/2020/wordml/sdtdatahash" xmlns:w16sdtfl="http://schemas.microsoft.com/office/word/2024/wordml/sdtformatlock" xmlns:w16se="http://schemas.microsoft.com/office/word/2015/wordml/symex" xmlns:wpg="http://schemas.microsoft.com/office/word/2010/wordprocessingGroup" xmlns:wpi="http://schemas.microsoft.com/office/word/2010/wordprocessingInk" xmlns:wne="http://schemas.microsoft.com/office/word/2006/wordml" xmlns:wps="http://schemas.microsoft.com/office/word/2010/wordprocessingShape" mc:Ignorable="w14 w15 w16se w16cid w16 w16cex w16sdtdh w16sdtfl w16du wp14">
+<w:hdr xmlns:wpc="http://schemas.microsoft.com/office/word/2010/wordprocessingCanvas" xmlns:cx="http://schemas.microsoft.com/office/drawing/2014/chartex" xmlns:cx1="http://schemas.microsoft.com/office/drawing/2015/9/8/chartex" xmlns:cx2="http://schemas.microsoft.com/office/drawing/2015/10/21/chartex" xmlns:cx3="http://schemas.microsoft.com/office/drawing/2016/5/9/chartex" xmlns:cx4="http://schemas.microsoft.com/office/drawing/2016/5/10/chartex" xmlns:cx5="http://schemas.microsoft.com/office/drawing/2016/5/11/chartex" xmlns:cx6="http://schemas.microsoft.com/office/drawing/2016/5/12/chartex" xmlns:cx7="http://schemas.microsoft.com/office/drawing/2016/5/13/chartex" xmlns:cx8="http://schemas.microsoft.com/office/drawing/2016/5/14/chartex" xmlns:mc="http://schemas.openxmlformats.org/markup-compatibility/2006" xmlns:aink="http://schemas.microsoft.com/office/drawing/2016/ink" xmlns:am3d="http://schemas.microsoft.com/office/drawing/2017/model3d" xmlns:o="urn:schemas-microsoft-com:office:office" xmlns:r="http://schemas.openxmlformats.org/officeDocument/2006/relationships" xmlns:m="http://schemas.openxmlformats.org/officeDocument/2006/math" xmlns:v="urn:schemas-microsoft-com:vml" xmlns:wp14="http://schemas.microsoft.com/office/word/2010/wordprocessingDrawing" xmlns:wp="http://schemas.openxmlformats.org/drawingml/2006/wordprocessingDrawing" xmlns:w10="urn:schemas-microsoft-com:office:word" xmlns:w="http://schemas.openxmlformats.org/wordprocessingml/2006/main" xmlns:w14="http://schemas.microsoft.com/office/word/2010/wordml" xmlns:w15="http://schemas.microsoft.com/office/word/2012/wordml" xmlns:w16cid="http://schemas.microsoft.com/office/word/2016/wordml/cid" xmlns:w16se="http://schemas.microsoft.com/office/word/2015/wordml/symex" xmlns:wpg="http://schemas.microsoft.com/office/word/2010/wordprocessingGroup" xmlns:wpi="http://schemas.microsoft.com/office/word/2010/wordprocessingInk" xmlns:wne="http://schemas.microsoft.com/office/word/2006/wordml" xmlns:wps="http://schemas.microsoft.com/office/word/2010/wordprocessingShape" mc:Ignorable="w14 w15 w16se w16cid wp14">
   <w:p>
     <w:pPr>
       <w:pStyle w:val="Kopfzeile"/>
@@ -13104,7 +13355,7 @@
 </file>
 
 <file path=word/header3.xml><?xml version="1.0" encoding="utf-8"?>
-<w:hdr xmlns:wpc="http://schemas.microsoft.com/office/word/2010/wordprocessingCanvas" xmlns:cx="http://schemas.microsoft.com/office/drawing/2014/chartex" xmlns:cx1="http://schemas.microsoft.com/office/drawing/2015/9/8/chartex" xmlns:cx2="http://schemas.microsoft.com/office/drawing/2015/10/21/chartex" xmlns:cx3="http://schemas.microsoft.com/office/drawing/2016/5/9/chartex" xmlns:cx4="http://schemas.microsoft.com/office/drawing/2016/5/10/chartex" xmlns:cx5="http://schemas.microsoft.com/office/drawing/2016/5/11/chartex" xmlns:cx6="http://schemas.microsoft.com/office/drawing/2016/5/12/chartex" xmlns:cx7="http://schemas.microsoft.com/office/drawing/2016/5/13/chartex" xmlns:cx8="http://schemas.microsoft.com/office/drawing/2016/5/14/chartex" xmlns:mc="http://schemas.openxmlformats.org/markup-compatibility/2006" xmlns:aink="http://schemas.microsoft.com/office/drawing/2016/ink" xmlns:am3d="http://schemas.microsoft.com/office/drawing/2017/model3d" xmlns:o="urn:schemas-microsoft-com:office:office" xmlns:oel="http://schemas.microsoft.com/office/2019/extlst" xmlns:r="http://schemas.openxmlformats.org/officeDocument/2006/relationships" xmlns:m="http://schemas.openxmlformats.org/officeDocument/2006/math" xmlns:v="urn:schemas-microsoft-com:vml" xmlns:wp14="http://schemas.microsoft.com/office/word/2010/wordprocessingDrawing" xmlns:wp="http://schemas.openxmlformats.org/drawingml/2006/wordprocessingDrawing" xmlns:w10="urn:schemas-microsoft-com:office:word" xmlns:w="http://schemas.openxmlformats.org/wordprocessingml/2006/main" xmlns:w14="http://schemas.microsoft.com/office/word/2010/wordml" xmlns:w15="http://schemas.microsoft.com/office/word/2012/wordml" xmlns:w16cex="http://schemas.microsoft.com/office/word/2018/wordml/cex" xmlns:w16cid="http://schemas.microsoft.com/office/word/2016/wordml/cid" xmlns:w16="http://schemas.microsoft.com/office/word/2018/wordml" xmlns:w16du="http://schemas.microsoft.com/office/word/2023/wordml/word16du" xmlns:w16sdtdh="http://schemas.microsoft.com/office/word/2020/wordml/sdtdatahash" xmlns:w16sdtfl="http://schemas.microsoft.com/office/word/2024/wordml/sdtformatlock" xmlns:w16se="http://schemas.microsoft.com/office/word/2015/wordml/symex" xmlns:wpg="http://schemas.microsoft.com/office/word/2010/wordprocessingGroup" xmlns:wpi="http://schemas.microsoft.com/office/word/2010/wordprocessingInk" xmlns:wne="http://schemas.microsoft.com/office/word/2006/wordml" xmlns:wps="http://schemas.microsoft.com/office/word/2010/wordprocessingShape" mc:Ignorable="w14 w15 w16se w16cid w16 w16cex w16sdtdh w16sdtfl w16du wp14">
+<w:hdr xmlns:wpc="http://schemas.microsoft.com/office/word/2010/wordprocessingCanvas" xmlns:cx="http://schemas.microsoft.com/office/drawing/2014/chartex" xmlns:cx1="http://schemas.microsoft.com/office/drawing/2015/9/8/chartex" xmlns:cx2="http://schemas.microsoft.com/office/drawing/2015/10/21/chartex" xmlns:cx3="http://schemas.microsoft.com/office/drawing/2016/5/9/chartex" xmlns:cx4="http://schemas.microsoft.com/office/drawing/2016/5/10/chartex" xmlns:cx5="http://schemas.microsoft.com/office/drawing/2016/5/11/chartex" xmlns:cx6="http://schemas.microsoft.com/office/drawing/2016/5/12/chartex" xmlns:cx7="http://schemas.microsoft.com/office/drawing/2016/5/13/chartex" xmlns:cx8="http://schemas.microsoft.com/office/drawing/2016/5/14/chartex" xmlns:mc="http://schemas.openxmlformats.org/markup-compatibility/2006" xmlns:aink="http://schemas.microsoft.com/office/drawing/2016/ink" xmlns:am3d="http://schemas.microsoft.com/office/drawing/2017/model3d" xmlns:o="urn:schemas-microsoft-com:office:office" xmlns:r="http://schemas.openxmlformats.org/officeDocument/2006/relationships" xmlns:m="http://schemas.openxmlformats.org/officeDocument/2006/math" xmlns:v="urn:schemas-microsoft-com:vml" xmlns:wp14="http://schemas.microsoft.com/office/word/2010/wordprocessingDrawing" xmlns:wp="http://schemas.openxmlformats.org/drawingml/2006/wordprocessingDrawing" xmlns:w10="urn:schemas-microsoft-com:office:word" xmlns:w="http://schemas.openxmlformats.org/wordprocessingml/2006/main" xmlns:w14="http://schemas.microsoft.com/office/word/2010/wordml" xmlns:w15="http://schemas.microsoft.com/office/word/2012/wordml" xmlns:w16cid="http://schemas.microsoft.com/office/word/2016/wordml/cid" xmlns:w16se="http://schemas.microsoft.com/office/word/2015/wordml/symex" xmlns:wpg="http://schemas.microsoft.com/office/word/2010/wordprocessingGroup" xmlns:wpi="http://schemas.microsoft.com/office/word/2010/wordprocessingInk" xmlns:wne="http://schemas.microsoft.com/office/word/2006/wordml" xmlns:wps="http://schemas.microsoft.com/office/word/2010/wordprocessingShape" mc:Ignorable="w14 w15 w16se w16cid wp14">
   <w:p>
     <w:pPr>
       <w:pStyle w:val="Kopfzeile"/>
@@ -13114,7 +13365,7 @@
 </file>
 
 <file path=word/numbering.xml><?xml version="1.0" encoding="utf-8"?>
-<w:numbering xmlns:wpc="http://schemas.microsoft.com/office/word/2010/wordprocessingCanvas" xmlns:cx="http://schemas.microsoft.com/office/drawing/2014/chartex" xmlns:cx1="http://schemas.microsoft.com/office/drawing/2015/9/8/chartex" xmlns:cx2="http://schemas.microsoft.com/office/drawing/2015/10/21/chartex" xmlns:cx3="http://schemas.microsoft.com/office/drawing/2016/5/9/chartex" xmlns:cx4="http://schemas.microsoft.com/office/drawing/2016/5/10/chartex" xmlns:cx5="http://schemas.microsoft.com/office/drawing/2016/5/11/chartex" xmlns:cx6="http://schemas.microsoft.com/office/drawing/2016/5/12/chartex" xmlns:cx7="http://schemas.microsoft.com/office/drawing/2016/5/13/chartex" xmlns:cx8="http://schemas.microsoft.com/office/drawing/2016/5/14/chartex" xmlns:mc="http://schemas.openxmlformats.org/markup-compatibility/2006" xmlns:aink="http://schemas.microsoft.com/office/drawing/2016/ink" xmlns:am3d="http://schemas.microsoft.com/office/drawing/2017/model3d" xmlns:o="urn:schemas-microsoft-com:office:office" xmlns:oel="http://schemas.microsoft.com/office/2019/extlst" xmlns:r="http://schemas.openxmlformats.org/officeDocument/2006/relationships" xmlns:m="http://schemas.openxmlformats.org/officeDocument/2006/math" xmlns:v="urn:schemas-microsoft-com:vml" xmlns:wp14="http://schemas.microsoft.com/office/word/2010/wordprocessingDrawing" xmlns:wp="http://schemas.openxmlformats.org/drawingml/2006/wordprocessingDrawing" xmlns:w10="urn:schemas-microsoft-com:office:word" xmlns:w="http://schemas.openxmlformats.org/wordprocessingml/2006/main" xmlns:w14="http://schemas.microsoft.com/office/word/2010/wordml" xmlns:w15="http://schemas.microsoft.com/office/word/2012/wordml" xmlns:w16cex="http://schemas.microsoft.com/office/word/2018/wordml/cex" xmlns:w16cid="http://schemas.microsoft.com/office/word/2016/wordml/cid" xmlns:w16="http://schemas.microsoft.com/office/word/2018/wordml" xmlns:w16du="http://schemas.microsoft.com/office/word/2023/wordml/word16du" xmlns:w16sdtdh="http://schemas.microsoft.com/office/word/2020/wordml/sdtdatahash" xmlns:w16sdtfl="http://schemas.microsoft.com/office/word/2024/wordml/sdtformatlock" xmlns:w16se="http://schemas.microsoft.com/office/word/2015/wordml/symex" xmlns:wpg="http://schemas.microsoft.com/office/word/2010/wordprocessingGroup" xmlns:wpi="http://schemas.microsoft.com/office/word/2010/wordprocessingInk" xmlns:wne="http://schemas.microsoft.com/office/word/2006/wordml" xmlns:wps="http://schemas.microsoft.com/office/word/2010/wordprocessingShape" mc:Ignorable="w14 w15 w16se w16cid w16 w16cex w16sdtdh w16sdtfl w16du wp14">
+<w:numbering xmlns:wpc="http://schemas.microsoft.com/office/word/2010/wordprocessingCanvas" xmlns:cx="http://schemas.microsoft.com/office/drawing/2014/chartex" xmlns:cx1="http://schemas.microsoft.com/office/drawing/2015/9/8/chartex" xmlns:cx2="http://schemas.microsoft.com/office/drawing/2015/10/21/chartex" xmlns:cx3="http://schemas.microsoft.com/office/drawing/2016/5/9/chartex" xmlns:cx4="http://schemas.microsoft.com/office/drawing/2016/5/10/chartex" xmlns:cx5="http://schemas.microsoft.com/office/drawing/2016/5/11/chartex" xmlns:cx6="http://schemas.microsoft.com/office/drawing/2016/5/12/chartex" xmlns:cx7="http://schemas.microsoft.com/office/drawing/2016/5/13/chartex" xmlns:cx8="http://schemas.microsoft.com/office/drawing/2016/5/14/chartex" xmlns:mc="http://schemas.openxmlformats.org/markup-compatibility/2006" xmlns:aink="http://schemas.microsoft.com/office/drawing/2016/ink" xmlns:am3d="http://schemas.microsoft.com/office/drawing/2017/model3d" xmlns:o="urn:schemas-microsoft-com:office:office" xmlns:r="http://schemas.openxmlformats.org/officeDocument/2006/relationships" xmlns:m="http://schemas.openxmlformats.org/officeDocument/2006/math" xmlns:v="urn:schemas-microsoft-com:vml" xmlns:wp14="http://schemas.microsoft.com/office/word/2010/wordprocessingDrawing" xmlns:wp="http://schemas.openxmlformats.org/drawingml/2006/wordprocessingDrawing" xmlns:w10="urn:schemas-microsoft-com:office:word" xmlns:w="http://schemas.openxmlformats.org/wordprocessingml/2006/main" xmlns:w14="http://schemas.microsoft.com/office/word/2010/wordml" xmlns:w15="http://schemas.microsoft.com/office/word/2012/wordml" xmlns:w16cid="http://schemas.microsoft.com/office/word/2016/wordml/cid" xmlns:w16se="http://schemas.microsoft.com/office/word/2015/wordml/symex" xmlns:wpg="http://schemas.microsoft.com/office/word/2010/wordprocessingGroup" xmlns:wpi="http://schemas.microsoft.com/office/word/2010/wordprocessingInk" xmlns:wne="http://schemas.microsoft.com/office/word/2006/wordml" xmlns:wps="http://schemas.microsoft.com/office/word/2010/wordprocessingShape" mc:Ignorable="w14 w15 w16se w16cid wp14">
   <w:abstractNum w:abstractNumId="0" w15:restartNumberingAfterBreak="0">
     <w:nsid w:val="23634F93"/>
     <w:multiLevelType w:val="hybridMultilevel"/>
@@ -13740,13 +13991,13 @@
       </w:pPr>
     </w:lvl>
   </w:abstractNum>
-  <w:num w:numId="1" w16cid:durableId="684675829">
+  <w:num w:numId="1">
     <w:abstractNumId w:val="4"/>
   </w:num>
-  <w:num w:numId="2" w16cid:durableId="1745489650">
+  <w:num w:numId="2">
     <w:abstractNumId w:val="2"/>
   </w:num>
-  <w:num w:numId="3" w16cid:durableId="270628647">
+  <w:num w:numId="3">
     <w:abstractNumId w:val="2"/>
     <w:lvlOverride w:ilvl="1">
       <w:lvl w:ilvl="1">
@@ -13766,7 +14017,7 @@
       </w:lvl>
     </w:lvlOverride>
   </w:num>
-  <w:num w:numId="4" w16cid:durableId="2103527280">
+  <w:num w:numId="4">
     <w:abstractNumId w:val="2"/>
     <w:lvlOverride w:ilvl="1">
       <w:lvl w:ilvl="1">
@@ -13786,7 +14037,7 @@
       </w:lvl>
     </w:lvlOverride>
   </w:num>
-  <w:num w:numId="5" w16cid:durableId="1591236728">
+  <w:num w:numId="5">
     <w:abstractNumId w:val="2"/>
     <w:lvlOverride w:ilvl="1">
       <w:lvl w:ilvl="1">
@@ -13806,7 +14057,7 @@
       </w:lvl>
     </w:lvlOverride>
   </w:num>
-  <w:num w:numId="6" w16cid:durableId="981230451">
+  <w:num w:numId="6">
     <w:abstractNumId w:val="2"/>
     <w:lvlOverride w:ilvl="1">
       <w:lvl w:ilvl="1">
@@ -13826,7 +14077,7 @@
       </w:lvl>
     </w:lvlOverride>
   </w:num>
-  <w:num w:numId="7" w16cid:durableId="956519498">
+  <w:num w:numId="7">
     <w:abstractNumId w:val="2"/>
     <w:lvlOverride w:ilvl="1">
       <w:lvl w:ilvl="1">
@@ -13846,7 +14097,7 @@
       </w:lvl>
     </w:lvlOverride>
   </w:num>
-  <w:num w:numId="8" w16cid:durableId="1459954150">
+  <w:num w:numId="8">
     <w:abstractNumId w:val="2"/>
     <w:lvlOverride w:ilvl="1">
       <w:lvl w:ilvl="1">
@@ -13866,7 +14117,7 @@
       </w:lvl>
     </w:lvlOverride>
   </w:num>
-  <w:num w:numId="9" w16cid:durableId="550656113">
+  <w:num w:numId="9">
     <w:abstractNumId w:val="2"/>
     <w:lvlOverride w:ilvl="1">
       <w:lvl w:ilvl="1">
@@ -13886,7 +14137,7 @@
       </w:lvl>
     </w:lvlOverride>
   </w:num>
-  <w:num w:numId="10" w16cid:durableId="1546720327">
+  <w:num w:numId="10">
     <w:abstractNumId w:val="2"/>
     <w:lvlOverride w:ilvl="1">
       <w:lvl w:ilvl="1">
@@ -13906,10 +14157,10 @@
       </w:lvl>
     </w:lvlOverride>
   </w:num>
-  <w:num w:numId="11" w16cid:durableId="272590628">
+  <w:num w:numId="11">
     <w:abstractNumId w:val="1"/>
   </w:num>
-  <w:num w:numId="12" w16cid:durableId="1315836737">
+  <w:num w:numId="12">
     <w:abstractNumId w:val="1"/>
     <w:lvlOverride w:ilvl="1">
       <w:lvl w:ilvl="1">
@@ -13929,7 +14180,7 @@
       </w:lvl>
     </w:lvlOverride>
   </w:num>
-  <w:num w:numId="13" w16cid:durableId="102727443">
+  <w:num w:numId="13">
     <w:abstractNumId w:val="1"/>
     <w:lvlOverride w:ilvl="1">
       <w:lvl w:ilvl="1">
@@ -13949,7 +14200,7 @@
       </w:lvl>
     </w:lvlOverride>
   </w:num>
-  <w:num w:numId="14" w16cid:durableId="205291248">
+  <w:num w:numId="14">
     <w:abstractNumId w:val="1"/>
     <w:lvlOverride w:ilvl="1">
       <w:lvl w:ilvl="1">
@@ -13969,10 +14220,10 @@
       </w:lvl>
     </w:lvlOverride>
   </w:num>
-  <w:num w:numId="15" w16cid:durableId="633295672">
+  <w:num w:numId="15">
     <w:abstractNumId w:val="3"/>
   </w:num>
-  <w:num w:numId="16" w16cid:durableId="1512800143">
+  <w:num w:numId="16">
     <w:abstractNumId w:val="3"/>
     <w:lvlOverride w:ilvl="1">
       <w:lvl w:ilvl="1">
@@ -13992,7 +14243,7 @@
       </w:lvl>
     </w:lvlOverride>
   </w:num>
-  <w:num w:numId="17" w16cid:durableId="992686282">
+  <w:num w:numId="17">
     <w:abstractNumId w:val="3"/>
     <w:lvlOverride w:ilvl="1">
       <w:lvl w:ilvl="1">
@@ -14012,7 +14263,7 @@
       </w:lvl>
     </w:lvlOverride>
   </w:num>
-  <w:num w:numId="18" w16cid:durableId="2031832533">
+  <w:num w:numId="18">
     <w:abstractNumId w:val="3"/>
     <w:lvlOverride w:ilvl="1">
       <w:lvl w:ilvl="1">
@@ -14032,14 +14283,14 @@
       </w:lvl>
     </w:lvlOverride>
   </w:num>
-  <w:num w:numId="19" w16cid:durableId="826090485">
+  <w:num w:numId="19">
     <w:abstractNumId w:val="0"/>
   </w:num>
 </w:numbering>
 </file>
 
 <file path=word/styles.xml><?xml version="1.0" encoding="utf-8"?>
-<w:styles xmlns:mc="http://schemas.openxmlformats.org/markup-compatibility/2006" xmlns:r="http://schemas.openxmlformats.org/officeDocument/2006/relationships" xmlns:w="http://schemas.openxmlformats.org/wordprocessingml/2006/main" xmlns:w14="http://schemas.microsoft.com/office/word/2010/wordml" xmlns:w15="http://schemas.microsoft.com/office/word/2012/wordml" xmlns:w16cex="http://schemas.microsoft.com/office/word/2018/wordml/cex" xmlns:w16cid="http://schemas.microsoft.com/office/word/2016/wordml/cid" xmlns:w16="http://schemas.microsoft.com/office/word/2018/wordml" xmlns:w16du="http://schemas.microsoft.com/office/word/2023/wordml/word16du" xmlns:w16sdtdh="http://schemas.microsoft.com/office/word/2020/wordml/sdtdatahash" xmlns:w16sdtfl="http://schemas.microsoft.com/office/word/2024/wordml/sdtformatlock" xmlns:w16se="http://schemas.microsoft.com/office/word/2015/wordml/symex" mc:Ignorable="w14 w15 w16se w16cid w16 w16cex w16sdtdh w16sdtfl w16du">
+<w:styles xmlns:mc="http://schemas.openxmlformats.org/markup-compatibility/2006" xmlns:r="http://schemas.openxmlformats.org/officeDocument/2006/relationships" xmlns:w="http://schemas.openxmlformats.org/wordprocessingml/2006/main" xmlns:w14="http://schemas.microsoft.com/office/word/2010/wordml" xmlns:w15="http://schemas.microsoft.com/office/word/2012/wordml" xmlns:w16cid="http://schemas.microsoft.com/office/word/2016/wordml/cid" xmlns:w16se="http://schemas.microsoft.com/office/word/2015/wordml/symex" mc:Ignorable="w14 w15 w16se w16cid">
   <w:docDefaults>
     <w:rPrDefault>
       <w:rPr>
@@ -14057,7 +14308,7 @@
       </w:pPr>
     </w:pPrDefault>
   </w:docDefaults>
-  <w:latentStyles w:defLockedState="0" w:defUIPriority="99" w:defSemiHidden="0" w:defUnhideWhenUsed="0" w:defQFormat="0" w:count="376">
+  <w:latentStyles w:defLockedState="0" w:defUIPriority="99" w:defSemiHidden="0" w:defUnhideWhenUsed="0" w:defQFormat="0" w:count="375">
     <w:lsdException w:name="Normal" w:uiPriority="0" w:qFormat="1"/>
     <w:lsdException w:name="heading 1" w:uiPriority="9" w:qFormat="1"/>
     <w:lsdException w:name="heading 2" w:semiHidden="1" w:uiPriority="9" w:unhideWhenUsed="1" w:qFormat="1"/>
@@ -14433,7 +14684,6 @@
     <w:lsdException w:name="Smart Hyperlink" w:semiHidden="1" w:unhideWhenUsed="1"/>
     <w:lsdException w:name="Hashtag" w:semiHidden="1" w:unhideWhenUsed="1"/>
     <w:lsdException w:name="Unresolved Mention" w:semiHidden="1" w:unhideWhenUsed="1"/>
-    <w:lsdException w:name="Smart Link" w:semiHidden="1" w:unhideWhenUsed="1"/>
   </w:latentStyles>
   <w:style w:type="paragraph" w:default="1" w:styleId="Standard">
     <w:name w:val="Normal"/>
@@ -14657,6 +14907,7 @@
   <w:style w:type="character" w:default="1" w:styleId="Absatz-Standardschriftart">
     <w:name w:val="Default Paragraph Font"/>
     <w:uiPriority w:val="1"/>
+    <w:semiHidden/>
     <w:unhideWhenUsed/>
   </w:style>
   <w:style w:type="table" w:default="1" w:styleId="NormaleTabelle">
@@ -15351,7 +15602,7 @@
 </file>
 
 <file path=word/glossary/document.xml><?xml version="1.0" encoding="utf-8"?>
-<w:glossaryDocument xmlns:wpc="http://schemas.microsoft.com/office/word/2010/wordprocessingCanvas" xmlns:cx="http://schemas.microsoft.com/office/drawing/2014/chartex" xmlns:cx1="http://schemas.microsoft.com/office/drawing/2015/9/8/chartex" xmlns:cx2="http://schemas.microsoft.com/office/drawing/2015/10/21/chartex" xmlns:cx3="http://schemas.microsoft.com/office/drawing/2016/5/9/chartex" xmlns:cx4="http://schemas.microsoft.com/office/drawing/2016/5/10/chartex" xmlns:cx5="http://schemas.microsoft.com/office/drawing/2016/5/11/chartex" xmlns:cx6="http://schemas.microsoft.com/office/drawing/2016/5/12/chartex" xmlns:cx7="http://schemas.microsoft.com/office/drawing/2016/5/13/chartex" xmlns:cx8="http://schemas.microsoft.com/office/drawing/2016/5/14/chartex" xmlns:mc="http://schemas.openxmlformats.org/markup-compatibility/2006" xmlns:aink="http://schemas.microsoft.com/office/drawing/2016/ink" xmlns:am3d="http://schemas.microsoft.com/office/drawing/2017/model3d" xmlns:o="urn:schemas-microsoft-com:office:office" xmlns:oel="http://schemas.microsoft.com/office/2019/extlst" xmlns:r="http://schemas.openxmlformats.org/officeDocument/2006/relationships" xmlns:m="http://schemas.openxmlformats.org/officeDocument/2006/math" xmlns:v="urn:schemas-microsoft-com:vml" xmlns:wp14="http://schemas.microsoft.com/office/word/2010/wordprocessingDrawing" xmlns:wp="http://schemas.openxmlformats.org/drawingml/2006/wordprocessingDrawing" xmlns:w10="urn:schemas-microsoft-com:office:word" xmlns:w="http://schemas.openxmlformats.org/wordprocessingml/2006/main" xmlns:w14="http://schemas.microsoft.com/office/word/2010/wordml" xmlns:w15="http://schemas.microsoft.com/office/word/2012/wordml" xmlns:w16cex="http://schemas.microsoft.com/office/word/2018/wordml/cex" xmlns:w16cid="http://schemas.microsoft.com/office/word/2016/wordml/cid" xmlns:w16="http://schemas.microsoft.com/office/word/2018/wordml" xmlns:w16du="http://schemas.microsoft.com/office/word/2023/wordml/word16du" xmlns:w16sdtdh="http://schemas.microsoft.com/office/word/2020/wordml/sdtdatahash" xmlns:w16sdtfl="http://schemas.microsoft.com/office/word/2024/wordml/sdtformatlock" xmlns:w16se="http://schemas.microsoft.com/office/word/2015/wordml/symex" xmlns:wpg="http://schemas.microsoft.com/office/word/2010/wordprocessingGroup" xmlns:wpi="http://schemas.microsoft.com/office/word/2010/wordprocessingInk" xmlns:wne="http://schemas.microsoft.com/office/word/2006/wordml" xmlns:wps="http://schemas.microsoft.com/office/word/2010/wordprocessingShape" mc:Ignorable="w14 w15 w16se w16cid w16 w16cex w16sdtdh w16sdtfl w16du wp14">
+<w:glossaryDocument xmlns:wpc="http://schemas.microsoft.com/office/word/2010/wordprocessingCanvas" xmlns:cx="http://schemas.microsoft.com/office/drawing/2014/chartex" xmlns:cx1="http://schemas.microsoft.com/office/drawing/2015/9/8/chartex" xmlns:cx2="http://schemas.microsoft.com/office/drawing/2015/10/21/chartex" xmlns:cx3="http://schemas.microsoft.com/office/drawing/2016/5/9/chartex" xmlns:cx4="http://schemas.microsoft.com/office/drawing/2016/5/10/chartex" xmlns:cx5="http://schemas.microsoft.com/office/drawing/2016/5/11/chartex" xmlns:cx6="http://schemas.microsoft.com/office/drawing/2016/5/12/chartex" xmlns:cx7="http://schemas.microsoft.com/office/drawing/2016/5/13/chartex" xmlns:cx8="http://schemas.microsoft.com/office/drawing/2016/5/14/chartex" xmlns:mc="http://schemas.openxmlformats.org/markup-compatibility/2006" xmlns:aink="http://schemas.microsoft.com/office/drawing/2016/ink" xmlns:am3d="http://schemas.microsoft.com/office/drawing/2017/model3d" xmlns:o="urn:schemas-microsoft-com:office:office" xmlns:r="http://schemas.openxmlformats.org/officeDocument/2006/relationships" xmlns:m="http://schemas.openxmlformats.org/officeDocument/2006/math" xmlns:v="urn:schemas-microsoft-com:vml" xmlns:wp14="http://schemas.microsoft.com/office/word/2010/wordprocessingDrawing" xmlns:wp="http://schemas.openxmlformats.org/drawingml/2006/wordprocessingDrawing" xmlns:w10="urn:schemas-microsoft-com:office:word" xmlns:w="http://schemas.openxmlformats.org/wordprocessingml/2006/main" xmlns:w14="http://schemas.microsoft.com/office/word/2010/wordml" xmlns:w15="http://schemas.microsoft.com/office/word/2012/wordml" xmlns:w16cid="http://schemas.microsoft.com/office/word/2016/wordml/cid" xmlns:w16se="http://schemas.microsoft.com/office/word/2015/wordml/symex" xmlns:wpg="http://schemas.microsoft.com/office/word/2010/wordprocessingGroup" xmlns:wpi="http://schemas.microsoft.com/office/word/2010/wordprocessingInk" xmlns:wne="http://schemas.microsoft.com/office/word/2006/wordml" xmlns:wps="http://schemas.microsoft.com/office/word/2010/wordprocessingShape" mc:Ignorable="w14 w15 w16se w16cid wp14">
   <w:docParts>
     <w:docPart>
       <w:docPartPr>
@@ -15387,7 +15638,7 @@
 </file>
 
 <file path=word/glossary/fontTable.xml><?xml version="1.0" encoding="utf-8"?>
-<w:fonts xmlns:mc="http://schemas.openxmlformats.org/markup-compatibility/2006" xmlns:r="http://schemas.openxmlformats.org/officeDocument/2006/relationships" xmlns:w="http://schemas.openxmlformats.org/wordprocessingml/2006/main" xmlns:w14="http://schemas.microsoft.com/office/word/2010/wordml" xmlns:w15="http://schemas.microsoft.com/office/word/2012/wordml" xmlns:w16cex="http://schemas.microsoft.com/office/word/2018/wordml/cex" xmlns:w16cid="http://schemas.microsoft.com/office/word/2016/wordml/cid" xmlns:w16="http://schemas.microsoft.com/office/word/2018/wordml" xmlns:w16du="http://schemas.microsoft.com/office/word/2023/wordml/word16du" xmlns:w16sdtdh="http://schemas.microsoft.com/office/word/2020/wordml/sdtdatahash" xmlns:w16sdtfl="http://schemas.microsoft.com/office/word/2024/wordml/sdtformatlock" xmlns:w16se="http://schemas.microsoft.com/office/word/2015/wordml/symex" mc:Ignorable="w14 w15 w16se w16cid w16 w16cex w16sdtdh w16sdtfl w16du">
+<w:fonts xmlns:mc="http://schemas.openxmlformats.org/markup-compatibility/2006" xmlns:r="http://schemas.openxmlformats.org/officeDocument/2006/relationships" xmlns:w="http://schemas.openxmlformats.org/wordprocessingml/2006/main" xmlns:w14="http://schemas.microsoft.com/office/word/2010/wordml" xmlns:w15="http://schemas.microsoft.com/office/word/2012/wordml" xmlns:w16cid="http://schemas.microsoft.com/office/word/2016/wordml/cid" xmlns:w16se="http://schemas.microsoft.com/office/word/2015/wordml/symex" mc:Ignorable="w14 w15 w16se w16cid">
   <w:font w:name="Times New Roman">
     <w:panose1 w:val="02020603050405020304"/>
     <w:charset w:val="00"/>
@@ -15417,6 +15668,7 @@
     <w:sig w:usb0="00000000" w:usb1="10000000" w:usb2="00000000" w:usb3="00000000" w:csb0="80000000" w:csb1="00000000"/>
   </w:font>
   <w:font w:name="Aptos">
+    <w:altName w:val="Calibri"/>
     <w:charset w:val="00"/>
     <w:family w:val="swiss"/>
     <w:pitch w:val="variable"/>
@@ -15430,6 +15682,7 @@
     <w:sig w:usb0="E0002EFF" w:usb1="C000785B" w:usb2="00000009" w:usb3="00000000" w:csb0="000001FF" w:csb1="00000000"/>
   </w:font>
   <w:font w:name="Aptos Display">
+    <w:altName w:val="Calibri"/>
     <w:charset w:val="00"/>
     <w:family w:val="swiss"/>
     <w:pitch w:val="variable"/>
@@ -15453,7 +15706,7 @@
 </file>
 
 <file path=word/glossary/settings.xml><?xml version="1.0" encoding="utf-8"?>
-<w:settings xmlns:mc="http://schemas.openxmlformats.org/markup-compatibility/2006" xmlns:o="urn:schemas-microsoft-com:office:office" xmlns:r="http://schemas.openxmlformats.org/officeDocument/2006/relationships" xmlns:m="http://schemas.openxmlformats.org/officeDocument/2006/math" xmlns:v="urn:schemas-microsoft-com:vml" xmlns:w10="urn:schemas-microsoft-com:office:word" xmlns:w="http://schemas.openxmlformats.org/wordprocessingml/2006/main" xmlns:w14="http://schemas.microsoft.com/office/word/2010/wordml" xmlns:w15="http://schemas.microsoft.com/office/word/2012/wordml" xmlns:w16cex="http://schemas.microsoft.com/office/word/2018/wordml/cex" xmlns:w16cid="http://schemas.microsoft.com/office/word/2016/wordml/cid" xmlns:w16="http://schemas.microsoft.com/office/word/2018/wordml" xmlns:w16du="http://schemas.microsoft.com/office/word/2023/wordml/word16du" xmlns:w16sdtdh="http://schemas.microsoft.com/office/word/2020/wordml/sdtdatahash" xmlns:w16sdtfl="http://schemas.microsoft.com/office/word/2024/wordml/sdtformatlock" xmlns:w16se="http://schemas.microsoft.com/office/word/2015/wordml/symex" xmlns:sl="http://schemas.openxmlformats.org/schemaLibrary/2006/main" mc:Ignorable="w14 w15 w16se w16cid w16 w16cex w16sdtdh w16sdtfl w16du">
+<w:settings xmlns:mc="http://schemas.openxmlformats.org/markup-compatibility/2006" xmlns:o="urn:schemas-microsoft-com:office:office" xmlns:r="http://schemas.openxmlformats.org/officeDocument/2006/relationships" xmlns:m="http://schemas.openxmlformats.org/officeDocument/2006/math" xmlns:v="urn:schemas-microsoft-com:vml" xmlns:w10="urn:schemas-microsoft-com:office:word" xmlns:w="http://schemas.openxmlformats.org/wordprocessingml/2006/main" xmlns:w14="http://schemas.microsoft.com/office/word/2010/wordml" xmlns:w15="http://schemas.microsoft.com/office/word/2012/wordml" xmlns:w16cid="http://schemas.microsoft.com/office/word/2016/wordml/cid" xmlns:w16se="http://schemas.microsoft.com/office/word/2015/wordml/symex" xmlns:sl="http://schemas.openxmlformats.org/schemaLibrary/2006/main" mc:Ignorable="w14 w15 w16se w16cid">
   <w:view w:val="normal"/>
   <w:defaultTabStop w:val="708"/>
   <w:hyphenationZone w:val="425"/>
@@ -15476,6 +15729,7 @@
     <w:rsid w:val="00516574"/>
     <w:rsid w:val="006730F7"/>
     <w:rsid w:val="00846D93"/>
+    <w:rsid w:val="00B20BB0"/>
     <w:rsid w:val="00B50854"/>
     <w:rsid w:val="00C4247E"/>
     <w:rsid w:val="00C64BAF"/>
@@ -15508,7 +15762,7 @@
 </file>
 
 <file path=word/glossary/styles.xml><?xml version="1.0" encoding="utf-8"?>
-<w:styles xmlns:mc="http://schemas.openxmlformats.org/markup-compatibility/2006" xmlns:r="http://schemas.openxmlformats.org/officeDocument/2006/relationships" xmlns:w="http://schemas.openxmlformats.org/wordprocessingml/2006/main" xmlns:w14="http://schemas.microsoft.com/office/word/2010/wordml" xmlns:w15="http://schemas.microsoft.com/office/word/2012/wordml" xmlns:w16cex="http://schemas.microsoft.com/office/word/2018/wordml/cex" xmlns:w16cid="http://schemas.microsoft.com/office/word/2016/wordml/cid" xmlns:w16="http://schemas.microsoft.com/office/word/2018/wordml" xmlns:w16du="http://schemas.microsoft.com/office/word/2023/wordml/word16du" xmlns:w16sdtdh="http://schemas.microsoft.com/office/word/2020/wordml/sdtdatahash" xmlns:w16sdtfl="http://schemas.microsoft.com/office/word/2024/wordml/sdtformatlock" xmlns:w16se="http://schemas.microsoft.com/office/word/2015/wordml/symex" mc:Ignorable="w14 w15 w16se w16cid w16 w16cex w16sdtdh w16sdtfl w16du">
+<w:styles xmlns:mc="http://schemas.openxmlformats.org/markup-compatibility/2006" xmlns:r="http://schemas.openxmlformats.org/officeDocument/2006/relationships" xmlns:w="http://schemas.openxmlformats.org/wordprocessingml/2006/main" xmlns:w14="http://schemas.microsoft.com/office/word/2010/wordml" xmlns:w15="http://schemas.microsoft.com/office/word/2012/wordml" xmlns:w16cid="http://schemas.microsoft.com/office/word/2016/wordml/cid" xmlns:w16se="http://schemas.microsoft.com/office/word/2015/wordml/symex" mc:Ignorable="w14 w15 w16se w16cid">
   <w:docDefaults>
     <w:rPrDefault>
       <w:rPr>
@@ -15526,7 +15780,7 @@
       </w:pPr>
     </w:pPrDefault>
   </w:docDefaults>
-  <w:latentStyles w:defLockedState="0" w:defUIPriority="99" w:defSemiHidden="0" w:defUnhideWhenUsed="0" w:defQFormat="0" w:count="376">
+  <w:latentStyles w:defLockedState="0" w:defUIPriority="99" w:defSemiHidden="0" w:defUnhideWhenUsed="0" w:defQFormat="0" w:count="375">
     <w:lsdException w:name="Normal" w:uiPriority="0" w:qFormat="1"/>
     <w:lsdException w:name="heading 1" w:uiPriority="9" w:qFormat="1"/>
     <w:lsdException w:name="heading 2" w:semiHidden="1" w:uiPriority="9" w:unhideWhenUsed="1" w:qFormat="1"/>
@@ -15902,7 +16156,6 @@
     <w:lsdException w:name="Smart Hyperlink" w:semiHidden="1" w:unhideWhenUsed="1"/>
     <w:lsdException w:name="Hashtag" w:semiHidden="1" w:unhideWhenUsed="1"/>
     <w:lsdException w:name="Unresolved Mention" w:semiHidden="1" w:unhideWhenUsed="1"/>
-    <w:lsdException w:name="Smart Link" w:semiHidden="1" w:unhideWhenUsed="1"/>
   </w:latentStyles>
   <w:style w:type="paragraph" w:default="1" w:styleId="Standard">
     <w:name w:val="Normal"/>
@@ -15953,7 +16206,7 @@
 </file>
 
 <file path=word/glossary/webSettings.xml><?xml version="1.0" encoding="utf-8"?>
-<w:webSettings xmlns:mc="http://schemas.openxmlformats.org/markup-compatibility/2006" xmlns:r="http://schemas.openxmlformats.org/officeDocument/2006/relationships" xmlns:w="http://schemas.openxmlformats.org/wordprocessingml/2006/main" xmlns:w14="http://schemas.microsoft.com/office/word/2010/wordml" xmlns:w15="http://schemas.microsoft.com/office/word/2012/wordml" xmlns:w16cex="http://schemas.microsoft.com/office/word/2018/wordml/cex" xmlns:w16cid="http://schemas.microsoft.com/office/word/2016/wordml/cid" xmlns:w16="http://schemas.microsoft.com/office/word/2018/wordml" xmlns:w16du="http://schemas.microsoft.com/office/word/2023/wordml/word16du" xmlns:w16sdtdh="http://schemas.microsoft.com/office/word/2020/wordml/sdtdatahash" xmlns:w16sdtfl="http://schemas.microsoft.com/office/word/2024/wordml/sdtformatlock" xmlns:w16se="http://schemas.microsoft.com/office/word/2015/wordml/symex" mc:Ignorable="w14 w15 w16se w16cid w16 w16cex w16sdtdh w16sdtfl w16du">
+<w:webSettings xmlns:mc="http://schemas.openxmlformats.org/markup-compatibility/2006" xmlns:r="http://schemas.openxmlformats.org/officeDocument/2006/relationships" xmlns:w="http://schemas.openxmlformats.org/wordprocessingml/2006/main" xmlns:w14="http://schemas.microsoft.com/office/word/2010/wordml" xmlns:w15="http://schemas.microsoft.com/office/word/2012/wordml" xmlns:w16cid="http://schemas.microsoft.com/office/word/2016/wordml/cid" xmlns:w16se="http://schemas.microsoft.com/office/word/2015/wordml/symex" mc:Ignorable="w14 w15 w16se w16cid">
   <w:optimizeForBrowser/>
   <w:allowPNG/>
 </w:webSettings>
@@ -16259,7 +16512,7 @@
 </file>
 
 <file path=customXml/itemProps1.xml><?xml version="1.0" encoding="utf-8"?>
-<ds:datastoreItem xmlns:ds="http://schemas.openxmlformats.org/officeDocument/2006/customXml" ds:itemID="{E746A8AD-F57E-4DFA-A99D-DDF67B7D70F4}">
+<ds:datastoreItem xmlns:ds="http://schemas.openxmlformats.org/officeDocument/2006/customXml" ds:itemID="{DD7E1C5F-A367-449C-A69C-66FA7A41E6C9}">
   <ds:schemaRefs>
     <ds:schemaRef ds:uri="http://schemas.openxmlformats.org/officeDocument/2006/bibliography"/>
   </ds:schemaRefs>

</xml_diff>

<commit_message>
everyone gives bullet points
</commit_message>
<xml_diff>
--- a/report/final_report.docx
+++ b/report/final_report.docx
@@ -227,19 +227,11 @@
           <w:lang w:val="en-GB"/>
         </w:rPr>
       </w:pPr>
-      <w:proofErr w:type="spellStart"/>
-      <w:r>
-        <w:rPr>
-          <w:lang w:val="en-GB"/>
-        </w:rPr>
-        <w:t>Qianyue</w:t>
-      </w:r>
-      <w:proofErr w:type="spellEnd"/>
-      <w:r>
-        <w:rPr>
-          <w:lang w:val="en-GB"/>
-        </w:rPr>
-        <w:t xml:space="preserve"> Li </w:t>
+      <w:r>
+        <w:rPr>
+          <w:lang w:val="en-GB"/>
+        </w:rPr>
+        <w:t xml:space="preserve">Qianyue Li </w:t>
       </w:r>
     </w:p>
     <w:p>
@@ -280,16 +272,8 @@
         <w:rPr>
           <w:lang w:val="en-GB"/>
         </w:rPr>
-        <w:t xml:space="preserve">Sakshi </w:t>
-      </w:r>
-      <w:proofErr w:type="spellStart"/>
-      <w:r>
-        <w:rPr>
-          <w:lang w:val="en-GB"/>
-        </w:rPr>
-        <w:t>Takawale</w:t>
-      </w:r>
-      <w:proofErr w:type="spellEnd"/>
+        <w:t>Sakshi Takawale</w:t>
+      </w:r>
       <w:r>
         <w:rPr>
           <w:lang w:val="en-GB"/>
@@ -3285,21 +3269,7 @@
         <w:rPr>
           <w:lang w:val="en-GB"/>
         </w:rPr>
-        <w:t xml:space="preserve">Take for example “the doctor”. From that alone you are not able to assign a specific gender to the person. However, in German it would be “der Arzt” for males and “die </w:t>
-      </w:r>
-      <w:proofErr w:type="spellStart"/>
-      <w:r>
-        <w:rPr>
-          <w:lang w:val="en-GB"/>
-        </w:rPr>
-        <w:t>Ärztin</w:t>
-      </w:r>
-      <w:proofErr w:type="spellEnd"/>
-      <w:r>
-        <w:rPr>
-          <w:lang w:val="en-GB"/>
-        </w:rPr>
-        <w:t xml:space="preserve">” for females. </w:t>
+        <w:t xml:space="preserve">Take for example “the doctor”. From that alone you are not able to assign a specific gender to the person. However, in German it would be “der Arzt” for males and “die Ärztin” for females. </w:t>
       </w:r>
       <w:r>
         <w:rPr>
@@ -3368,21 +3338,7 @@
         <w:rPr>
           <w:lang w:val="en-GB"/>
         </w:rPr>
-        <w:t xml:space="preserve"> in psychological studies, </w:t>
-      </w:r>
-      <w:proofErr w:type="spellStart"/>
-      <w:r>
-        <w:rPr>
-          <w:lang w:val="en-GB"/>
-        </w:rPr>
-        <w:t>Vainapel</w:t>
-      </w:r>
-      <w:proofErr w:type="spellEnd"/>
-      <w:r>
-        <w:rPr>
-          <w:lang w:val="en-GB"/>
-        </w:rPr>
-        <w:t xml:space="preserve"> et. Al found that the use of the generic masculine in questionnaires affected women’s response</w:t>
+        <w:t xml:space="preserve"> in psychological studies, Vainapel et. Al found that the use of the generic masculine in questionnaires affected women’s response</w:t>
       </w:r>
       <w:r>
         <w:rPr>
@@ -3409,21 +3365,7 @@
         <w:rPr>
           <w:lang w:val="de-DE"/>
         </w:rPr>
-        <w:t>(</w:t>
-      </w:r>
-      <w:proofErr w:type="spellStart"/>
-      <w:r>
-        <w:rPr>
-          <w:lang w:val="de-DE"/>
-        </w:rPr>
-        <w:t>Vainapel</w:t>
-      </w:r>
-      <w:proofErr w:type="spellEnd"/>
-      <w:r>
-        <w:rPr>
-          <w:lang w:val="de-DE"/>
-        </w:rPr>
-        <w:t xml:space="preserve">, S., Shamir, O. Y., Tenenbaum, Y., &amp; Gilam, G. (2015). </w:t>
+        <w:t xml:space="preserve">(Vainapel, S., Shamir, O. Y., Tenenbaum, Y., &amp; Gilam, G. (2015). </w:t>
       </w:r>
       <w:r>
         <w:rPr>
@@ -3657,21 +3599,7 @@
         <w:rPr>
           <w:lang w:val="en-GB"/>
         </w:rPr>
-        <w:t xml:space="preserve">Study on the readability of news texts: Blake &amp; </w:t>
-      </w:r>
-      <w:proofErr w:type="spellStart"/>
-      <w:r>
-        <w:rPr>
-          <w:lang w:val="en-GB"/>
-        </w:rPr>
-        <w:t>Klimmt</w:t>
-      </w:r>
-      <w:proofErr w:type="spellEnd"/>
-      <w:r>
-        <w:rPr>
-          <w:lang w:val="en-GB"/>
-        </w:rPr>
-        <w:t xml:space="preserve"> (2010)</w:t>
+        <w:t>Study on the readability of news texts: Blake &amp; Klimmt (2010)</w:t>
       </w:r>
       <w:hyperlink r:id="rId22" w:history="1">
         <w:r>
@@ -3719,16 +3647,8 @@
         <w:rPr>
           <w:lang w:val="en-GB"/>
         </w:rPr>
-        <w:t xml:space="preserve">Masculine: </w:t>
-      </w:r>
-      <w:proofErr w:type="spellStart"/>
-      <w:r>
-        <w:rPr>
-          <w:lang w:val="en-GB"/>
-        </w:rPr>
-        <w:t>Studenten</w:t>
-      </w:r>
-      <w:proofErr w:type="spellEnd"/>
+        <w:t>Masculine: Studenten</w:t>
+      </w:r>
     </w:p>
     <w:p>
       <w:pPr>
@@ -3742,16 +3662,8 @@
         <w:rPr>
           <w:lang w:val="en-GB"/>
         </w:rPr>
-        <w:t xml:space="preserve">Feminine: </w:t>
-      </w:r>
-      <w:proofErr w:type="spellStart"/>
-      <w:r>
-        <w:rPr>
-          <w:lang w:val="en-GB"/>
-        </w:rPr>
-        <w:t>Studentinnen</w:t>
-      </w:r>
-      <w:proofErr w:type="spellEnd"/>
+        <w:t>Feminine: Studentinnen</w:t>
+      </w:r>
     </w:p>
     <w:p>
       <w:pPr>
@@ -3765,16 +3677,8 @@
         <w:rPr>
           <w:lang w:val="en-GB"/>
         </w:rPr>
-        <w:t>Gender-inclusive: Student*</w:t>
-      </w:r>
-      <w:proofErr w:type="spellStart"/>
-      <w:r>
-        <w:rPr>
-          <w:lang w:val="en-GB"/>
-        </w:rPr>
-        <w:t>innen</w:t>
-      </w:r>
-      <w:proofErr w:type="spellEnd"/>
+        <w:t>Gender-inclusive: Student*innen</w:t>
+      </w:r>
     </w:p>
     <w:p>
       <w:pPr>
@@ -4050,21 +3954,7 @@
         <w:rPr>
           <w:lang w:val="en-GB"/>
         </w:rPr>
-        <w:t xml:space="preserve">Neutral Language (e.g. </w:t>
-      </w:r>
-      <w:proofErr w:type="spellStart"/>
-      <w:r>
-        <w:rPr>
-          <w:lang w:val="en-GB"/>
-        </w:rPr>
-        <w:t>Studierende</w:t>
-      </w:r>
-      <w:proofErr w:type="spellEnd"/>
-      <w:r>
-        <w:rPr>
-          <w:lang w:val="en-GB"/>
-        </w:rPr>
-        <w:t>)</w:t>
+        <w:t>Neutral Language (e.g. Studierende)</w:t>
       </w:r>
     </w:p>
     <w:p>
@@ -4079,21 +3969,7 @@
         <w:rPr>
           <w:lang w:val="en-GB"/>
         </w:rPr>
-        <w:t>With Star (e.g. Student*</w:t>
-      </w:r>
-      <w:proofErr w:type="spellStart"/>
-      <w:r>
-        <w:rPr>
-          <w:lang w:val="en-GB"/>
-        </w:rPr>
-        <w:t>innen</w:t>
-      </w:r>
-      <w:proofErr w:type="spellEnd"/>
-      <w:r>
-        <w:rPr>
-          <w:lang w:val="en-GB"/>
-        </w:rPr>
-        <w:t>)</w:t>
+        <w:t>With Star (e.g. Student*innen)</w:t>
       </w:r>
     </w:p>
     <w:p>
@@ -4108,21 +3984,7 @@
         <w:rPr>
           <w:lang w:val="en-GB"/>
         </w:rPr>
-        <w:t xml:space="preserve">With : (e.g. </w:t>
-      </w:r>
-      <w:proofErr w:type="spellStart"/>
-      <w:r>
-        <w:rPr>
-          <w:lang w:val="en-GB"/>
-        </w:rPr>
-        <w:t>Student:innen</w:t>
-      </w:r>
-      <w:proofErr w:type="spellEnd"/>
-      <w:r>
-        <w:rPr>
-          <w:lang w:val="en-GB"/>
-        </w:rPr>
-        <w:t>)</w:t>
+        <w:t>With : (e.g. Student:innen)</w:t>
       </w:r>
     </w:p>
     <w:p>
@@ -4137,35 +3999,7 @@
         <w:rPr>
           <w:lang w:val="en-GB"/>
         </w:rPr>
-        <w:t xml:space="preserve">Written with both pairs w/ f first; w/ m first (e.g. </w:t>
-      </w:r>
-      <w:proofErr w:type="spellStart"/>
-      <w:r>
-        <w:rPr>
-          <w:lang w:val="en-GB"/>
-        </w:rPr>
-        <w:t>Studenten</w:t>
-      </w:r>
-      <w:proofErr w:type="spellEnd"/>
-      <w:r>
-        <w:rPr>
-          <w:lang w:val="en-GB"/>
-        </w:rPr>
-        <w:t xml:space="preserve"> und </w:t>
-      </w:r>
-      <w:proofErr w:type="spellStart"/>
-      <w:r>
-        <w:rPr>
-          <w:lang w:val="en-GB"/>
-        </w:rPr>
-        <w:t>Studentinnen</w:t>
-      </w:r>
-      <w:proofErr w:type="spellEnd"/>
-      <w:r>
-        <w:rPr>
-          <w:lang w:val="en-GB"/>
-        </w:rPr>
-        <w:t>)</w:t>
+        <w:t>Written with both pairs w/ f first; w/ m first (e.g. Studenten und Studentinnen)</w:t>
       </w:r>
     </w:p>
     <w:p>
@@ -4296,21 +4130,7 @@
         <w:rPr>
           <w:lang w:val="en-GB"/>
         </w:rPr>
-        <w:t xml:space="preserve">Early Measure(start time):fixation duration on role </w:t>
-      </w:r>
-      <w:proofErr w:type="spellStart"/>
-      <w:r>
-        <w:rPr>
-          <w:lang w:val="en-GB"/>
-        </w:rPr>
-        <w:t>roun</w:t>
-      </w:r>
-      <w:proofErr w:type="spellEnd"/>
-      <w:r>
-        <w:rPr>
-          <w:lang w:val="en-GB"/>
-        </w:rPr>
-        <w:t xml:space="preserve"> / anaphor</w:t>
+        <w:t>Early Measure(start time):fixation duration on role roun / anaphor</w:t>
       </w:r>
     </w:p>
     <w:p>
@@ -4457,21 +4277,7 @@
         <w:rPr>
           <w:lang w:val="en-GB"/>
         </w:rPr>
-        <w:t xml:space="preserve"> To find participants we created a poster and a form to send both out to group chats and the mailing list from the it major at the university Stuttgart. The participants could fill it out with a contact mail address and dates they are available. We also talked to students on campus and asked them to participate. It was really difficult to find </w:t>
-      </w:r>
-      <w:proofErr w:type="spellStart"/>
-      <w:r>
-        <w:rPr>
-          <w:lang w:val="en-GB"/>
-        </w:rPr>
-        <w:t>german</w:t>
-      </w:r>
-      <w:proofErr w:type="spellEnd"/>
-      <w:r>
-        <w:rPr>
-          <w:lang w:val="en-GB"/>
-        </w:rPr>
-        <w:t xml:space="preserve"> native speakers that are available, but we ended up finding 12 participants. T</w:t>
+        <w:t xml:space="preserve"> To find participants we created a poster and a form to send both out to group chats and the mailing list from the it major at the university Stuttgart. The participants could fill it out with a contact mail address and dates they are available. We also talked to students on campus and asked them to participate. It was really difficult to find german native speakers that are available, but we ended up finding 12 participants. T</w:t>
       </w:r>
       <w:r>
         <w:rPr>
@@ -4743,14 +4549,12 @@
                 <w:lang w:val="en-GB"/>
               </w:rPr>
             </w:pPr>
-            <w:proofErr w:type="spellStart"/>
             <w:r>
               <w:rPr>
                 <w:lang w:val="en-GB"/>
               </w:rPr>
               <w:t>Männer</w:t>
             </w:r>
-            <w:proofErr w:type="spellEnd"/>
           </w:p>
         </w:tc>
       </w:tr>
@@ -4869,14 +4673,12 @@
                 <w:lang w:val="en-GB"/>
               </w:rPr>
             </w:pPr>
-            <w:proofErr w:type="spellStart"/>
             <w:r>
               <w:rPr>
                 <w:lang w:val="en-GB"/>
               </w:rPr>
               <w:t>Männer</w:t>
             </w:r>
-            <w:proofErr w:type="spellEnd"/>
           </w:p>
         </w:tc>
       </w:tr>
@@ -4996,14 +4798,12 @@
                 <w:lang w:val="en-GB"/>
               </w:rPr>
             </w:pPr>
-            <w:proofErr w:type="spellStart"/>
             <w:r>
               <w:rPr>
                 <w:lang w:val="en-GB"/>
               </w:rPr>
               <w:t>Männer</w:t>
             </w:r>
-            <w:proofErr w:type="spellEnd"/>
           </w:p>
         </w:tc>
       </w:tr>
@@ -5097,13 +4897,8 @@
         <w:fldChar w:fldCharType="end"/>
       </w:r>
       <w:r>
-        <w:t xml:space="preserve">: </w:t>
-      </w:r>
-      <w:proofErr w:type="spellStart"/>
-      <w:r>
-        <w:t>Conditions</w:t>
-      </w:r>
-      <w:proofErr w:type="spellEnd"/>
+        <w:t>: Conditions</w:t>
+      </w:r>
     </w:p>
     <w:p>
       <w:pPr>
@@ -8357,164 +8152,74 @@
         <w:spacing w:line="360" w:lineRule="auto"/>
         <w:jc w:val="both"/>
         <w:rPr>
+          <w:lang w:val="en-GB"/>
+        </w:rPr>
+      </w:pPr>
+      <w:r>
+        <w:rPr>
+          <w:lang w:val="en-GB"/>
+        </w:rPr>
+        <w:t xml:space="preserve">The Experiment </w:t>
+      </w:r>
+      <w:r>
+        <w:rPr>
+          <w:lang w:val="en-GB"/>
+        </w:rPr>
+        <w:t>starts with an introduction text, where</w:t>
+      </w:r>
+      <w:r>
+        <w:rPr>
+          <w:lang w:val="en-GB"/>
+        </w:rPr>
+        <w:t xml:space="preserve"> the participants get the information on the process and what to do.  </w:t>
+      </w:r>
+      <w:r>
+        <w:rPr>
           <w:lang w:val="de-DE"/>
         </w:rPr>
-      </w:pPr>
-      <w:r>
-        <w:rPr>
-          <w:lang w:val="en-GB"/>
-        </w:rPr>
-        <w:t xml:space="preserve">The Experiment </w:t>
-      </w:r>
-      <w:r>
-        <w:rPr>
-          <w:lang w:val="en-GB"/>
-        </w:rPr>
-        <w:t>starts with an introduction text, where</w:t>
-      </w:r>
-      <w:r>
-        <w:rPr>
-          <w:lang w:val="en-GB"/>
-        </w:rPr>
-        <w:t xml:space="preserve"> the participants get the information on the process and what to do.  “</w:t>
-      </w:r>
-      <w:r>
-        <w:rPr>
-          <w:lang w:val="en-GB"/>
-        </w:rPr>
-        <w:t xml:space="preserve">In </w:t>
-      </w:r>
-      <w:proofErr w:type="spellStart"/>
-      <w:r>
-        <w:rPr>
-          <w:lang w:val="en-GB"/>
-        </w:rPr>
-        <w:t>jedem</w:t>
-      </w:r>
-      <w:proofErr w:type="spellEnd"/>
-      <w:r>
-        <w:rPr>
-          <w:lang w:val="en-GB"/>
+        <w:t xml:space="preserve">“In jedem Durchgang erscheint zunächst ein Fixationskreuz. </w:t>
+      </w:r>
+      <w:r>
+        <w:rPr>
+          <w:lang w:val="de-DE"/>
+        </w:rPr>
+        <w:t>Anschließend wird ein Text angezeigt.</w:t>
+      </w:r>
+      <w:r>
+        <w:rPr>
+          <w:lang w:val="de-DE"/>
         </w:rPr>
         <w:t xml:space="preserve"> </w:t>
       </w:r>
-      <w:proofErr w:type="spellStart"/>
-      <w:r>
-        <w:rPr>
-          <w:lang w:val="en-GB"/>
-        </w:rPr>
-        <w:t>Durchgang</w:t>
-      </w:r>
-      <w:proofErr w:type="spellEnd"/>
-      <w:r>
-        <w:rPr>
-          <w:lang w:val="en-GB"/>
+      <w:r>
+        <w:rPr>
+          <w:lang w:val="de-DE"/>
+        </w:rPr>
+        <w:t>Bitte lesen Sie jeden Text aufmerksam und in Ihrem natürlichen Lesetempo.</w:t>
+      </w:r>
+      <w:r>
+        <w:rPr>
+          <w:lang w:val="de-DE"/>
         </w:rPr>
         <w:t xml:space="preserve"> </w:t>
       </w:r>
-      <w:proofErr w:type="spellStart"/>
-      <w:r>
-        <w:rPr>
-          <w:lang w:val="en-GB"/>
-        </w:rPr>
-        <w:t>erscheint</w:t>
-      </w:r>
-      <w:proofErr w:type="spellEnd"/>
-      <w:r>
-        <w:rPr>
-          <w:lang w:val="en-GB"/>
+      <w:r>
+        <w:rPr>
+          <w:lang w:val="de-DE"/>
+        </w:rPr>
+        <w:t>Wenn Sie den Text vollständig gelesen haben, drücken Sie eine Taste, um zum nächsten Bildschirm zu gelangen.</w:t>
+      </w:r>
+      <w:r>
+        <w:rPr>
+          <w:lang w:val="de-DE"/>
         </w:rPr>
         <w:t xml:space="preserve"> </w:t>
       </w:r>
-      <w:proofErr w:type="spellStart"/>
-      <w:r>
-        <w:rPr>
-          <w:lang w:val="en-GB"/>
-        </w:rPr>
-        <w:t>zunächst</w:t>
-      </w:r>
-      <w:proofErr w:type="spellEnd"/>
-      <w:r>
-        <w:rPr>
-          <w:lang w:val="en-GB"/>
-        </w:rPr>
-        <w:t xml:space="preserve"> </w:t>
-      </w:r>
-      <w:proofErr w:type="spellStart"/>
-      <w:r>
-        <w:rPr>
-          <w:lang w:val="en-GB"/>
-        </w:rPr>
-        <w:t>ein</w:t>
-      </w:r>
-      <w:proofErr w:type="spellEnd"/>
-      <w:r>
-        <w:rPr>
-          <w:lang w:val="en-GB"/>
-        </w:rPr>
-        <w:t xml:space="preserve"> </w:t>
-      </w:r>
-      <w:proofErr w:type="spellStart"/>
-      <w:r>
-        <w:rPr>
-          <w:lang w:val="en-GB"/>
-        </w:rPr>
-        <w:t>Fixationskreuz</w:t>
-      </w:r>
-      <w:proofErr w:type="spellEnd"/>
-      <w:r>
-        <w:rPr>
-          <w:lang w:val="en-GB"/>
-        </w:rPr>
-        <w:t xml:space="preserve">. </w:t>
-      </w:r>
-      <w:r>
-        <w:rPr>
-          <w:lang w:val="de-DE"/>
-        </w:rPr>
-        <w:t>Anschließend wird ein Text angezeigt.</w:t>
-      </w:r>
-      <w:r>
-        <w:rPr>
-          <w:lang w:val="de-DE"/>
-        </w:rPr>
-        <w:t xml:space="preserve"> </w:t>
-      </w:r>
-      <w:r>
-        <w:rPr>
-          <w:lang w:val="de-DE"/>
-        </w:rPr>
-        <w:t>Bitte lesen Sie jeden Text aufmerksam und in Ihrem natürlichen Lesetempo.</w:t>
-      </w:r>
-      <w:r>
-        <w:rPr>
-          <w:lang w:val="de-DE"/>
-        </w:rPr>
-        <w:t xml:space="preserve"> </w:t>
-      </w:r>
-      <w:r>
-        <w:rPr>
-          <w:lang w:val="de-DE"/>
-        </w:rPr>
-        <w:t>Wenn Sie den Text vollständig gelesen haben, drücken Sie eine Taste, um zum nächsten Bildschirm zu gelangen.</w:t>
-      </w:r>
-      <w:r>
-        <w:rPr>
-          <w:lang w:val="de-DE"/>
-        </w:rPr>
-        <w:t xml:space="preserve"> </w:t>
-      </w:r>
-      <w:r>
-        <w:rPr>
-          <w:lang w:val="de-DE"/>
-        </w:rPr>
-        <w:t>Danach wird eine kurze Verständnisfrage gestellt.</w:t>
-      </w:r>
-      <w:r>
-        <w:rPr>
-          <w:lang w:val="de-DE"/>
-        </w:rPr>
-        <w:t xml:space="preserve">“ </w:t>
+      <w:r>
+        <w:rPr>
+          <w:lang w:val="en-GB"/>
+        </w:rPr>
+        <w:t xml:space="preserve">Danach wird eine kurze Verständnisfrage gestellt.“ </w:t>
       </w:r>
     </w:p>
     <w:p>
@@ -8655,21 +8360,7 @@
         <w:rPr>
           <w:lang w:val="en-GB"/>
         </w:rPr>
-        <w:t xml:space="preserve"> not the most important think that they get the context right. More important is what they remembered like do they use the male, female or gender inclusive form or do they use “</w:t>
-      </w:r>
-      <w:proofErr w:type="spellStart"/>
-      <w:r>
-        <w:rPr>
-          <w:lang w:val="en-GB"/>
-        </w:rPr>
-        <w:t>Männer</w:t>
-      </w:r>
-      <w:proofErr w:type="spellEnd"/>
-      <w:r>
-        <w:rPr>
-          <w:lang w:val="en-GB"/>
-        </w:rPr>
-        <w:t xml:space="preserve">” or “Frauen” while answering. While they answer we also note if there is a confusion that we detect. That could be by the participant having problems articulate the answer or they don’t remember exactly or only can reproduce the role noun or anaphor but forgot the rest. Because this confusion we can hear in their answer we could maybe connect to some existing bias or just a gender mismatch. </w:t>
+        <w:t xml:space="preserve"> not the most important think that they get the context right. More important is what they remembered like do they use the male, female or gender inclusive form or do they use “Männer” or “Frauen” while answering. While they answer we also note if there is a confusion that we detect. That could be by the participant having problems articulate the answer or they don’t remember exactly or only can reproduce the role noun or anaphor but forgot the rest. Because this confusion we can hear in their answer we could maybe connect to some existing bias or just a gender mismatch. </w:t>
       </w:r>
     </w:p>
     <w:p>
@@ -8807,63 +8498,7 @@
         <w:rPr>
           <w:lang w:val="en-GB"/>
         </w:rPr>
-        <w:t xml:space="preserve">The Open Sesame experiment has the following Structure: In the experiment is </w:t>
-      </w:r>
-      <w:proofErr w:type="spellStart"/>
-      <w:r>
-        <w:rPr>
-          <w:lang w:val="en-GB"/>
-        </w:rPr>
-        <w:t>a</w:t>
-      </w:r>
-      <w:proofErr w:type="spellEnd"/>
-      <w:r>
-        <w:rPr>
-          <w:lang w:val="en-GB"/>
-        </w:rPr>
-        <w:t xml:space="preserve"> experiment sequence. First there is the </w:t>
-      </w:r>
-      <w:proofErr w:type="spellStart"/>
-      <w:r>
-        <w:rPr>
-          <w:lang w:val="en-GB"/>
-        </w:rPr>
-        <w:t>pygaze</w:t>
-      </w:r>
-      <w:proofErr w:type="spellEnd"/>
-      <w:r>
-        <w:rPr>
-          <w:lang w:val="en-GB"/>
-        </w:rPr>
-        <w:t xml:space="preserve"> initialization than the </w:t>
-      </w:r>
-      <w:proofErr w:type="spellStart"/>
-      <w:r>
-        <w:rPr>
-          <w:lang w:val="en-GB"/>
-        </w:rPr>
-        <w:t>pygaze</w:t>
-      </w:r>
-      <w:proofErr w:type="spellEnd"/>
-      <w:r>
-        <w:rPr>
-          <w:lang w:val="en-GB"/>
-        </w:rPr>
-        <w:t xml:space="preserve"> start recording. After that there is a inline script to initialize our variables. After that we have the sketchpad with the Instruction text, with an </w:t>
-      </w:r>
-      <w:proofErr w:type="spellStart"/>
-      <w:r>
-        <w:rPr>
-          <w:lang w:val="en-GB"/>
-        </w:rPr>
-        <w:t>pygaze</w:t>
-      </w:r>
-      <w:proofErr w:type="spellEnd"/>
-      <w:r>
-        <w:rPr>
-          <w:lang w:val="en-GB"/>
-        </w:rPr>
-        <w:t xml:space="preserve"> log for the instruction onset. Following there is a inline script to choose the list that will be shown to the participant. </w:t>
+        <w:t xml:space="preserve">The Open Sesame experiment has the following Structure: In the experiment is a experiment sequence. First there is the pygaze initialization than the pygaze start recording. After that there is a inline script to initialize our variables. After that we have the sketchpad with the Instruction text, with an pygaze log for the instruction onset. Following there is a inline script to choose the list that will be shown to the participant. </w:t>
       </w:r>
     </w:p>
     <w:p>
@@ -8891,7 +8526,6 @@
           <w:lang w:val="en-GB"/>
         </w:rPr>
       </w:pPr>
-      <w:proofErr w:type="spellStart"/>
       <w:r>
         <w:rPr>
           <w:b/>
@@ -8900,7 +8534,6 @@
         </w:rPr>
         <w:t>Exper</w:t>
       </w:r>
-      <w:proofErr w:type="spellEnd"/>
     </w:p>
     <w:p>
       <w:pPr>
@@ -9118,21 +8751,7 @@
         <w:rPr>
           <w:lang w:val="en-GB"/>
         </w:rPr>
-        <w:t xml:space="preserve"> (</w:t>
-      </w:r>
-      <w:proofErr w:type="spellStart"/>
-      <w:r>
-        <w:rPr>
-          <w:lang w:val="en-GB"/>
-        </w:rPr>
-        <w:t>Qianyue</w:t>
-      </w:r>
-      <w:proofErr w:type="spellEnd"/>
-      <w:r>
-        <w:rPr>
-          <w:lang w:val="en-GB"/>
-        </w:rPr>
-        <w:t>)</w:t>
+        <w:t xml:space="preserve"> (Qianyue)</w:t>
       </w:r>
       <w:bookmarkEnd w:id="17"/>
     </w:p>
@@ -9154,21 +8773,7 @@
         <w:rPr>
           <w:lang w:val="en-GB"/>
         </w:rPr>
-        <w:t xml:space="preserve"> (</w:t>
-      </w:r>
-      <w:proofErr w:type="spellStart"/>
-      <w:r>
-        <w:rPr>
-          <w:lang w:val="en-GB"/>
-        </w:rPr>
-        <w:t>Qianyue</w:t>
-      </w:r>
-      <w:proofErr w:type="spellEnd"/>
-      <w:r>
-        <w:rPr>
-          <w:lang w:val="en-GB"/>
-        </w:rPr>
-        <w:t>)</w:t>
+        <w:t xml:space="preserve"> (Qianyue)</w:t>
       </w:r>
       <w:bookmarkEnd w:id="18"/>
     </w:p>
@@ -9186,35 +8791,7 @@
         <w:rPr>
           <w:lang w:val="de-DE"/>
         </w:rPr>
-        <w:t xml:space="preserve">Eye </w:t>
-      </w:r>
-      <w:proofErr w:type="spellStart"/>
-      <w:r>
-        <w:rPr>
-          <w:lang w:val="de-DE"/>
-        </w:rPr>
-        <w:t>movements</w:t>
-      </w:r>
-      <w:proofErr w:type="spellEnd"/>
-      <w:r>
-        <w:rPr>
-          <w:lang w:val="de-DE"/>
-        </w:rPr>
-        <w:t xml:space="preserve"> </w:t>
-      </w:r>
-      <w:proofErr w:type="spellStart"/>
-      <w:r>
-        <w:rPr>
-          <w:lang w:val="de-DE"/>
-        </w:rPr>
-        <w:t>recorded</w:t>
-      </w:r>
-      <w:proofErr w:type="spellEnd"/>
-      <w:r>
-        <w:rPr>
-          <w:lang w:val="de-DE"/>
-        </w:rPr>
-        <w:t> </w:t>
+        <w:t>Eye movements recorded </w:t>
       </w:r>
     </w:p>
     <w:p>
@@ -9227,42 +8804,12 @@
           <w:lang w:val="de-DE"/>
         </w:rPr>
       </w:pPr>
-      <w:proofErr w:type="spellStart"/>
       <w:r>
         <w:rPr>
           <w:lang w:val="de-DE"/>
         </w:rPr>
-        <w:t>participants</w:t>
-      </w:r>
-      <w:proofErr w:type="spellEnd"/>
-      <w:r>
-        <w:rPr>
-          <w:lang w:val="de-DE"/>
-        </w:rPr>
-        <w:t xml:space="preserve"> </w:t>
-      </w:r>
-      <w:proofErr w:type="spellStart"/>
-      <w:r>
-        <w:rPr>
-          <w:lang w:val="de-DE"/>
-        </w:rPr>
-        <w:t>read</w:t>
-      </w:r>
-      <w:proofErr w:type="spellEnd"/>
-      <w:r>
-        <w:rPr>
-          <w:lang w:val="de-DE"/>
-        </w:rPr>
-        <w:t xml:space="preserve"> 18 </w:t>
-      </w:r>
-      <w:proofErr w:type="spellStart"/>
-      <w:r>
-        <w:rPr>
-          <w:lang w:val="de-DE"/>
-        </w:rPr>
-        <w:t>sentences</w:t>
-      </w:r>
-      <w:proofErr w:type="spellEnd"/>
+        <w:t>participants read 18 sentences</w:t>
+      </w:r>
     </w:p>
     <w:p>
       <w:pPr>
@@ -9274,33 +8821,11 @@
           <w:lang w:val="de-DE"/>
         </w:rPr>
       </w:pPr>
-      <w:proofErr w:type="spellStart"/>
       <w:r>
         <w:rPr>
           <w:lang w:val="de-DE"/>
         </w:rPr>
-        <w:t>Exclude</w:t>
-      </w:r>
-      <w:proofErr w:type="spellEnd"/>
-      <w:r>
-        <w:rPr>
-          <w:lang w:val="de-DE"/>
-        </w:rPr>
-        <w:t xml:space="preserve"> invalid </w:t>
-      </w:r>
-      <w:proofErr w:type="spellStart"/>
-      <w:r>
-        <w:rPr>
-          <w:lang w:val="de-DE"/>
-        </w:rPr>
-        <w:t>trials</w:t>
-      </w:r>
-      <w:proofErr w:type="spellEnd"/>
-      <w:r>
-        <w:rPr>
-          <w:lang w:val="de-DE"/>
-        </w:rPr>
-        <w:t> </w:t>
+        <w:t>Exclude invalid trials </w:t>
       </w:r>
     </w:p>
     <w:p>
@@ -9313,42 +8838,12 @@
           <w:lang w:val="de-DE"/>
         </w:rPr>
       </w:pPr>
-      <w:proofErr w:type="spellStart"/>
       <w:r>
         <w:rPr>
           <w:lang w:val="de-DE"/>
         </w:rPr>
-        <w:t>Participant</w:t>
-      </w:r>
-      <w:proofErr w:type="spellEnd"/>
-      <w:r>
-        <w:rPr>
-          <w:lang w:val="de-DE"/>
-        </w:rPr>
-        <w:t xml:space="preserve"> </w:t>
-      </w:r>
-      <w:proofErr w:type="spellStart"/>
-      <w:r>
-        <w:rPr>
-          <w:lang w:val="de-DE"/>
-        </w:rPr>
-        <w:t>looked</w:t>
-      </w:r>
-      <w:proofErr w:type="spellEnd"/>
-      <w:r>
-        <w:rPr>
-          <w:lang w:val="de-DE"/>
-        </w:rPr>
-        <w:t xml:space="preserve"> </w:t>
-      </w:r>
-      <w:proofErr w:type="spellStart"/>
-      <w:r>
-        <w:rPr>
-          <w:lang w:val="de-DE"/>
-        </w:rPr>
-        <w:t>away</w:t>
-      </w:r>
-      <w:proofErr w:type="spellEnd"/>
+        <w:t>Participant looked away</w:t>
+      </w:r>
     </w:p>
     <w:p>
       <w:pPr>
@@ -9377,28 +8872,12 @@
           <w:lang w:val="de-DE"/>
         </w:rPr>
       </w:pPr>
-      <w:proofErr w:type="spellStart"/>
       <w:r>
         <w:rPr>
           <w:lang w:val="de-DE"/>
         </w:rPr>
-        <w:t>Exclude</w:t>
-      </w:r>
-      <w:proofErr w:type="spellEnd"/>
-      <w:r>
-        <w:rPr>
-          <w:lang w:val="de-DE"/>
-        </w:rPr>
-        <w:t xml:space="preserve"> invalid </w:t>
-      </w:r>
-      <w:proofErr w:type="spellStart"/>
-      <w:r>
-        <w:rPr>
-          <w:lang w:val="de-DE"/>
-        </w:rPr>
-        <w:t>data</w:t>
-      </w:r>
-      <w:proofErr w:type="spellEnd"/>
+        <w:t>Exclude invalid data</w:t>
+      </w:r>
     </w:p>
     <w:p>
       <w:pPr>
@@ -9414,16 +8893,8 @@
         <w:rPr>
           <w:lang w:val="de-DE"/>
         </w:rPr>
-        <w:t xml:space="preserve">remove </w:t>
-      </w:r>
-      <w:proofErr w:type="spellStart"/>
-      <w:r>
-        <w:rPr>
-          <w:lang w:val="de-DE"/>
-        </w:rPr>
-        <w:t>blinks</w:t>
-      </w:r>
-      <w:proofErr w:type="spellEnd"/>
+        <w:t>remove blinks</w:t>
+      </w:r>
     </w:p>
     <w:p>
       <w:pPr>
@@ -9439,16 +8910,8 @@
         <w:rPr>
           <w:lang w:val="de-DE"/>
         </w:rPr>
-        <w:t xml:space="preserve">track </w:t>
-      </w:r>
-      <w:proofErr w:type="spellStart"/>
-      <w:r>
-        <w:rPr>
-          <w:lang w:val="de-DE"/>
-        </w:rPr>
-        <w:t>loss</w:t>
-      </w:r>
-      <w:proofErr w:type="spellEnd"/>
+        <w:t>track loss</w:t>
+      </w:r>
     </w:p>
     <w:p>
       <w:pPr>
@@ -9481,16 +8944,8 @@
         <w:rPr>
           <w:lang w:val="de-DE"/>
         </w:rPr>
-        <w:t xml:space="preserve">Role </w:t>
-      </w:r>
-      <w:proofErr w:type="spellStart"/>
-      <w:r>
-        <w:rPr>
-          <w:lang w:val="de-DE"/>
-        </w:rPr>
-        <w:t>noun</w:t>
-      </w:r>
-      <w:proofErr w:type="spellEnd"/>
+        <w:t>Role noun</w:t>
+      </w:r>
     </w:p>
     <w:p>
       <w:pPr>
@@ -9502,14 +8957,12 @@
           <w:lang w:val="de-DE"/>
         </w:rPr>
       </w:pPr>
-      <w:proofErr w:type="spellStart"/>
       <w:r>
         <w:rPr>
           <w:lang w:val="de-DE"/>
         </w:rPr>
         <w:t>Anaphor</w:t>
       </w:r>
-      <w:proofErr w:type="spellEnd"/>
     </w:p>
     <w:p>
       <w:pPr>
@@ -9521,14 +8974,12 @@
           <w:lang w:val="de-DE"/>
         </w:rPr>
       </w:pPr>
-      <w:proofErr w:type="spellStart"/>
       <w:r>
         <w:rPr>
           <w:lang w:val="de-DE"/>
         </w:rPr>
         <w:t>Spillover</w:t>
       </w:r>
-      <w:proofErr w:type="spellEnd"/>
     </w:p>
     <w:p>
       <w:pPr>
@@ -9547,21 +8998,8 @@
       </w:pPr>
       <w:bookmarkStart w:id="19" w:name="_Toc235728799"/>
       <w:r>
-        <w:t xml:space="preserve">3.2 </w:t>
-      </w:r>
-      <w:proofErr w:type="spellStart"/>
-      <w:r>
-        <w:t>Expected</w:t>
-      </w:r>
-      <w:proofErr w:type="spellEnd"/>
-      <w:r>
-        <w:t xml:space="preserve"> </w:t>
-      </w:r>
-      <w:proofErr w:type="spellStart"/>
-      <w:r>
-        <w:t>Results</w:t>
-      </w:r>
-      <w:proofErr w:type="spellEnd"/>
+        <w:t>3.2 Expected Results</w:t>
+      </w:r>
       <w:r>
         <w:t xml:space="preserve"> </w:t>
       </w:r>
@@ -9630,7 +9068,6 @@
                 <w:lang w:val="de-DE"/>
               </w:rPr>
             </w:pPr>
-            <w:proofErr w:type="spellStart"/>
             <w:r>
               <w:rPr>
                 <w:b/>
@@ -9639,7 +9076,6 @@
               </w:rPr>
               <w:t>Condition</w:t>
             </w:r>
-            <w:proofErr w:type="spellEnd"/>
           </w:p>
         </w:tc>
         <w:tc>
@@ -9666,34 +9102,14 @@
                 <w:lang w:val="de-DE"/>
               </w:rPr>
             </w:pPr>
-            <w:proofErr w:type="spellStart"/>
             <w:r>
               <w:rPr>
                 <w:b/>
                 <w:bCs/>
                 <w:lang w:val="de-DE"/>
               </w:rPr>
-              <w:t>Expected</w:t>
-            </w:r>
-            <w:proofErr w:type="spellEnd"/>
-            <w:r>
-              <w:rPr>
-                <w:b/>
-                <w:bCs/>
-                <w:lang w:val="de-DE"/>
-              </w:rPr>
-              <w:t xml:space="preserve"> </w:t>
-            </w:r>
-            <w:proofErr w:type="spellStart"/>
-            <w:r>
-              <w:rPr>
-                <w:b/>
-                <w:bCs/>
-                <w:lang w:val="de-DE"/>
-              </w:rPr>
-              <w:t>Result</w:t>
-            </w:r>
-            <w:proofErr w:type="spellEnd"/>
+              <w:t>Expected Result</w:t>
+            </w:r>
           </w:p>
         </w:tc>
       </w:tr>
@@ -9725,19 +9141,11 @@
                 <w:lang w:val="de-DE"/>
               </w:rPr>
             </w:pPr>
-            <w:proofErr w:type="spellStart"/>
             <w:r>
               <w:rPr>
                 <w:lang w:val="de-DE"/>
               </w:rPr>
-              <w:t>Masculine</w:t>
-            </w:r>
-            <w:proofErr w:type="spellEnd"/>
-            <w:r>
-              <w:rPr>
-                <w:lang w:val="de-DE"/>
-              </w:rPr>
-              <w:t xml:space="preserve"> -&gt; Männer</w:t>
+              <w:t>Masculine -&gt; Männer</w:t>
             </w:r>
           </w:p>
         </w:tc>
@@ -9769,35 +9177,7 @@
               <w:rPr>
                 <w:lang w:val="de-DE"/>
               </w:rPr>
-              <w:t xml:space="preserve">Fastest </w:t>
-            </w:r>
-            <w:proofErr w:type="spellStart"/>
-            <w:r>
-              <w:rPr>
-                <w:lang w:val="de-DE"/>
-              </w:rPr>
-              <w:t>processing</w:t>
-            </w:r>
-            <w:proofErr w:type="spellEnd"/>
-            <w:r>
-              <w:rPr>
-                <w:lang w:val="de-DE"/>
-              </w:rPr>
-              <w:t xml:space="preserve"> (</w:t>
-            </w:r>
-            <w:proofErr w:type="spellStart"/>
-            <w:r>
-              <w:rPr>
-                <w:lang w:val="de-DE"/>
-              </w:rPr>
-              <w:t>gender</w:t>
-            </w:r>
-            <w:proofErr w:type="spellEnd"/>
-            <w:r>
-              <w:rPr>
-                <w:lang w:val="de-DE"/>
-              </w:rPr>
-              <w:t xml:space="preserve"> match)</w:t>
+              <w:t>Fastest processing (gender match)</w:t>
             </w:r>
           </w:p>
         </w:tc>
@@ -9830,19 +9210,11 @@
                 <w:lang w:val="de-DE"/>
               </w:rPr>
             </w:pPr>
-            <w:proofErr w:type="spellStart"/>
             <w:r>
               <w:rPr>
                 <w:lang w:val="de-DE"/>
               </w:rPr>
-              <w:t>Masculine</w:t>
-            </w:r>
-            <w:proofErr w:type="spellEnd"/>
-            <w:r>
-              <w:rPr>
-                <w:lang w:val="de-DE"/>
-              </w:rPr>
-              <w:t xml:space="preserve"> -&gt; Frauen</w:t>
+              <w:t>Masculine -&gt; Frauen</w:t>
             </w:r>
           </w:p>
         </w:tc>
@@ -9943,35 +9315,7 @@
               <w:rPr>
                 <w:lang w:val="de-DE"/>
               </w:rPr>
-              <w:t xml:space="preserve">Fastest </w:t>
-            </w:r>
-            <w:proofErr w:type="spellStart"/>
-            <w:r>
-              <w:rPr>
-                <w:lang w:val="de-DE"/>
-              </w:rPr>
-              <w:t>processing</w:t>
-            </w:r>
-            <w:proofErr w:type="spellEnd"/>
-            <w:r>
-              <w:rPr>
-                <w:lang w:val="de-DE"/>
-              </w:rPr>
-              <w:t xml:space="preserve"> (</w:t>
-            </w:r>
-            <w:proofErr w:type="spellStart"/>
-            <w:r>
-              <w:rPr>
-                <w:lang w:val="de-DE"/>
-              </w:rPr>
-              <w:t>gender</w:t>
-            </w:r>
-            <w:proofErr w:type="spellEnd"/>
-            <w:r>
-              <w:rPr>
-                <w:lang w:val="de-DE"/>
-              </w:rPr>
-              <w:t xml:space="preserve"> match)</w:t>
+              <w:t>Fastest processing (gender match)</w:t>
             </w:r>
           </w:p>
         </w:tc>
@@ -10040,49 +9384,7 @@
               <w:rPr>
                 <w:lang w:val="de-DE"/>
               </w:rPr>
-              <w:t xml:space="preserve">Longest </w:t>
-            </w:r>
-            <w:proofErr w:type="spellStart"/>
-            <w:r>
-              <w:rPr>
-                <w:lang w:val="de-DE"/>
-              </w:rPr>
-              <w:t>processing</w:t>
-            </w:r>
-            <w:proofErr w:type="spellEnd"/>
-            <w:r>
-              <w:rPr>
-                <w:lang w:val="de-DE"/>
-              </w:rPr>
-              <w:t xml:space="preserve">  (</w:t>
-            </w:r>
-            <w:proofErr w:type="spellStart"/>
-            <w:r>
-              <w:rPr>
-                <w:lang w:val="de-DE"/>
-              </w:rPr>
-              <w:t>gender</w:t>
-            </w:r>
-            <w:proofErr w:type="spellEnd"/>
-            <w:r>
-              <w:rPr>
-                <w:lang w:val="de-DE"/>
-              </w:rPr>
-              <w:t xml:space="preserve"> </w:t>
-            </w:r>
-            <w:proofErr w:type="spellStart"/>
-            <w:r>
-              <w:rPr>
-                <w:lang w:val="de-DE"/>
-              </w:rPr>
-              <w:t>mismatch</w:t>
-            </w:r>
-            <w:proofErr w:type="spellEnd"/>
-            <w:r>
-              <w:rPr>
-                <w:lang w:val="de-DE"/>
-              </w:rPr>
-              <w:t>)</w:t>
+              <w:t>Longest processing  (gender mismatch)</w:t>
             </w:r>
           </w:p>
         </w:tc>
@@ -10277,21 +9579,7 @@
         <w:rPr>
           <w:lang w:val="en-GB"/>
         </w:rPr>
-        <w:t>(</w:t>
-      </w:r>
-      <w:proofErr w:type="spellStart"/>
-      <w:r>
-        <w:rPr>
-          <w:lang w:val="en-GB"/>
-        </w:rPr>
-        <w:t>Qianyue</w:t>
-      </w:r>
-      <w:proofErr w:type="spellEnd"/>
-      <w:r>
-        <w:rPr>
-          <w:lang w:val="en-GB"/>
-        </w:rPr>
-        <w:t>)</w:t>
+        <w:t>(Qianyue)</w:t>
       </w:r>
       <w:bookmarkEnd w:id="20"/>
     </w:p>
@@ -10595,21 +9883,7 @@
         <w:rPr>
           <w:lang w:val="en-GB"/>
         </w:rPr>
-        <w:t xml:space="preserve"> (</w:t>
-      </w:r>
-      <w:proofErr w:type="spellStart"/>
-      <w:r>
-        <w:rPr>
-          <w:lang w:val="en-GB"/>
-        </w:rPr>
-        <w:t>Qianyue</w:t>
-      </w:r>
-      <w:proofErr w:type="spellEnd"/>
-      <w:r>
-        <w:rPr>
-          <w:lang w:val="en-GB"/>
-        </w:rPr>
-        <w:t>)</w:t>
+        <w:t xml:space="preserve"> (Qianyue)</w:t>
       </w:r>
       <w:bookmarkEnd w:id="21"/>
     </w:p>
@@ -10661,16 +9935,8 @@
         <w:rPr>
           <w:lang w:val="de-DE"/>
         </w:rPr>
-        <w:t xml:space="preserve">Regression </w:t>
-      </w:r>
-      <w:proofErr w:type="spellStart"/>
-      <w:r>
-        <w:rPr>
-          <w:lang w:val="de-DE"/>
-        </w:rPr>
-        <w:t>Probabilities</w:t>
-      </w:r>
-      <w:proofErr w:type="spellEnd"/>
+        <w:t>Regression Probabilities</w:t>
+      </w:r>
     </w:p>
     <w:p>
       <w:pPr>
@@ -10686,21 +9952,7 @@
         <w:rPr>
           <w:lang w:val="de-DE"/>
         </w:rPr>
-        <w:t>Go-</w:t>
-      </w:r>
-      <w:proofErr w:type="spellStart"/>
-      <w:r>
-        <w:rPr>
-          <w:lang w:val="de-DE"/>
-        </w:rPr>
-        <w:t>past</w:t>
-      </w:r>
-      <w:proofErr w:type="spellEnd"/>
-      <w:r>
-        <w:rPr>
-          <w:lang w:val="de-DE"/>
-        </w:rPr>
-        <w:t xml:space="preserve"> Time</w:t>
+        <w:t>Go-past Time</w:t>
       </w:r>
     </w:p>
     <w:p>
@@ -10752,21 +10004,7 @@
         <w:rPr>
           <w:lang w:val="en-GB"/>
         </w:rPr>
-        <w:t xml:space="preserve"> (Aylina &amp; </w:t>
-      </w:r>
-      <w:proofErr w:type="spellStart"/>
-      <w:r>
-        <w:rPr>
-          <w:lang w:val="en-GB"/>
-        </w:rPr>
-        <w:t>Qianyue</w:t>
-      </w:r>
-      <w:proofErr w:type="spellEnd"/>
-      <w:r>
-        <w:rPr>
-          <w:lang w:val="en-GB"/>
-        </w:rPr>
-        <w:t>)</w:t>
+        <w:t xml:space="preserve"> (Aylina &amp; Qianyue)</w:t>
       </w:r>
       <w:bookmarkEnd w:id="22"/>
     </w:p>
@@ -10811,87 +10049,74 @@
           <w:bCs/>
           <w:lang w:val="en-GB"/>
         </w:rPr>
-        <w:t xml:space="preserve">Data </w:t>
-      </w:r>
-      <w:proofErr w:type="spellStart"/>
-      <w:r>
+        <w:t>Data Analisis</w:t>
+      </w:r>
+      <w:r>
+        <w:rPr>
+          <w:lang w:val="en-GB"/>
+        </w:rPr>
+        <w:t>(Qianyue)</w:t>
+      </w:r>
+    </w:p>
+    <w:p>
+      <w:pPr>
+        <w:rPr>
+          <w:lang w:val="en-GB"/>
+        </w:rPr>
+      </w:pPr>
+    </w:p>
+    <w:p>
+      <w:pPr>
+        <w:pStyle w:val="berschrift3"/>
+        <w:rPr>
+          <w:lang w:val="en-GB"/>
+        </w:rPr>
+      </w:pPr>
+      <w:bookmarkStart w:id="23" w:name="_Toc235728803"/>
+      <w:r>
+        <w:rPr>
+          <w:lang w:val="en-GB"/>
+        </w:rPr>
+        <w:t xml:space="preserve">3.4.2 </w:t>
+      </w:r>
+      <w:r>
+        <w:rPr>
+          <w:lang w:val="en-GB"/>
+        </w:rPr>
+        <w:t>Regression Probabilities</w:t>
+      </w:r>
+      <w:r>
+        <w:rPr>
+          <w:lang w:val="en-GB"/>
+        </w:rPr>
+        <w:t xml:space="preserve"> (Aylina &amp; Qianyue)</w:t>
+      </w:r>
+      <w:bookmarkEnd w:id="23"/>
+    </w:p>
+    <w:p>
+      <w:pPr>
+        <w:spacing w:line="360" w:lineRule="auto"/>
+        <w:jc w:val="both"/>
         <w:rPr>
           <w:b/>
           <w:bCs/>
           <w:lang w:val="en-GB"/>
         </w:rPr>
-        <w:t>Analisis</w:t>
-      </w:r>
-      <w:proofErr w:type="spellEnd"/>
-      <w:r>
-        <w:rPr>
-          <w:lang w:val="en-GB"/>
-        </w:rPr>
-        <w:t>(</w:t>
-      </w:r>
-      <w:proofErr w:type="spellStart"/>
-      <w:r>
-        <w:rPr>
-          <w:lang w:val="en-GB"/>
-        </w:rPr>
-        <w:t>Qianyue</w:t>
-      </w:r>
-      <w:proofErr w:type="spellEnd"/>
-      <w:r>
-        <w:rPr>
-          <w:lang w:val="en-GB"/>
-        </w:rPr>
-        <w:t>)</w:t>
-      </w:r>
-    </w:p>
-    <w:p>
-      <w:pPr>
-        <w:rPr>
-          <w:lang w:val="en-GB"/>
-        </w:rPr>
-      </w:pPr>
-    </w:p>
-    <w:p>
-      <w:pPr>
-        <w:pStyle w:val="berschrift3"/>
-        <w:rPr>
-          <w:lang w:val="en-GB"/>
-        </w:rPr>
-      </w:pPr>
-      <w:bookmarkStart w:id="23" w:name="_Toc235728803"/>
-      <w:r>
-        <w:rPr>
-          <w:lang w:val="en-GB"/>
-        </w:rPr>
-        <w:t xml:space="preserve">3.4.2 </w:t>
-      </w:r>
-      <w:r>
-        <w:rPr>
-          <w:lang w:val="en-GB"/>
-        </w:rPr>
-        <w:t>Regression Probabilities</w:t>
-      </w:r>
-      <w:r>
-        <w:rPr>
-          <w:lang w:val="en-GB"/>
-        </w:rPr>
-        <w:t xml:space="preserve"> (Aylina &amp; </w:t>
-      </w:r>
-      <w:proofErr w:type="spellStart"/>
-      <w:r>
-        <w:rPr>
-          <w:lang w:val="en-GB"/>
-        </w:rPr>
-        <w:t>Qianyue</w:t>
-      </w:r>
-      <w:proofErr w:type="spellEnd"/>
-      <w:r>
-        <w:rPr>
-          <w:lang w:val="en-GB"/>
-        </w:rPr>
-        <w:t>)</w:t>
-      </w:r>
-      <w:bookmarkEnd w:id="23"/>
+      </w:pPr>
+      <w:r>
+        <w:rPr>
+          <w:b/>
+          <w:bCs/>
+          <w:lang w:val="en-GB"/>
+        </w:rPr>
+        <w:t>Definition</w:t>
+      </w:r>
+      <w:r>
+        <w:rPr>
+          <w:lang w:val="en-GB"/>
+        </w:rPr>
+        <w:t xml:space="preserve"> (Aylina)</w:t>
+      </w:r>
     </w:p>
     <w:p>
       <w:pPr>
@@ -10909,183 +10134,96 @@
           <w:bCs/>
           <w:lang w:val="en-GB"/>
         </w:rPr>
-        <w:t>Definition</w:t>
-      </w:r>
-      <w:r>
-        <w:rPr>
-          <w:lang w:val="en-GB"/>
-        </w:rPr>
-        <w:t xml:space="preserve"> (Aylina)</w:t>
-      </w:r>
+        <w:t>Data Analisis</w:t>
+      </w:r>
+      <w:r>
+        <w:rPr>
+          <w:lang w:val="en-GB"/>
+        </w:rPr>
+        <w:t xml:space="preserve"> (Qianyue)</w:t>
+      </w:r>
+    </w:p>
+    <w:p>
+      <w:pPr>
+        <w:rPr>
+          <w:lang w:val="en-GB"/>
+        </w:rPr>
+      </w:pPr>
+    </w:p>
+    <w:p>
+      <w:pPr>
+        <w:pStyle w:val="berschrift3"/>
+        <w:rPr>
+          <w:lang w:val="en-GB"/>
+        </w:rPr>
+      </w:pPr>
+      <w:bookmarkStart w:id="24" w:name="_Toc235728804"/>
+      <w:r>
+        <w:rPr>
+          <w:lang w:val="en-GB"/>
+        </w:rPr>
+        <w:t xml:space="preserve">3.4.3 </w:t>
+      </w:r>
+      <w:r>
+        <w:rPr>
+          <w:lang w:val="en-GB"/>
+        </w:rPr>
+        <w:t>Go-past Time</w:t>
+      </w:r>
+      <w:r>
+        <w:rPr>
+          <w:lang w:val="en-GB"/>
+        </w:rPr>
+        <w:t xml:space="preserve"> (Aylina &amp; Qianyue)</w:t>
+      </w:r>
+      <w:bookmarkEnd w:id="24"/>
     </w:p>
     <w:p>
       <w:pPr>
         <w:spacing w:line="360" w:lineRule="auto"/>
         <w:jc w:val="both"/>
         <w:rPr>
+          <w:lang w:val="en-GB"/>
+        </w:rPr>
+      </w:pPr>
+      <w:r>
+        <w:rPr>
           <w:b/>
           <w:bCs/>
           <w:lang w:val="en-GB"/>
         </w:rPr>
-      </w:pPr>
-      <w:r>
+        <w:t>Definition</w:t>
+      </w:r>
+      <w:r>
+        <w:rPr>
+          <w:lang w:val="en-GB"/>
+        </w:rPr>
+        <w:t>(Aylina)</w:t>
+      </w:r>
+    </w:p>
+    <w:p>
+      <w:pPr>
+        <w:spacing w:line="360" w:lineRule="auto"/>
+        <w:jc w:val="both"/>
         <w:rPr>
           <w:b/>
           <w:bCs/>
           <w:lang w:val="en-GB"/>
         </w:rPr>
-        <w:t xml:space="preserve">Data </w:t>
-      </w:r>
-      <w:proofErr w:type="spellStart"/>
+      </w:pPr>
       <w:r>
         <w:rPr>
           <w:b/>
           <w:bCs/>
           <w:lang w:val="en-GB"/>
         </w:rPr>
-        <w:t>Analisis</w:t>
-      </w:r>
-      <w:proofErr w:type="spellEnd"/>
-      <w:r>
-        <w:rPr>
-          <w:lang w:val="en-GB"/>
-        </w:rPr>
-        <w:t xml:space="preserve"> (</w:t>
-      </w:r>
-      <w:proofErr w:type="spellStart"/>
-      <w:r>
-        <w:rPr>
-          <w:lang w:val="en-GB"/>
-        </w:rPr>
-        <w:t>Qianyue</w:t>
-      </w:r>
-      <w:proofErr w:type="spellEnd"/>
-      <w:r>
-        <w:rPr>
-          <w:lang w:val="en-GB"/>
-        </w:rPr>
-        <w:t>)</w:t>
-      </w:r>
-    </w:p>
-    <w:p>
-      <w:pPr>
-        <w:rPr>
-          <w:lang w:val="en-GB"/>
-        </w:rPr>
-      </w:pPr>
-    </w:p>
-    <w:p>
-      <w:pPr>
-        <w:pStyle w:val="berschrift3"/>
-        <w:rPr>
-          <w:lang w:val="en-GB"/>
-        </w:rPr>
-      </w:pPr>
-      <w:bookmarkStart w:id="24" w:name="_Toc235728804"/>
-      <w:r>
-        <w:rPr>
-          <w:lang w:val="en-GB"/>
-        </w:rPr>
-        <w:t xml:space="preserve">3.4.3 </w:t>
-      </w:r>
-      <w:r>
-        <w:rPr>
-          <w:lang w:val="en-GB"/>
-        </w:rPr>
-        <w:t>Go-past Time</w:t>
-      </w:r>
-      <w:r>
-        <w:rPr>
-          <w:lang w:val="en-GB"/>
-        </w:rPr>
-        <w:t xml:space="preserve"> (Aylina &amp; </w:t>
-      </w:r>
-      <w:proofErr w:type="spellStart"/>
-      <w:r>
-        <w:rPr>
-          <w:lang w:val="en-GB"/>
-        </w:rPr>
-        <w:t>Qianyue</w:t>
-      </w:r>
-      <w:proofErr w:type="spellEnd"/>
-      <w:r>
-        <w:rPr>
-          <w:lang w:val="en-GB"/>
-        </w:rPr>
-        <w:t>)</w:t>
-      </w:r>
-      <w:bookmarkEnd w:id="24"/>
-    </w:p>
-    <w:p>
-      <w:pPr>
-        <w:spacing w:line="360" w:lineRule="auto"/>
-        <w:jc w:val="both"/>
-        <w:rPr>
-          <w:lang w:val="en-GB"/>
-        </w:rPr>
-      </w:pPr>
-      <w:r>
-        <w:rPr>
-          <w:b/>
-          <w:bCs/>
-          <w:lang w:val="en-GB"/>
-        </w:rPr>
-        <w:t>Definition</w:t>
-      </w:r>
-      <w:r>
-        <w:rPr>
-          <w:lang w:val="en-GB"/>
-        </w:rPr>
-        <w:t>(Aylina)</w:t>
-      </w:r>
-    </w:p>
-    <w:p>
-      <w:pPr>
-        <w:spacing w:line="360" w:lineRule="auto"/>
-        <w:jc w:val="both"/>
-        <w:rPr>
-          <w:b/>
-          <w:bCs/>
-          <w:lang w:val="en-GB"/>
-        </w:rPr>
-      </w:pPr>
-      <w:r>
-        <w:rPr>
-          <w:b/>
-          <w:bCs/>
-          <w:lang w:val="en-GB"/>
-        </w:rPr>
-        <w:t xml:space="preserve">Data </w:t>
-      </w:r>
-      <w:proofErr w:type="spellStart"/>
-      <w:r>
-        <w:rPr>
-          <w:b/>
-          <w:bCs/>
-          <w:lang w:val="en-GB"/>
-        </w:rPr>
-        <w:t>Analisis</w:t>
-      </w:r>
-      <w:proofErr w:type="spellEnd"/>
-      <w:r>
-        <w:rPr>
-          <w:lang w:val="en-GB"/>
-        </w:rPr>
-        <w:t xml:space="preserve"> (</w:t>
-      </w:r>
-      <w:proofErr w:type="spellStart"/>
-      <w:r>
-        <w:rPr>
-          <w:lang w:val="en-GB"/>
-        </w:rPr>
-        <w:t>Qianyue</w:t>
-      </w:r>
-      <w:proofErr w:type="spellEnd"/>
-      <w:r>
-        <w:rPr>
-          <w:lang w:val="en-GB"/>
-        </w:rPr>
-        <w:t>)</w:t>
+        <w:t>Data Analisis</w:t>
+      </w:r>
+      <w:r>
+        <w:rPr>
+          <w:lang w:val="en-GB"/>
+        </w:rPr>
+        <w:t xml:space="preserve"> (Qianyue)</w:t>
       </w:r>
     </w:p>
     <w:p>
@@ -11187,30 +10325,8 @@
         <w:rPr>
           <w:lang w:val="de-DE"/>
         </w:rPr>
-        <w:t xml:space="preserve">Analyze </w:t>
-      </w:r>
-      <w:proofErr w:type="spellStart"/>
-      <w:r>
-        <w:rPr>
-          <w:lang w:val="de-DE"/>
-        </w:rPr>
-        <w:t>questionnaire</w:t>
-      </w:r>
-      <w:proofErr w:type="spellEnd"/>
-      <w:r>
-        <w:rPr>
-          <w:lang w:val="de-DE"/>
-        </w:rPr>
-        <w:t xml:space="preserve"> </w:t>
-      </w:r>
-      <w:proofErr w:type="spellStart"/>
-      <w:r>
-        <w:rPr>
-          <w:lang w:val="de-DE"/>
-        </w:rPr>
-        <w:t>responses</w:t>
-      </w:r>
-      <w:proofErr w:type="spellEnd"/>
+        <w:t>Analyze questionnaire responses</w:t>
+      </w:r>
     </w:p>
     <w:p>
       <w:pPr>
@@ -11258,6 +10374,25 @@
           <w:lang w:val="en-GB"/>
         </w:rPr>
       </w:pPr>
+      <w:r>
+        <w:rPr>
+          <w:lang w:val="en-GB"/>
+        </w:rPr>
+        <w:t>Qianyue gives bulletpoints what needs to be included in this chapter</w:t>
+      </w:r>
+    </w:p>
+    <w:p>
+      <w:pPr>
+        <w:rPr>
+          <w:lang w:val="en-GB"/>
+        </w:rPr>
+      </w:pPr>
+      <w:r>
+        <w:rPr>
+          <w:lang w:val="en-GB"/>
+        </w:rPr>
+        <w:t>Sophie will write it down in sentences</w:t>
+      </w:r>
     </w:p>
     <w:p>
       <w:pPr>
@@ -11326,6 +10461,7 @@
         <w:rPr>
           <w:lang w:val="en-GB"/>
         </w:rPr>
+        <w:lastRenderedPageBreak/>
         <w:t>How do findings relate to literature?</w:t>
       </w:r>
     </w:p>
@@ -11340,7 +10476,6 @@
         <w:rPr>
           <w:lang w:val="en-GB"/>
         </w:rPr>
-        <w:lastRenderedPageBreak/>
         <w:t>Limitations</w:t>
       </w:r>
     </w:p>
@@ -11351,12 +10486,23 @@
           <w:lang w:val="en-GB"/>
         </w:rPr>
       </w:pPr>
+      <w:commentRangeStart w:id="28"/>
       <w:r>
         <w:rPr>
           <w:lang w:val="en-GB"/>
         </w:rPr>
         <w:t>Challenges during the project</w:t>
       </w:r>
+      <w:commentRangeEnd w:id="28"/>
+      <w:r>
+        <w:rPr>
+          <w:rStyle w:val="Kommentarzeichen"/>
+          <w:sz w:val="24"/>
+          <w:szCs w:val="24"/>
+          <w:lang w:val="en-GB"/>
+        </w:rPr>
+        <w:commentReference w:id="28"/>
+      </w:r>
     </w:p>
     <w:p>
       <w:pPr>
@@ -11365,11 +10511,22 @@
           <w:lang w:val="en-GB"/>
         </w:rPr>
       </w:pPr>
+      <w:commentRangeStart w:id="29"/>
       <w:r>
         <w:rPr>
           <w:lang w:val="en-GB"/>
         </w:rPr>
         <w:t>Outlook / improvements / lessons learned</w:t>
+      </w:r>
+      <w:commentRangeEnd w:id="29"/>
+      <w:r>
+        <w:rPr>
+          <w:rStyle w:val="Kommentarzeichen"/>
+          <w:sz w:val="24"/>
+          <w:szCs w:val="24"/>
+          <w:lang w:val="en-GB"/>
+        </w:rPr>
+        <w:commentReference w:id="29"/>
       </w:r>
     </w:p>
     <w:p>
@@ -11394,7 +10551,7 @@
           <w:lang w:val="en-GB"/>
         </w:rPr>
         <w:sectPr>
-          <w:footerReference w:type="default" r:id="rId27"/>
+          <w:footerReference w:type="default" r:id="rId31"/>
           <w:pgSz w:w="11906" w:h="16838"/>
           <w:pgMar w:top="1417" w:right="1417" w:bottom="1134" w:left="1417" w:header="708" w:footer="708" w:gutter="0"/>
           <w:pgNumType w:start="1"/>
@@ -11409,7 +10566,7 @@
           <w:lang w:val="en-GB"/>
         </w:rPr>
       </w:pPr>
-      <w:bookmarkStart w:id="28" w:name="_Toc235728808"/>
+      <w:bookmarkStart w:id="30" w:name="_Toc235728808"/>
       <w:r>
         <w:rPr>
           <w:lang w:val="en-GB"/>
@@ -11417,7 +10574,7 @@
         <w:lastRenderedPageBreak/>
         <w:t>Appendix</w:t>
       </w:r>
-      <w:bookmarkEnd w:id="28"/>
+      <w:bookmarkEnd w:id="30"/>
     </w:p>
     <w:p>
       <w:pPr>
@@ -11459,7 +10616,7 @@
                     <pic:cNvPicPr/>
                   </pic:nvPicPr>
                   <pic:blipFill>
-                    <a:blip r:embed="rId28"/>
+                    <a:blip r:embed="rId32"/>
                     <a:stretch>
                       <a:fillRect/>
                     </a:stretch>
@@ -11500,7 +10657,7 @@
                     <pic:cNvPicPr/>
                   </pic:nvPicPr>
                   <pic:blipFill>
-                    <a:blip r:embed="rId29"/>
+                    <a:blip r:embed="rId33"/>
                     <a:stretch>
                       <a:fillRect/>
                     </a:stretch>
@@ -11550,7 +10707,7 @@
                     <pic:cNvPicPr/>
                   </pic:nvPicPr>
                   <pic:blipFill>
-                    <a:blip r:embed="rId30"/>
+                    <a:blip r:embed="rId34"/>
                     <a:stretch>
                       <a:fillRect/>
                     </a:stretch>
@@ -11633,7 +10790,7 @@
         <w:br w:type="page"/>
       </w:r>
     </w:p>
-    <w:bookmarkStart w:id="29" w:name="_Toc235728809" w:displacedByCustomXml="next"/>
+    <w:bookmarkStart w:id="31" w:name="_Toc235728809" w:displacedByCustomXml="next"/>
     <w:sdt>
       <w:sdtPr>
         <w:rPr>
@@ -11662,7 +10819,7 @@
         </w:p>
       </w:sdtContent>
     </w:sdt>
-    <w:bookmarkEnd w:id="29" w:displacedByCustomXml="prev"/>
+    <w:bookmarkEnd w:id="31" w:displacedByCustomXml="prev"/>
     <w:p>
       <w:pPr>
         <w:tabs>
@@ -11700,23 +10857,15 @@
           <w:lang w:val="en-GB"/>
         </w:rPr>
       </w:pPr>
-      <w:bookmarkStart w:id="30" w:name="_Toc235728810"/>
-      <w:proofErr w:type="spellStart"/>
+      <w:bookmarkStart w:id="32" w:name="_Toc235728810"/>
       <w:r>
         <w:rPr>
           <w:lang w:val="en-GB"/>
         </w:rPr>
         <w:lastRenderedPageBreak/>
-        <w:t>Contibution</w:t>
-      </w:r>
-      <w:proofErr w:type="spellEnd"/>
-      <w:r>
-        <w:rPr>
-          <w:lang w:val="en-GB"/>
-        </w:rPr>
-        <w:t xml:space="preserve"> Table</w:t>
-      </w:r>
-      <w:bookmarkEnd w:id="30"/>
+        <w:t>Contibution Table</w:t>
+      </w:r>
+      <w:bookmarkEnd w:id="32"/>
     </w:p>
     <w:tbl>
       <w:tblPr>
@@ -11782,14 +10931,12 @@
                 <w:lang w:val="en-GB"/>
               </w:rPr>
             </w:pPr>
-            <w:proofErr w:type="spellStart"/>
             <w:r>
               <w:rPr>
                 <w:lang w:val="en-GB"/>
               </w:rPr>
               <w:t>Qianyue</w:t>
             </w:r>
-            <w:proofErr w:type="spellEnd"/>
           </w:p>
         </w:tc>
         <w:tc>
@@ -12933,7 +12080,7 @@
       </w:pPr>
     </w:p>
     <w:sectPr>
-      <w:footerReference w:type="default" r:id="rId31"/>
+      <w:footerReference w:type="default" r:id="rId35"/>
       <w:pgSz w:w="11906" w:h="16838"/>
       <w:pgMar w:top="1417" w:right="1417" w:bottom="1134" w:left="1417" w:header="708" w:footer="708" w:gutter="0"/>
       <w:pgNumType w:start="4"/>
@@ -12941,6 +12088,70 @@
     </w:sectPr>
   </w:body>
 </w:document>
+</file>
+
+<file path=word/comments.xml><?xml version="1.0" encoding="utf-8"?>
+<w:comments xmlns:wpc="http://schemas.microsoft.com/office/word/2010/wordprocessingCanvas" xmlns:cx="http://schemas.microsoft.com/office/drawing/2014/chartex" xmlns:cx1="http://schemas.microsoft.com/office/drawing/2015/9/8/chartex" xmlns:cx2="http://schemas.microsoft.com/office/drawing/2015/10/21/chartex" xmlns:cx3="http://schemas.microsoft.com/office/drawing/2016/5/9/chartex" xmlns:cx4="http://schemas.microsoft.com/office/drawing/2016/5/10/chartex" xmlns:cx5="http://schemas.microsoft.com/office/drawing/2016/5/11/chartex" xmlns:cx6="http://schemas.microsoft.com/office/drawing/2016/5/12/chartex" xmlns:cx7="http://schemas.microsoft.com/office/drawing/2016/5/13/chartex" xmlns:cx8="http://schemas.microsoft.com/office/drawing/2016/5/14/chartex" xmlns:mc="http://schemas.openxmlformats.org/markup-compatibility/2006" xmlns:aink="http://schemas.microsoft.com/office/drawing/2016/ink" xmlns:am3d="http://schemas.microsoft.com/office/drawing/2017/model3d" xmlns:o="urn:schemas-microsoft-com:office:office" xmlns:oel="http://schemas.microsoft.com/office/2019/extlst" xmlns:r="http://schemas.openxmlformats.org/officeDocument/2006/relationships" xmlns:m="http://schemas.openxmlformats.org/officeDocument/2006/math" xmlns:v="urn:schemas-microsoft-com:vml" xmlns:wp14="http://schemas.microsoft.com/office/word/2010/wordprocessingDrawing" xmlns:wp="http://schemas.openxmlformats.org/drawingml/2006/wordprocessingDrawing" xmlns:w10="urn:schemas-microsoft-com:office:word" xmlns:w="http://schemas.openxmlformats.org/wordprocessingml/2006/main" xmlns:w14="http://schemas.microsoft.com/office/word/2010/wordml" xmlns:w15="http://schemas.microsoft.com/office/word/2012/wordml" xmlns:w16cei="http://schemas.microsoft.com/office/word/2026/wordml/cei" xmlns:w16cex="http://schemas.microsoft.com/office/word/2018/wordml/cex" xmlns:w16cid="http://schemas.microsoft.com/office/word/2016/wordml/cid" xmlns:w16="http://schemas.microsoft.com/office/word/2018/wordml" xmlns:w16du="http://schemas.microsoft.com/office/word/2023/wordml/word16du" xmlns:w16sdtdh="http://schemas.microsoft.com/office/word/2020/wordml/sdtdatahash" xmlns:w16sdtfl="http://schemas.microsoft.com/office/word/2024/wordml/sdtformatlock" xmlns:w16se="http://schemas.microsoft.com/office/word/2015/wordml/symex" xmlns:wpg="http://schemas.microsoft.com/office/word/2010/wordprocessingGroup" xmlns:wpi="http://schemas.microsoft.com/office/word/2010/wordprocessingInk" xmlns:wne="http://schemas.microsoft.com/office/word/2006/wordml" xmlns:wps="http://schemas.microsoft.com/office/word/2010/wordprocessingShape" mc:Ignorable="w14 w15 w16se w16cid w16 w16cex w16sdtdh w16sdtfl w16du wp14">
+  <w:comment w:id="28" w:author="Sophie Schüttler" w:date="2026-08-20T16:19:00Z" w:initials="SS">
+    <w:p>
+      <w:pPr>
+        <w:pStyle w:val="Kommentartext"/>
+      </w:pPr>
+      <w:r>
+        <w:rPr>
+          <w:rStyle w:val="Kommentarzeichen"/>
+        </w:rPr>
+        <w:annotationRef/>
+      </w:r>
+      <w:r>
+        <w:rPr>
+          <w:lang w:val="en-GB"/>
+        </w:rPr>
+        <w:t>everyone gives bullet points</w:t>
+      </w:r>
+    </w:p>
+  </w:comment>
+  <w:comment w:id="29" w:author="Sophie Schüttler" w:date="2026-08-20T16:19:00Z" w:initials="SS">
+    <w:p>
+      <w:pPr>
+        <w:pStyle w:val="Kommentartext"/>
+      </w:pPr>
+      <w:r>
+        <w:rPr>
+          <w:rStyle w:val="Kommentarzeichen"/>
+        </w:rPr>
+        <w:annotationRef/>
+      </w:r>
+      <w:r>
+        <w:rPr>
+          <w:lang w:val="en-GB"/>
+        </w:rPr>
+        <w:t>everyone gives bullet points</w:t>
+      </w:r>
+    </w:p>
+  </w:comment>
+</w:comments>
+</file>
+
+<file path=word/commentsExtended.xml><?xml version="1.0" encoding="utf-8"?>
+<w15:commentsEx xmlns:wpc="http://schemas.microsoft.com/office/word/2010/wordprocessingCanvas" xmlns:cx="http://schemas.microsoft.com/office/drawing/2014/chartex" xmlns:cx1="http://schemas.microsoft.com/office/drawing/2015/9/8/chartex" xmlns:cx2="http://schemas.microsoft.com/office/drawing/2015/10/21/chartex" xmlns:cx3="http://schemas.microsoft.com/office/drawing/2016/5/9/chartex" xmlns:cx4="http://schemas.microsoft.com/office/drawing/2016/5/10/chartex" xmlns:cx5="http://schemas.microsoft.com/office/drawing/2016/5/11/chartex" xmlns:cx6="http://schemas.microsoft.com/office/drawing/2016/5/12/chartex" xmlns:cx7="http://schemas.microsoft.com/office/drawing/2016/5/13/chartex" xmlns:cx8="http://schemas.microsoft.com/office/drawing/2016/5/14/chartex" xmlns:mc="http://schemas.openxmlformats.org/markup-compatibility/2006" xmlns:aink="http://schemas.microsoft.com/office/drawing/2016/ink" xmlns:am3d="http://schemas.microsoft.com/office/drawing/2017/model3d" xmlns:o="urn:schemas-microsoft-com:office:office" xmlns:oel="http://schemas.microsoft.com/office/2019/extlst" xmlns:r="http://schemas.openxmlformats.org/officeDocument/2006/relationships" xmlns:m="http://schemas.openxmlformats.org/officeDocument/2006/math" xmlns:v="urn:schemas-microsoft-com:vml" xmlns:wp14="http://schemas.microsoft.com/office/word/2010/wordprocessingDrawing" xmlns:wp="http://schemas.openxmlformats.org/drawingml/2006/wordprocessingDrawing" xmlns:w10="urn:schemas-microsoft-com:office:word" xmlns:w="http://schemas.openxmlformats.org/wordprocessingml/2006/main" xmlns:w14="http://schemas.microsoft.com/office/word/2010/wordml" xmlns:w15="http://schemas.microsoft.com/office/word/2012/wordml" xmlns:w16cei="http://schemas.microsoft.com/office/word/2026/wordml/cei" xmlns:w16cex="http://schemas.microsoft.com/office/word/2018/wordml/cex" xmlns:w16cid="http://schemas.microsoft.com/office/word/2016/wordml/cid" xmlns:w16="http://schemas.microsoft.com/office/word/2018/wordml" xmlns:w16du="http://schemas.microsoft.com/office/word/2023/wordml/word16du" xmlns:w16sdtdh="http://schemas.microsoft.com/office/word/2020/wordml/sdtdatahash" xmlns:w16sdtfl="http://schemas.microsoft.com/office/word/2024/wordml/sdtformatlock" xmlns:w16se="http://schemas.microsoft.com/office/word/2015/wordml/symex" xmlns:wpg="http://schemas.microsoft.com/office/word/2010/wordprocessingGroup" xmlns:wpi="http://schemas.microsoft.com/office/word/2010/wordprocessingInk" xmlns:wne="http://schemas.microsoft.com/office/word/2006/wordml" xmlns:wps="http://schemas.microsoft.com/office/word/2010/wordprocessingShape" mc:Ignorable="w14 w15 w16se w16cid w16 w16cex w16sdtdh w16sdtfl w16du wp14">
+  <w15:commentEx w15:paraId="205FD429" w15:done="0"/>
+  <w15:commentEx w15:paraId="2EE99CFF" w15:done="0"/>
+</w15:commentsEx>
+</file>
+
+<file path=word/commentsExtensible.xml><?xml version="1.0" encoding="utf-8"?>
+<w16cex:commentsExtensible xmlns:wpc="http://schemas.microsoft.com/office/word/2010/wordprocessingCanvas" xmlns:cx="http://schemas.microsoft.com/office/drawing/2014/chartex" xmlns:cx1="http://schemas.microsoft.com/office/drawing/2015/9/8/chartex" xmlns:cx2="http://schemas.microsoft.com/office/drawing/2015/10/21/chartex" xmlns:cx3="http://schemas.microsoft.com/office/drawing/2016/5/9/chartex" xmlns:cx4="http://schemas.microsoft.com/office/drawing/2016/5/10/chartex" xmlns:cx5="http://schemas.microsoft.com/office/drawing/2016/5/11/chartex" xmlns:cx6="http://schemas.microsoft.com/office/drawing/2016/5/12/chartex" xmlns:cx7="http://schemas.microsoft.com/office/drawing/2016/5/13/chartex" xmlns:cx8="http://schemas.microsoft.com/office/drawing/2016/5/14/chartex" xmlns:cr="http://schemas.microsoft.com/office/comments/2020/reactions" xmlns:mc="http://schemas.openxmlformats.org/markup-compatibility/2006" xmlns:aink="http://schemas.microsoft.com/office/drawing/2016/ink" xmlns:am3d="http://schemas.microsoft.com/office/drawing/2017/model3d" xmlns:o="urn:schemas-microsoft-com:office:office" xmlns:oel="http://schemas.microsoft.com/office/2019/extlst" xmlns:r="http://schemas.openxmlformats.org/officeDocument/2006/relationships" xmlns:m="http://schemas.openxmlformats.org/officeDocument/2006/math" xmlns:v="urn:schemas-microsoft-com:vml" xmlns:wp14="http://schemas.microsoft.com/office/word/2010/wordprocessingDrawing" xmlns:wp="http://schemas.openxmlformats.org/drawingml/2006/wordprocessingDrawing" xmlns:w10="urn:schemas-microsoft-com:office:word" xmlns:w="http://schemas.openxmlformats.org/wordprocessingml/2006/main" xmlns:w14="http://schemas.microsoft.com/office/word/2010/wordml" xmlns:w15="http://schemas.microsoft.com/office/word/2012/wordml" xmlns:w16cei="http://schemas.microsoft.com/office/word/2026/wordml/cei" xmlns:w16cex="http://schemas.microsoft.com/office/word/2018/wordml/cex" xmlns:w16cid="http://schemas.microsoft.com/office/word/2016/wordml/cid" xmlns:w16="http://schemas.microsoft.com/office/word/2018/wordml" xmlns:w16du="http://schemas.microsoft.com/office/word/2023/wordml/word16du" xmlns:w16sdtdh="http://schemas.microsoft.com/office/word/2020/wordml/sdtdatahash" xmlns:w16sdtfl="http://schemas.microsoft.com/office/word/2024/wordml/sdtformatlock" xmlns:w16se="http://schemas.microsoft.com/office/word/2015/wordml/symex" xmlns:wpg="http://schemas.microsoft.com/office/word/2010/wordprocessingGroup" xmlns:wpi="http://schemas.microsoft.com/office/word/2010/wordprocessingInk" xmlns:wne="http://schemas.microsoft.com/office/word/2006/wordml" xmlns:wps="http://schemas.microsoft.com/office/word/2010/wordprocessingShape" mc:Ignorable="w14 w15 w16se w16cid w16 w16cex w16sdtdh w16sdtfl cr w16du wp14">
+  <w16cex:commentExtensible w16cex:durableId="49B8296D" w16cex:dateUtc="2026-08-20T14:19:00Z"/>
+  <w16cex:commentExtensible w16cex:durableId="42BF51C0" w16cex:dateUtc="2026-08-20T14:19:00Z"/>
+</w16cex:commentsExtensible>
+</file>
+
+<file path=word/commentsIds.xml><?xml version="1.0" encoding="utf-8"?>
+<w16cid:commentsIds xmlns:wpc="http://schemas.microsoft.com/office/word/2010/wordprocessingCanvas" xmlns:cx="http://schemas.microsoft.com/office/drawing/2014/chartex" xmlns:cx1="http://schemas.microsoft.com/office/drawing/2015/9/8/chartex" xmlns:cx2="http://schemas.microsoft.com/office/drawing/2015/10/21/chartex" xmlns:cx3="http://schemas.microsoft.com/office/drawing/2016/5/9/chartex" xmlns:cx4="http://schemas.microsoft.com/office/drawing/2016/5/10/chartex" xmlns:cx5="http://schemas.microsoft.com/office/drawing/2016/5/11/chartex" xmlns:cx6="http://schemas.microsoft.com/office/drawing/2016/5/12/chartex" xmlns:cx7="http://schemas.microsoft.com/office/drawing/2016/5/13/chartex" xmlns:cx8="http://schemas.microsoft.com/office/drawing/2016/5/14/chartex" xmlns:mc="http://schemas.openxmlformats.org/markup-compatibility/2006" xmlns:aink="http://schemas.microsoft.com/office/drawing/2016/ink" xmlns:am3d="http://schemas.microsoft.com/office/drawing/2017/model3d" xmlns:o="urn:schemas-microsoft-com:office:office" xmlns:oel="http://schemas.microsoft.com/office/2019/extlst" xmlns:r="http://schemas.openxmlformats.org/officeDocument/2006/relationships" xmlns:m="http://schemas.openxmlformats.org/officeDocument/2006/math" xmlns:v="urn:schemas-microsoft-com:vml" xmlns:wp14="http://schemas.microsoft.com/office/word/2010/wordprocessingDrawing" xmlns:wp="http://schemas.openxmlformats.org/drawingml/2006/wordprocessingDrawing" xmlns:w10="urn:schemas-microsoft-com:office:word" xmlns:w="http://schemas.openxmlformats.org/wordprocessingml/2006/main" xmlns:w14="http://schemas.microsoft.com/office/word/2010/wordml" xmlns:w15="http://schemas.microsoft.com/office/word/2012/wordml" xmlns:w16cei="http://schemas.microsoft.com/office/word/2026/wordml/cei" xmlns:w16cex="http://schemas.microsoft.com/office/word/2018/wordml/cex" xmlns:w16cid="http://schemas.microsoft.com/office/word/2016/wordml/cid" xmlns:w16="http://schemas.microsoft.com/office/word/2018/wordml" xmlns:w16du="http://schemas.microsoft.com/office/word/2023/wordml/word16du" xmlns:w16sdtdh="http://schemas.microsoft.com/office/word/2020/wordml/sdtdatahash" xmlns:w16sdtfl="http://schemas.microsoft.com/office/word/2024/wordml/sdtformatlock" xmlns:w16se="http://schemas.microsoft.com/office/word/2015/wordml/symex" xmlns:wpg="http://schemas.microsoft.com/office/word/2010/wordprocessingGroup" xmlns:wpi="http://schemas.microsoft.com/office/word/2010/wordprocessingInk" xmlns:wne="http://schemas.microsoft.com/office/word/2006/wordml" xmlns:wps="http://schemas.microsoft.com/office/word/2010/wordprocessingShape" mc:Ignorable="w14 w15 w16se w16cid w16 w16cex w16sdtdh w16sdtfl w16du wp14">
+  <w16cid:commentId w16cid:paraId="205FD429" w16cid:durableId="49B8296D"/>
+  <w16cid:commentId w16cid:paraId="2EE99CFF" w16cid:durableId="42BF51C0"/>
+</w16cid:commentsIds>
 </file>
 
 <file path=word/endnotes.xml><?xml version="1.0" encoding="utf-8"?>
@@ -14241,6 +13452,14 @@
     <w:abstractNumId w:val="0"/>
   </w:num>
 </w:numbering>
+</file>
+
+<file path=word/people.xml><?xml version="1.0" encoding="utf-8"?>
+<w15:people xmlns:wpc="http://schemas.microsoft.com/office/word/2010/wordprocessingCanvas" xmlns:cx="http://schemas.microsoft.com/office/drawing/2014/chartex" xmlns:cx1="http://schemas.microsoft.com/office/drawing/2015/9/8/chartex" xmlns:cx2="http://schemas.microsoft.com/office/drawing/2015/10/21/chartex" xmlns:cx3="http://schemas.microsoft.com/office/drawing/2016/5/9/chartex" xmlns:cx4="http://schemas.microsoft.com/office/drawing/2016/5/10/chartex" xmlns:cx5="http://schemas.microsoft.com/office/drawing/2016/5/11/chartex" xmlns:cx6="http://schemas.microsoft.com/office/drawing/2016/5/12/chartex" xmlns:cx7="http://schemas.microsoft.com/office/drawing/2016/5/13/chartex" xmlns:cx8="http://schemas.microsoft.com/office/drawing/2016/5/14/chartex" xmlns:mc="http://schemas.openxmlformats.org/markup-compatibility/2006" xmlns:aink="http://schemas.microsoft.com/office/drawing/2016/ink" xmlns:am3d="http://schemas.microsoft.com/office/drawing/2017/model3d" xmlns:o="urn:schemas-microsoft-com:office:office" xmlns:oel="http://schemas.microsoft.com/office/2019/extlst" xmlns:r="http://schemas.openxmlformats.org/officeDocument/2006/relationships" xmlns:m="http://schemas.openxmlformats.org/officeDocument/2006/math" xmlns:v="urn:schemas-microsoft-com:vml" xmlns:wp14="http://schemas.microsoft.com/office/word/2010/wordprocessingDrawing" xmlns:wp="http://schemas.openxmlformats.org/drawingml/2006/wordprocessingDrawing" xmlns:w10="urn:schemas-microsoft-com:office:word" xmlns:w="http://schemas.openxmlformats.org/wordprocessingml/2006/main" xmlns:w14="http://schemas.microsoft.com/office/word/2010/wordml" xmlns:w15="http://schemas.microsoft.com/office/word/2012/wordml" xmlns:w16cei="http://schemas.microsoft.com/office/word/2026/wordml/cei" xmlns:w16cex="http://schemas.microsoft.com/office/word/2018/wordml/cex" xmlns:w16cid="http://schemas.microsoft.com/office/word/2016/wordml/cid" xmlns:w16="http://schemas.microsoft.com/office/word/2018/wordml" xmlns:w16du="http://schemas.microsoft.com/office/word/2023/wordml/word16du" xmlns:w16sdtdh="http://schemas.microsoft.com/office/word/2020/wordml/sdtdatahash" xmlns:w16sdtfl="http://schemas.microsoft.com/office/word/2024/wordml/sdtformatlock" xmlns:w16se="http://schemas.microsoft.com/office/word/2015/wordml/symex" xmlns:wpg="http://schemas.microsoft.com/office/word/2010/wordprocessingGroup" xmlns:wpi="http://schemas.microsoft.com/office/word/2010/wordprocessingInk" xmlns:wne="http://schemas.microsoft.com/office/word/2006/wordml" xmlns:wps="http://schemas.microsoft.com/office/word/2010/wordprocessingShape" mc:Ignorable="w14 w15 w16se w16cid w16 w16cex w16sdtdh w16sdtfl w16du wp14">
+  <w15:person w15:author="Sophie Schüttler">
+    <w15:presenceInfo w15:providerId="Windows Live" w15:userId="1670d0c7991e9d74"/>
+  </w15:person>
+</w15:people>
 </file>
 
 <file path=word/styles.xml><?xml version="1.0" encoding="utf-8"?>
@@ -14862,6 +14081,7 @@
   <w:style w:type="character" w:default="1" w:styleId="Absatz-Standardschriftart">
     <w:name w:val="Default Paragraph Font"/>
     <w:uiPriority w:val="1"/>
+    <w:semiHidden/>
     <w:unhideWhenUsed/>
   </w:style>
   <w:style w:type="table" w:default="1" w:styleId="NormaleTabelle">
@@ -15552,6 +14772,80 @@
       <w:u w:val="single"/>
     </w:rPr>
   </w:style>
+  <w:style w:type="character" w:styleId="Kommentarzeichen">
+    <w:name w:val="annotation reference"/>
+    <w:basedOn w:val="Absatz-Standardschriftart"/>
+    <w:uiPriority w:val="99"/>
+    <w:semiHidden/>
+    <w:unhideWhenUsed/>
+    <w:rsid w:val="00AB26CB"/>
+    <w:rPr>
+      <w:sz w:val="16"/>
+      <w:szCs w:val="16"/>
+    </w:rPr>
+  </w:style>
+  <w:style w:type="paragraph" w:styleId="Kommentartext">
+    <w:name w:val="annotation text"/>
+    <w:basedOn w:val="Standard"/>
+    <w:link w:val="KommentartextZchn"/>
+    <w:uiPriority w:val="99"/>
+    <w:unhideWhenUsed/>
+    <w:rsid w:val="00AB26CB"/>
+    <w:pPr>
+      <w:spacing w:line="240" w:lineRule="auto"/>
+    </w:pPr>
+    <w:rPr>
+      <w:sz w:val="20"/>
+      <w:szCs w:val="20"/>
+    </w:rPr>
+  </w:style>
+  <w:style w:type="character" w:customStyle="1" w:styleId="KommentartextZchn">
+    <w:name w:val="Kommentartext Zchn"/>
+    <w:basedOn w:val="Absatz-Standardschriftart"/>
+    <w:link w:val="Kommentartext"/>
+    <w:uiPriority w:val="99"/>
+    <w:rsid w:val="00AB26CB"/>
+    <w:rPr>
+      <w:rFonts w:ascii="Arial" w:eastAsia="Arial" w:hAnsi="Arial" w:cs="Arial"/>
+      <w:kern w:val="0"/>
+      <w:sz w:val="20"/>
+      <w:szCs w:val="20"/>
+      <w:lang w:val="de" w:eastAsia="de-DE"/>
+      <w14:ligatures w14:val="none"/>
+    </w:rPr>
+  </w:style>
+  <w:style w:type="paragraph" w:styleId="Kommentarthema">
+    <w:name w:val="annotation subject"/>
+    <w:basedOn w:val="Kommentartext"/>
+    <w:next w:val="Kommentartext"/>
+    <w:link w:val="KommentarthemaZchn"/>
+    <w:uiPriority w:val="99"/>
+    <w:semiHidden/>
+    <w:unhideWhenUsed/>
+    <w:rsid w:val="00AB26CB"/>
+    <w:rPr>
+      <w:b/>
+      <w:bCs/>
+    </w:rPr>
+  </w:style>
+  <w:style w:type="character" w:customStyle="1" w:styleId="KommentarthemaZchn">
+    <w:name w:val="Kommentarthema Zchn"/>
+    <w:basedOn w:val="KommentartextZchn"/>
+    <w:link w:val="Kommentarthema"/>
+    <w:uiPriority w:val="99"/>
+    <w:semiHidden/>
+    <w:rsid w:val="00AB26CB"/>
+    <w:rPr>
+      <w:rFonts w:ascii="Arial" w:eastAsia="Arial" w:hAnsi="Arial" w:cs="Arial"/>
+      <w:b/>
+      <w:bCs/>
+      <w:kern w:val="0"/>
+      <w:sz w:val="20"/>
+      <w:szCs w:val="20"/>
+      <w:lang w:val="de" w:eastAsia="de-DE"/>
+      <w14:ligatures w14:val="none"/>
+    </w:rPr>
+  </w:style>
 </w:styles>
 </file>
 
@@ -15681,7 +14975,9 @@
     <w:rsid w:val="003C30B9"/>
     <w:rsid w:val="00516574"/>
     <w:rsid w:val="00542833"/>
+    <w:rsid w:val="005612A4"/>
     <w:rsid w:val="005904F3"/>
+    <w:rsid w:val="005D78C0"/>
     <w:rsid w:val="006730F7"/>
     <w:rsid w:val="0067478E"/>
     <w:rsid w:val="00846D93"/>

</xml_diff>